<commit_message>
FIX: Updated Privacy Policy
</commit_message>
<xml_diff>
--- a/static/documents/Privacy Policy.docx
+++ b/static/documents/Privacy Policy.docx
@@ -1,6 +1,6 @@
 
 <file path=word/document.xml><?xml version="1.0" encoding="utf-8"?>
-<w:document xmlns:wpc="http://schemas.microsoft.com/office/word/2010/wordprocessingCanvas" xmlns:cx="http://schemas.microsoft.com/office/drawing/2014/chartex" xmlns:cx1="http://schemas.microsoft.com/office/drawing/2015/9/8/chartex" xmlns:cx2="http://schemas.microsoft.com/office/drawing/2015/10/21/chartex" xmlns:cx3="http://schemas.microsoft.com/office/drawing/2016/5/9/chartex" xmlns:cx4="http://schemas.microsoft.com/office/drawing/2016/5/10/chartex" xmlns:cx5="http://schemas.microsoft.com/office/drawing/2016/5/11/chartex" xmlns:cx6="http://schemas.microsoft.com/office/drawing/2016/5/12/chartex" xmlns:cx7="http://schemas.microsoft.com/office/drawing/2016/5/13/chartex" xmlns:cx8="http://schemas.microsoft.com/office/drawing/2016/5/14/chartex" xmlns:mc="http://schemas.openxmlformats.org/markup-compatibility/2006" xmlns:aink="http://schemas.microsoft.com/office/drawing/2016/ink" xmlns:am3d="http://schemas.microsoft.com/office/drawing/2017/model3d" xmlns:o="urn:schemas-microsoft-com:office:office" xmlns:oel="http://schemas.microsoft.com/office/2019/extlst" xmlns:r="http://schemas.openxmlformats.org/officeDocument/2006/relationships" xmlns:m="http://schemas.openxmlformats.org/officeDocument/2006/math" xmlns:v="urn:schemas-microsoft-com:vml" xmlns:wp14="http://schemas.microsoft.com/office/word/2010/wordprocessingDrawing" xmlns:wp="http://schemas.openxmlformats.org/drawingml/2006/wordprocessingDrawing" xmlns:w10="urn:schemas-microsoft-com:office:word" xmlns:w="http://schemas.openxmlformats.org/wordprocessingml/2006/main" xmlns:w14="http://schemas.microsoft.com/office/word/2010/wordml" xmlns:w15="http://schemas.microsoft.com/office/word/2012/wordml" xmlns:w16cex="http://schemas.microsoft.com/office/word/2018/wordml/cex" xmlns:w16cid="http://schemas.microsoft.com/office/word/2016/wordml/cid" xmlns:w16="http://schemas.microsoft.com/office/word/2018/wordml" xmlns:w16du="http://schemas.microsoft.com/office/word/2023/wordml/word16du" xmlns:w16sdtdh="http://schemas.microsoft.com/office/word/2020/wordml/sdtdatahash" xmlns:w16sdtfl="http://schemas.microsoft.com/office/word/2024/wordml/sdtformatlock" xmlns:w16se="http://schemas.microsoft.com/office/word/2015/wordml/symex" xmlns:wpg="http://schemas.microsoft.com/office/word/2010/wordprocessingGroup" xmlns:wpi="http://schemas.microsoft.com/office/word/2010/wordprocessingInk" xmlns:wne="http://schemas.microsoft.com/office/word/2006/wordml" xmlns:wps="http://schemas.microsoft.com/office/word/2010/wordprocessingShape" mc:Ignorable="w14 w15 w16se w16cid w16 w16cex w16sdtdh w16sdtfl w16du wp14">
+<w:document xmlns:wpc="http://schemas.microsoft.com/office/word/2010/wordprocessingCanvas" xmlns:mc="http://schemas.openxmlformats.org/markup-compatibility/2006" xmlns:o="urn:schemas-microsoft-com:office:office" xmlns:r="http://schemas.openxmlformats.org/officeDocument/2006/relationships" xmlns:m="http://schemas.openxmlformats.org/officeDocument/2006/math" xmlns:v="urn:schemas-microsoft-com:vml" xmlns:wp14="http://schemas.microsoft.com/office/word/2010/wordprocessingDrawing" xmlns:wp="http://schemas.openxmlformats.org/drawingml/2006/wordprocessingDrawing" xmlns:w="http://schemas.openxmlformats.org/wordprocessingml/2006/main" xmlns:w14="http://schemas.microsoft.com/office/word/2010/wordml" xmlns:w10="urn:schemas-microsoft-com:office:word" xmlns:w15="http://schemas.microsoft.com/office/word/2012/wordml" xmlns:wpg="http://schemas.microsoft.com/office/word/2010/wordprocessingGroup" xmlns:wpi="http://schemas.microsoft.com/office/word/2010/wordprocessingInk" xmlns:wne="http://schemas.microsoft.com/office/word/2006/wordml" xmlns:wps="http://schemas.microsoft.com/office/word/2010/wordprocessingShape" xmlns:wpsCustomData="http://www.wps.cn/officeDocument/2013/wpsCustomData" mc:Ignorable="w14 w15 wp14">
   <w:body>
     <w:p>
       <w:pPr>
@@ -12,7 +12,6 @@
           <w:szCs w:val="28"/>
         </w:rPr>
       </w:pPr>
-      <w:proofErr w:type="spellStart"/>
       <w:r>
         <w:rPr>
           <w:b/>
@@ -20,26 +19,7 @@
           <w:sz w:val="28"/>
           <w:szCs w:val="28"/>
         </w:rPr>
-        <w:t>Syntexa</w:t>
-      </w:r>
-      <w:proofErr w:type="spellEnd"/>
-      <w:r>
-        <w:rPr>
-          <w:b/>
-          <w:bCs/>
-          <w:sz w:val="28"/>
-          <w:szCs w:val="28"/>
-        </w:rPr>
-        <w:t xml:space="preserve"> Inc.</w:t>
-      </w:r>
-      <w:r>
-        <w:rPr>
-          <w:b/>
-          <w:bCs/>
-          <w:sz w:val="28"/>
-          <w:szCs w:val="28"/>
-        </w:rPr>
-        <w:t xml:space="preserve"> Privacy Policy</w:t>
+        <w:t>Syntexa Inc. Privacy Policy</w:t>
       </w:r>
     </w:p>
     <w:p>
@@ -81,62 +61,50 @@
         </w:rPr>
         <w:t xml:space="preserve"> </w:t>
       </w:r>
-      <w:proofErr w:type="spellStart"/>
-      <w:r>
-        <w:t>Syntexa</w:t>
-      </w:r>
-      <w:proofErr w:type="spellEnd"/>
+      <w:r>
+        <w:t>Syntexa Inc. Privacy Policy</w:t>
+      </w:r>
+    </w:p>
+    <w:p>
+      <w:pPr>
+        <w:rPr>
+          <w:rFonts w:hint="default"/>
+          <w:b/>
+          <w:bCs/>
+          <w:lang w:val="en-US"/>
+        </w:rPr>
+      </w:pPr>
+      <w:r>
+        <w:rPr>
+          <w:b/>
+          <w:bCs/>
+        </w:rPr>
+        <w:t>Date:</w:t>
+      </w:r>
       <w:r>
         <w:t xml:space="preserve"> </w:t>
       </w:r>
       <w:r>
-        <w:t xml:space="preserve">Inc. </w:t>
-      </w:r>
-      <w:r>
-        <w:t>Privacy Policy</w:t>
-      </w:r>
-    </w:p>
-    <w:p>
-      <w:pPr>
-        <w:rPr>
-          <w:b/>
-          <w:bCs/>
-        </w:rPr>
-      </w:pPr>
-      <w:r>
-        <w:rPr>
-          <w:b/>
-          <w:bCs/>
-        </w:rPr>
-        <w:t>Date</w:t>
-      </w:r>
-      <w:r>
-        <w:rPr>
-          <w:b/>
-          <w:bCs/>
-        </w:rPr>
-        <w:t>:</w:t>
-      </w:r>
-      <w:r>
-        <w:t xml:space="preserve"> March 15, 2026</w:t>
-      </w:r>
-    </w:p>
-    <w:p>
-      <w:proofErr w:type="spellStart"/>
-      <w:r>
-        <w:t>Syntexa</w:t>
-      </w:r>
-      <w:proofErr w:type="spellEnd"/>
-      <w:r>
-        <w:t xml:space="preserve"> Inc. (“</w:t>
-      </w:r>
-      <w:proofErr w:type="spellStart"/>
-      <w:r>
-        <w:t>Syntexa</w:t>
-      </w:r>
-      <w:proofErr w:type="spellEnd"/>
-      <w:r>
-        <w:t>,” “we,” or “our”) is committed to protecting and appropriately handling your personal information. This Privacy Policy explains how we collect, use, and share your personal information when you visit our website or use our software services.</w:t>
+        <w:rPr>
+          <w:rFonts w:hint="default"/>
+          <w:lang w:val="en-US"/>
+        </w:rPr>
+        <w:t>January</w:t>
+      </w:r>
+      <w:r>
+        <w:t xml:space="preserve"> 15, 202</w:t>
+      </w:r>
+      <w:r>
+        <w:rPr>
+          <w:rFonts w:hint="default"/>
+          <w:lang w:val="en-US"/>
+        </w:rPr>
+        <w:t>5</w:t>
+      </w:r>
+    </w:p>
+    <w:p>
+      <w:r>
+        <w:t>Syntexa Inc. (“Syntexa,” “we,” or “our”) is committed to protecting and appropriately handling your personal information. This Privacy Policy explains how we collect, use, and share your personal information when you visit our website or use our software services.</w:t>
       </w:r>
     </w:p>
     <w:p>
@@ -197,13 +165,7 @@
         <w:t>Terms of Service</w:t>
       </w:r>
       <w:r>
-        <w:t xml:space="preserve"> </w:t>
-      </w:r>
-      <w:r>
-        <w:t xml:space="preserve">(Doc 2600) </w:t>
-      </w:r>
-      <w:r>
-        <w:t>to understand the rules for using our website and software.</w:t>
+        <w:t xml:space="preserve"> (Doc 2600) to understand the rules for using our website and software.</w:t>
       </w:r>
     </w:p>
     <w:p/>
@@ -238,23 +200,33 @@
     </w:p>
     <w:tbl>
       <w:tblPr>
+        <w:tblStyle w:val="12"/>
         <w:tblW w:w="0" w:type="auto"/>
         <w:tblCellSpacing w:w="15" w:type="dxa"/>
+        <w:tblInd w:w="0" w:type="dxa"/>
+        <w:tblLayout w:type="autofit"/>
         <w:tblCellMar>
           <w:top w:w="15" w:type="dxa"/>
           <w:left w:w="15" w:type="dxa"/>
           <w:bottom w:w="15" w:type="dxa"/>
           <w:right w:w="15" w:type="dxa"/>
         </w:tblCellMar>
-        <w:tblLook w:val="04A0" w:firstRow="1" w:lastRow="0" w:firstColumn="1" w:lastColumn="0" w:noHBand="0" w:noVBand="1"/>
       </w:tblPr>
       <w:tblGrid>
-        <w:gridCol w:w="2677"/>
-        <w:gridCol w:w="2466"/>
-        <w:gridCol w:w="1638"/>
-        <w:gridCol w:w="2579"/>
+        <w:gridCol w:w="2705"/>
+        <w:gridCol w:w="2491"/>
+        <w:gridCol w:w="1649"/>
+        <w:gridCol w:w="2605"/>
       </w:tblGrid>
       <w:tr>
+        <w:tblPrEx>
+          <w:tblCellMar>
+            <w:top w:w="15" w:type="dxa"/>
+            <w:left w:w="15" w:type="dxa"/>
+            <w:bottom w:w="15" w:type="dxa"/>
+            <w:right w:w="15" w:type="dxa"/>
+          </w:tblCellMar>
+        </w:tblPrEx>
         <w:trPr>
           <w:tblHeader/>
           <w:tblCellSpacing w:w="15" w:type="dxa"/>
@@ -263,11 +235,10 @@
           <w:tcPr>
             <w:tcW w:w="0" w:type="auto"/>
             <w:tcBorders>
-              <w:top w:val="single" w:sz="4" w:space="0" w:color="auto"/>
-              <w:bottom w:val="single" w:sz="4" w:space="0" w:color="auto"/>
+              <w:top w:val="single" w:color="auto" w:sz="4" w:space="0"/>
+              <w:bottom w:val="single" w:color="auto" w:sz="4" w:space="0"/>
             </w:tcBorders>
             <w:vAlign w:val="center"/>
-            <w:hideMark/>
           </w:tcPr>
           <w:p>
             <w:pPr>
@@ -289,11 +260,10 @@
           <w:tcPr>
             <w:tcW w:w="0" w:type="auto"/>
             <w:tcBorders>
-              <w:top w:val="single" w:sz="4" w:space="0" w:color="auto"/>
-              <w:bottom w:val="single" w:sz="4" w:space="0" w:color="auto"/>
+              <w:top w:val="single" w:color="auto" w:sz="4" w:space="0"/>
+              <w:bottom w:val="single" w:color="auto" w:sz="4" w:space="0"/>
             </w:tcBorders>
             <w:vAlign w:val="center"/>
-            <w:hideMark/>
           </w:tcPr>
           <w:p>
             <w:pPr>
@@ -315,11 +285,10 @@
           <w:tcPr>
             <w:tcW w:w="0" w:type="auto"/>
             <w:tcBorders>
-              <w:top w:val="single" w:sz="4" w:space="0" w:color="auto"/>
-              <w:bottom w:val="single" w:sz="4" w:space="0" w:color="auto"/>
+              <w:top w:val="single" w:color="auto" w:sz="4" w:space="0"/>
+              <w:bottom w:val="single" w:color="auto" w:sz="4" w:space="0"/>
             </w:tcBorders>
             <w:vAlign w:val="center"/>
-            <w:hideMark/>
           </w:tcPr>
           <w:p>
             <w:pPr>
@@ -341,11 +310,10 @@
           <w:tcPr>
             <w:tcW w:w="0" w:type="auto"/>
             <w:tcBorders>
-              <w:top w:val="single" w:sz="4" w:space="0" w:color="auto"/>
-              <w:bottom w:val="single" w:sz="4" w:space="0" w:color="auto"/>
+              <w:top w:val="single" w:color="auto" w:sz="4" w:space="0"/>
+              <w:bottom w:val="single" w:color="auto" w:sz="4" w:space="0"/>
             </w:tcBorders>
             <w:vAlign w:val="center"/>
-            <w:hideMark/>
           </w:tcPr>
           <w:p>
             <w:pPr>
@@ -365,6 +333,14 @@
         </w:tc>
       </w:tr>
       <w:tr>
+        <w:tblPrEx>
+          <w:tblCellMar>
+            <w:top w:w="15" w:type="dxa"/>
+            <w:left w:w="15" w:type="dxa"/>
+            <w:bottom w:w="15" w:type="dxa"/>
+            <w:right w:w="15" w:type="dxa"/>
+          </w:tblCellMar>
+        </w:tblPrEx>
         <w:trPr>
           <w:tblCellSpacing w:w="15" w:type="dxa"/>
         </w:trPr>
@@ -372,16 +348,10 @@
           <w:tcPr>
             <w:tcW w:w="0" w:type="auto"/>
             <w:vAlign w:val="center"/>
-            <w:hideMark/>
           </w:tcPr>
           <w:p>
-            <w:proofErr w:type="gramStart"/>
-            <w:r>
-              <w:t>To provide</w:t>
-            </w:r>
-            <w:proofErr w:type="gramEnd"/>
-            <w:r>
-              <w:t xml:space="preserve"> software subscription services</w:t>
+            <w:r>
+              <w:t>To provide software subscription services</w:t>
             </w:r>
           </w:p>
         </w:tc>
@@ -389,7 +359,6 @@
           <w:tcPr>
             <w:tcW w:w="0" w:type="auto"/>
             <w:vAlign w:val="center"/>
-            <w:hideMark/>
           </w:tcPr>
           <w:p>
             <w:r>
@@ -401,7 +370,6 @@
           <w:tcPr>
             <w:tcW w:w="0" w:type="auto"/>
             <w:vAlign w:val="center"/>
-            <w:hideMark/>
           </w:tcPr>
           <w:p>
             <w:r>
@@ -413,7 +381,6 @@
           <w:tcPr>
             <w:tcW w:w="0" w:type="auto"/>
             <w:vAlign w:val="center"/>
-            <w:hideMark/>
           </w:tcPr>
           <w:p>
             <w:r>
@@ -423,6 +390,14 @@
         </w:tc>
       </w:tr>
       <w:tr>
+        <w:tblPrEx>
+          <w:tblCellMar>
+            <w:top w:w="15" w:type="dxa"/>
+            <w:left w:w="15" w:type="dxa"/>
+            <w:bottom w:w="15" w:type="dxa"/>
+            <w:right w:w="15" w:type="dxa"/>
+          </w:tblCellMar>
+        </w:tblPrEx>
         <w:trPr>
           <w:tblCellSpacing w:w="15" w:type="dxa"/>
         </w:trPr>
@@ -430,7 +405,6 @@
           <w:tcPr>
             <w:tcW w:w="0" w:type="auto"/>
             <w:vAlign w:val="center"/>
-            <w:hideMark/>
           </w:tcPr>
           <w:p>
             <w:r>
@@ -442,7 +416,6 @@
           <w:tcPr>
             <w:tcW w:w="0" w:type="auto"/>
             <w:vAlign w:val="center"/>
-            <w:hideMark/>
           </w:tcPr>
           <w:p>
             <w:r>
@@ -454,7 +427,6 @@
           <w:tcPr>
             <w:tcW w:w="0" w:type="auto"/>
             <w:vAlign w:val="center"/>
-            <w:hideMark/>
           </w:tcPr>
           <w:p>
             <w:r>
@@ -466,7 +438,6 @@
           <w:tcPr>
             <w:tcW w:w="0" w:type="auto"/>
             <w:vAlign w:val="center"/>
-            <w:hideMark/>
           </w:tcPr>
           <w:p>
             <w:r>
@@ -476,6 +447,14 @@
         </w:tc>
       </w:tr>
       <w:tr>
+        <w:tblPrEx>
+          <w:tblCellMar>
+            <w:top w:w="15" w:type="dxa"/>
+            <w:left w:w="15" w:type="dxa"/>
+            <w:bottom w:w="15" w:type="dxa"/>
+            <w:right w:w="15" w:type="dxa"/>
+          </w:tblCellMar>
+        </w:tblPrEx>
         <w:trPr>
           <w:tblCellSpacing w:w="15" w:type="dxa"/>
         </w:trPr>
@@ -483,7 +462,6 @@
           <w:tcPr>
             <w:tcW w:w="0" w:type="auto"/>
             <w:vAlign w:val="center"/>
-            <w:hideMark/>
           </w:tcPr>
           <w:p>
             <w:r>
@@ -495,7 +473,6 @@
           <w:tcPr>
             <w:tcW w:w="0" w:type="auto"/>
             <w:vAlign w:val="center"/>
-            <w:hideMark/>
           </w:tcPr>
           <w:p>
             <w:r>
@@ -507,7 +484,6 @@
           <w:tcPr>
             <w:tcW w:w="0" w:type="auto"/>
             <w:vAlign w:val="center"/>
-            <w:hideMark/>
           </w:tcPr>
           <w:p>
             <w:r>
@@ -519,24 +495,23 @@
           <w:tcPr>
             <w:tcW w:w="0" w:type="auto"/>
             <w:vAlign w:val="center"/>
-            <w:hideMark/>
           </w:tcPr>
           <w:p>
             <w:r>
-              <w:t xml:space="preserve">To inform you about </w:t>
-            </w:r>
-            <w:proofErr w:type="spellStart"/>
-            <w:r>
-              <w:t>Syntexa</w:t>
-            </w:r>
-            <w:proofErr w:type="spellEnd"/>
-            <w:r>
-              <w:t xml:space="preserve"> offerings and updates</w:t>
+              <w:t>To inform you about Syntexa offerings and updates</w:t>
             </w:r>
           </w:p>
         </w:tc>
       </w:tr>
       <w:tr>
+        <w:tblPrEx>
+          <w:tblCellMar>
+            <w:top w:w="15" w:type="dxa"/>
+            <w:left w:w="15" w:type="dxa"/>
+            <w:bottom w:w="15" w:type="dxa"/>
+            <w:right w:w="15" w:type="dxa"/>
+          </w:tblCellMar>
+        </w:tblPrEx>
         <w:trPr>
           <w:tblCellSpacing w:w="15" w:type="dxa"/>
         </w:trPr>
@@ -544,7 +519,6 @@
           <w:tcPr>
             <w:tcW w:w="0" w:type="auto"/>
             <w:vAlign w:val="center"/>
-            <w:hideMark/>
           </w:tcPr>
           <w:p>
             <w:r>
@@ -556,7 +530,6 @@
           <w:tcPr>
             <w:tcW w:w="0" w:type="auto"/>
             <w:vAlign w:val="center"/>
-            <w:hideMark/>
           </w:tcPr>
           <w:p>
             <w:r>
@@ -568,7 +541,6 @@
           <w:tcPr>
             <w:tcW w:w="0" w:type="auto"/>
             <w:vAlign w:val="center"/>
-            <w:hideMark/>
           </w:tcPr>
           <w:p>
             <w:r>
@@ -580,7 +552,6 @@
           <w:tcPr>
             <w:tcW w:w="0" w:type="auto"/>
             <w:vAlign w:val="center"/>
-            <w:hideMark/>
           </w:tcPr>
           <w:p>
             <w:r>
@@ -590,6 +561,14 @@
         </w:tc>
       </w:tr>
       <w:tr>
+        <w:tblPrEx>
+          <w:tblCellMar>
+            <w:top w:w="15" w:type="dxa"/>
+            <w:left w:w="15" w:type="dxa"/>
+            <w:bottom w:w="15" w:type="dxa"/>
+            <w:right w:w="15" w:type="dxa"/>
+          </w:tblCellMar>
+        </w:tblPrEx>
         <w:trPr>
           <w:tblCellSpacing w:w="15" w:type="dxa"/>
         </w:trPr>
@@ -597,19 +576,13 @@
           <w:tcPr>
             <w:tcW w:w="0" w:type="auto"/>
             <w:tcBorders>
-              <w:bottom w:val="single" w:sz="4" w:space="0" w:color="auto"/>
+              <w:bottom w:val="single" w:color="auto" w:sz="4" w:space="0"/>
             </w:tcBorders>
             <w:vAlign w:val="center"/>
-            <w:hideMark/>
           </w:tcPr>
           <w:p>
-            <w:proofErr w:type="gramStart"/>
-            <w:r>
-              <w:t>To respond</w:t>
-            </w:r>
-            <w:proofErr w:type="gramEnd"/>
-            <w:r>
-              <w:t xml:space="preserve"> to complaints and legal obligations</w:t>
+            <w:r>
+              <w:t>To respond to complaints and legal obligations</w:t>
             </w:r>
           </w:p>
         </w:tc>
@@ -617,22 +590,13 @@
           <w:tcPr>
             <w:tcW w:w="0" w:type="auto"/>
             <w:tcBorders>
-              <w:bottom w:val="single" w:sz="4" w:space="0" w:color="auto"/>
+              <w:bottom w:val="single" w:color="auto" w:sz="4" w:space="0"/>
             </w:tcBorders>
             <w:vAlign w:val="center"/>
-            <w:hideMark/>
           </w:tcPr>
           <w:p>
             <w:r>
-              <w:t xml:space="preserve">Identity and contact data, relevant </w:t>
-            </w:r>
-            <w:proofErr w:type="gramStart"/>
-            <w:r>
-              <w:t>transaction</w:t>
-            </w:r>
-            <w:proofErr w:type="gramEnd"/>
-            <w:r>
-              <w:t xml:space="preserve"> or support data</w:t>
+              <w:t>Identity and contact data, relevant transaction or support data</w:t>
             </w:r>
           </w:p>
         </w:tc>
@@ -640,10 +604,9 @@
           <w:tcPr>
             <w:tcW w:w="0" w:type="auto"/>
             <w:tcBorders>
-              <w:bottom w:val="single" w:sz="4" w:space="0" w:color="auto"/>
+              <w:bottom w:val="single" w:color="auto" w:sz="4" w:space="0"/>
             </w:tcBorders>
             <w:vAlign w:val="center"/>
-            <w:hideMark/>
           </w:tcPr>
           <w:p>
             <w:r>
@@ -655,10 +618,9 @@
           <w:tcPr>
             <w:tcW w:w="0" w:type="auto"/>
             <w:tcBorders>
-              <w:bottom w:val="single" w:sz="4" w:space="0" w:color="auto"/>
+              <w:bottom w:val="single" w:color="auto" w:sz="4" w:space="0"/>
             </w:tcBorders>
             <w:vAlign w:val="center"/>
-            <w:hideMark/>
           </w:tcPr>
           <w:p>
             <w:r>
@@ -704,15 +666,7 @@
         <w:t>Direct interactions</w:t>
       </w:r>
       <w:r>
-        <w:t xml:space="preserve">: when you subscribe, contact us, or engage with </w:t>
-      </w:r>
-      <w:proofErr w:type="spellStart"/>
-      <w:r>
-        <w:t>Syntexa</w:t>
-      </w:r>
-      <w:proofErr w:type="spellEnd"/>
-      <w:r>
-        <w:t xml:space="preserve"> services.</w:t>
+        <w:t>: when you subscribe, contact us, or engage with Syntexa services.</w:t>
       </w:r>
     </w:p>
     <w:p>
@@ -745,7 +699,6 @@
           <w:b/>
           <w:bCs/>
         </w:rPr>
-        <w:lastRenderedPageBreak/>
         <w:t>Referrals</w:t>
       </w:r>
       <w:r>
@@ -894,13 +847,8 @@
           <w:numId w:val="3"/>
         </w:numPr>
       </w:pPr>
-      <w:proofErr w:type="spellStart"/>
-      <w:r>
-        <w:t>Syntexa</w:t>
-      </w:r>
-      <w:proofErr w:type="spellEnd"/>
-      <w:r>
-        <w:t xml:space="preserve"> subsidiaries or affiliates</w:t>
+      <w:r>
+        <w:t>Syntexa subsidiaries or affiliates</w:t>
       </w:r>
     </w:p>
     <w:p>
@@ -1114,26 +1062,33 @@
       <w:r>
         <w:t xml:space="preserve">Requests can be submitted via </w:t>
       </w:r>
-      <w:hyperlink r:id="rId7" w:history="1">
-        <w:r>
-          <w:rPr>
-            <w:rStyle w:val="Hyperlink"/>
-            <w:b/>
-            <w:bCs/>
-          </w:rPr>
-          <w:t>info@syntexa.com</w:t>
-        </w:r>
-      </w:hyperlink>
-      <w:r>
-        <w:t xml:space="preserve">. </w:t>
-      </w:r>
-      <w:proofErr w:type="spellStart"/>
-      <w:r>
-        <w:t>Syntexa</w:t>
-      </w:r>
-      <w:proofErr w:type="spellEnd"/>
-      <w:r>
-        <w:t xml:space="preserve"> will respond within </w:t>
+      <w:r>
+        <w:fldChar w:fldCharType="begin"/>
+      </w:r>
+      <w:r>
+        <w:instrText xml:space="preserve"> HYPERLINK "mailto:info@syntexa.com" </w:instrText>
+      </w:r>
+      <w:r>
+        <w:fldChar w:fldCharType="separate"/>
+      </w:r>
+      <w:r>
+        <w:rPr>
+          <w:rStyle w:val="15"/>
+          <w:b/>
+          <w:bCs/>
+        </w:rPr>
+        <w:t>info@syntexa.com</w:t>
+      </w:r>
+      <w:r>
+        <w:rPr>
+          <w:rStyle w:val="15"/>
+          <w:b/>
+          <w:bCs/>
+        </w:rPr>
+        <w:fldChar w:fldCharType="end"/>
+      </w:r>
+      <w:r>
+        <w:t xml:space="preserve">. Syntexa will respond within </w:t>
       </w:r>
       <w:r>
         <w:rPr>
@@ -1171,13 +1126,8 @@
       </w:r>
     </w:p>
     <w:p>
-      <w:proofErr w:type="spellStart"/>
-      <w:r>
-        <w:t>Syntexa</w:t>
-      </w:r>
-      <w:proofErr w:type="spellEnd"/>
-      <w:r>
-        <w:t xml:space="preserve"> may transfer personal information across borders, including outside Canada, the USA, or the EEA. We ensure transfers comply with applicable laws and implement safeguards, such as </w:t>
+      <w:r>
+        <w:t xml:space="preserve">Syntexa may transfer personal information across borders, including outside Canada, the USA, or the EEA. We ensure transfers comply with applicable laws and implement safeguards, such as </w:t>
       </w:r>
       <w:r>
         <w:rPr>
@@ -1207,13 +1157,8 @@
       </w:r>
     </w:p>
     <w:p>
-      <w:proofErr w:type="spellStart"/>
-      <w:r>
-        <w:t>Syntexa</w:t>
-      </w:r>
-      <w:proofErr w:type="spellEnd"/>
-      <w:r>
-        <w:t xml:space="preserve"> implements technical, administrative, and physical measures to protect personal information, including:</w:t>
+      <w:r>
+        <w:t>Syntexa implements technical, administrative, and physical measures to protect personal information, including:</w:t>
       </w:r>
     </w:p>
     <w:p>
@@ -1257,7 +1202,6 @@
         </w:numPr>
       </w:pPr>
       <w:r>
-        <w:lastRenderedPageBreak/>
         <w:t>Antivirus and malware protection</w:t>
       </w:r>
     </w:p>
@@ -1305,15 +1249,7 @@
         <w:t>do not contain personal information</w:t>
       </w:r>
       <w:r>
-        <w:t xml:space="preserve"> unless you provide </w:t>
-      </w:r>
-      <w:proofErr w:type="gramStart"/>
-      <w:r>
-        <w:t>it</w:t>
-      </w:r>
-      <w:proofErr w:type="gramEnd"/>
-      <w:r>
-        <w:t>. Most browsers allow you to block or delete cookies, but some features may not function properly if cookies are disabled.</w:t>
+        <w:t xml:space="preserve"> unless you provide it. Most browsers allow you to block or delete cookies, but some features may not function properly if cookies are disabled.</w:t>
       </w:r>
     </w:p>
     <w:p/>
@@ -1400,16 +1336,29 @@
       <w:r>
         <w:t xml:space="preserve"> </w:t>
       </w:r>
-      <w:hyperlink r:id="rId8" w:history="1">
-        <w:r>
-          <w:rPr>
-            <w:rStyle w:val="Hyperlink"/>
-          </w:rPr>
-          <w:t>info@syntexa.com</w:t>
-        </w:r>
-      </w:hyperlink>
-      <w:r>
-        <w:br/>
+      <w:r>
+        <w:fldChar w:fldCharType="begin"/>
+      </w:r>
+      <w:r>
+        <w:instrText xml:space="preserve"> HYPERLINK "mailto:info@syntexa.com" </w:instrText>
+      </w:r>
+      <w:r>
+        <w:fldChar w:fldCharType="separate"/>
+      </w:r>
+      <w:r>
+        <w:rPr>
+          <w:rStyle w:val="15"/>
+        </w:rPr>
+        <w:t>info@syntexa.com</w:t>
+      </w:r>
+      <w:r>
+        <w:rPr>
+          <w:rStyle w:val="15"/>
+        </w:rPr>
+        <w:fldChar w:fldCharType="end"/>
+      </w:r>
+      <w:r>
+        <w:br w:type="textWrapping"/>
       </w:r>
       <w:r>
         <w:rPr>
@@ -1419,44 +1368,37 @@
         <w:t>Mailing Address:</w:t>
       </w:r>
       <w:r>
-        <w:t xml:space="preserve"> </w:t>
-      </w:r>
-      <w:proofErr w:type="spellStart"/>
-      <w:r>
-        <w:t>Syntexa</w:t>
-      </w:r>
-      <w:proofErr w:type="spellEnd"/>
-      <w:r>
-        <w:t xml:space="preserve"> Inc., 151 Bentley Street, Unit 5, Markham, Ontario, Canada, L3R 3X9</w:t>
+        <w:t xml:space="preserve"> Syntexa Inc., 151 Bentley Street, Unit 5, Markham, Ontario, Canada, L3R 3X9</w:t>
       </w:r>
     </w:p>
     <w:sectPr>
-      <w:footerReference w:type="default" r:id="rId9"/>
+      <w:headerReference r:id="rId5" w:type="default"/>
+      <w:footerReference r:id="rId6" w:type="default"/>
       <w:pgSz w:w="12240" w:h="15840"/>
       <w:pgMar w:top="1440" w:right="1440" w:bottom="1440" w:left="1440" w:header="720" w:footer="720" w:gutter="0"/>
-      <w:cols w:space="720"/>
-      <w:docGrid w:linePitch="360"/>
+      <w:cols w:space="720" w:num="1"/>
+      <w:docGrid w:linePitch="360" w:charSpace="0"/>
     </w:sectPr>
   </w:body>
 </w:document>
 </file>
 
 <file path=word/endnotes.xml><?xml version="1.0" encoding="utf-8"?>
-<w:endnotes xmlns:wpc="http://schemas.microsoft.com/office/word/2010/wordprocessingCanvas" xmlns:cx="http://schemas.microsoft.com/office/drawing/2014/chartex" xmlns:cx1="http://schemas.microsoft.com/office/drawing/2015/9/8/chartex" xmlns:cx2="http://schemas.microsoft.com/office/drawing/2015/10/21/chartex" xmlns:cx3="http://schemas.microsoft.com/office/drawing/2016/5/9/chartex" xmlns:cx4="http://schemas.microsoft.com/office/drawing/2016/5/10/chartex" xmlns:cx5="http://schemas.microsoft.com/office/drawing/2016/5/11/chartex" xmlns:cx6="http://schemas.microsoft.com/office/drawing/2016/5/12/chartex" xmlns:cx7="http://schemas.microsoft.com/office/drawing/2016/5/13/chartex" xmlns:cx8="http://schemas.microsoft.com/office/drawing/2016/5/14/chartex" xmlns:mc="http://schemas.openxmlformats.org/markup-compatibility/2006" xmlns:aink="http://schemas.microsoft.com/office/drawing/2016/ink" xmlns:am3d="http://schemas.microsoft.com/office/drawing/2017/model3d" xmlns:o="urn:schemas-microsoft-com:office:office" xmlns:oel="http://schemas.microsoft.com/office/2019/extlst" xmlns:r="http://schemas.openxmlformats.org/officeDocument/2006/relationships" xmlns:m="http://schemas.openxmlformats.org/officeDocument/2006/math" xmlns:v="urn:schemas-microsoft-com:vml" xmlns:wp14="http://schemas.microsoft.com/office/word/2010/wordprocessingDrawing" xmlns:wp="http://schemas.openxmlformats.org/drawingml/2006/wordprocessingDrawing" xmlns:w10="urn:schemas-microsoft-com:office:word" xmlns:w="http://schemas.openxmlformats.org/wordprocessingml/2006/main" xmlns:w14="http://schemas.microsoft.com/office/word/2010/wordml" xmlns:w15="http://schemas.microsoft.com/office/word/2012/wordml" xmlns:w16cex="http://schemas.microsoft.com/office/word/2018/wordml/cex" xmlns:w16cid="http://schemas.microsoft.com/office/word/2016/wordml/cid" xmlns:w16="http://schemas.microsoft.com/office/word/2018/wordml" xmlns:w16du="http://schemas.microsoft.com/office/word/2023/wordml/word16du" xmlns:w16sdtdh="http://schemas.microsoft.com/office/word/2020/wordml/sdtdatahash" xmlns:w16sdtfl="http://schemas.microsoft.com/office/word/2024/wordml/sdtformatlock" xmlns:w16se="http://schemas.microsoft.com/office/word/2015/wordml/symex" xmlns:wpg="http://schemas.microsoft.com/office/word/2010/wordprocessingGroup" xmlns:wpi="http://schemas.microsoft.com/office/word/2010/wordprocessingInk" xmlns:wne="http://schemas.microsoft.com/office/word/2006/wordml" xmlns:wps="http://schemas.microsoft.com/office/word/2010/wordprocessingShape" mc:Ignorable="w14 w15 w16se w16cid w16 w16cex w16sdtdh w16sdtfl w16du wp14">
-  <w:endnote w:type="separator" w:id="-1">
-    <w:p>
-      <w:pPr>
-        <w:spacing w:after="0" w:line="240" w:lineRule="auto"/>
+<w:endnotes xmlns:wpc="http://schemas.microsoft.com/office/word/2010/wordprocessingCanvas" xmlns:mc="http://schemas.openxmlformats.org/markup-compatibility/2006" xmlns:o="urn:schemas-microsoft-com:office:office" xmlns:r="http://schemas.openxmlformats.org/officeDocument/2006/relationships" xmlns:m="http://schemas.openxmlformats.org/officeDocument/2006/math" xmlns:v="urn:schemas-microsoft-com:vml" xmlns:wp14="http://schemas.microsoft.com/office/word/2010/wordprocessingDrawing" xmlns:wp="http://schemas.openxmlformats.org/drawingml/2006/wordprocessingDrawing" xmlns:w="http://schemas.openxmlformats.org/wordprocessingml/2006/main" xmlns:w14="http://schemas.microsoft.com/office/word/2010/wordml" xmlns:w15="http://schemas.microsoft.com/office/word/2012/wordml" xmlns:w10="urn:schemas-microsoft-com:office:word" xmlns:wpg="http://schemas.microsoft.com/office/word/2010/wordprocessingGroup" xmlns:wpi="http://schemas.microsoft.com/office/word/2010/wordprocessingInk" xmlns:wne="http://schemas.microsoft.com/office/word/2006/wordml" xmlns:wps="http://schemas.microsoft.com/office/word/2010/wordprocessingShape" xmlns:wpsCustomData="http://www.wps.cn/officeDocument/2013/wpsCustomData" mc:Ignorable="w14 w15 wp14">
+  <w:endnote w:type="separator" w:id="0">
+    <w:p>
+      <w:pPr>
+        <w:spacing w:line="240" w:lineRule="auto"/>
       </w:pPr>
       <w:r>
         <w:separator/>
       </w:r>
     </w:p>
   </w:endnote>
-  <w:endnote w:type="continuationSeparator" w:id="0">
-    <w:p>
-      <w:pPr>
-        <w:spacing w:after="0" w:line="240" w:lineRule="auto"/>
+  <w:endnote w:type="continuationSeparator" w:id="1">
+    <w:p>
+      <w:pPr>
+        <w:spacing w:line="240" w:lineRule="auto"/>
       </w:pPr>
       <w:r>
         <w:continuationSeparator/>
@@ -1467,13 +1409,12 @@
 </file>
 
 <file path=word/footer1.xml><?xml version="1.0" encoding="utf-8"?>
-<w:ftr xmlns:wpc="http://schemas.microsoft.com/office/word/2010/wordprocessingCanvas" xmlns:cx="http://schemas.microsoft.com/office/drawing/2014/chartex" xmlns:cx1="http://schemas.microsoft.com/office/drawing/2015/9/8/chartex" xmlns:cx2="http://schemas.microsoft.com/office/drawing/2015/10/21/chartex" xmlns:cx3="http://schemas.microsoft.com/office/drawing/2016/5/9/chartex" xmlns:cx4="http://schemas.microsoft.com/office/drawing/2016/5/10/chartex" xmlns:cx5="http://schemas.microsoft.com/office/drawing/2016/5/11/chartex" xmlns:cx6="http://schemas.microsoft.com/office/drawing/2016/5/12/chartex" xmlns:cx7="http://schemas.microsoft.com/office/drawing/2016/5/13/chartex" xmlns:cx8="http://schemas.microsoft.com/office/drawing/2016/5/14/chartex" xmlns:mc="http://schemas.openxmlformats.org/markup-compatibility/2006" xmlns:aink="http://schemas.microsoft.com/office/drawing/2016/ink" xmlns:am3d="http://schemas.microsoft.com/office/drawing/2017/model3d" xmlns:o="urn:schemas-microsoft-com:office:office" xmlns:oel="http://schemas.microsoft.com/office/2019/extlst" xmlns:r="http://schemas.openxmlformats.org/officeDocument/2006/relationships" xmlns:m="http://schemas.openxmlformats.org/officeDocument/2006/math" xmlns:v="urn:schemas-microsoft-com:vml" xmlns:wp14="http://schemas.microsoft.com/office/word/2010/wordprocessingDrawing" xmlns:wp="http://schemas.openxmlformats.org/drawingml/2006/wordprocessingDrawing" xmlns:w10="urn:schemas-microsoft-com:office:word" xmlns:w="http://schemas.openxmlformats.org/wordprocessingml/2006/main" xmlns:w14="http://schemas.microsoft.com/office/word/2010/wordml" xmlns:w15="http://schemas.microsoft.com/office/word/2012/wordml" xmlns:w16cex="http://schemas.microsoft.com/office/word/2018/wordml/cex" xmlns:w16cid="http://schemas.microsoft.com/office/word/2016/wordml/cid" xmlns:w16="http://schemas.microsoft.com/office/word/2018/wordml" xmlns:w16du="http://schemas.microsoft.com/office/word/2023/wordml/word16du" xmlns:w16sdtdh="http://schemas.microsoft.com/office/word/2020/wordml/sdtdatahash" xmlns:w16sdtfl="http://schemas.microsoft.com/office/word/2024/wordml/sdtformatlock" xmlns:w16se="http://schemas.microsoft.com/office/word/2015/wordml/symex" xmlns:wpg="http://schemas.microsoft.com/office/word/2010/wordprocessingGroup" xmlns:wpi="http://schemas.microsoft.com/office/word/2010/wordprocessingInk" xmlns:wne="http://schemas.microsoft.com/office/word/2006/wordml" xmlns:wps="http://schemas.microsoft.com/office/word/2010/wordprocessingShape" mc:Ignorable="w14 w15 w16se w16cid w16 w16cex w16sdtdh w16sdtfl w16du wp14">
+<w:ftr xmlns:wpc="http://schemas.microsoft.com/office/word/2010/wordprocessingCanvas" xmlns:mc="http://schemas.openxmlformats.org/markup-compatibility/2006" xmlns:o="urn:schemas-microsoft-com:office:office" xmlns:r="http://schemas.openxmlformats.org/officeDocument/2006/relationships" xmlns:m="http://schemas.openxmlformats.org/officeDocument/2006/math" xmlns:v="urn:schemas-microsoft-com:vml" xmlns:wp14="http://schemas.microsoft.com/office/word/2010/wordprocessingDrawing" xmlns:wp="http://schemas.openxmlformats.org/drawingml/2006/wordprocessingDrawing" xmlns:w10="urn:schemas-microsoft-com:office:word" xmlns:w="http://schemas.openxmlformats.org/wordprocessingml/2006/main" xmlns:w14="http://schemas.microsoft.com/office/word/2010/wordml" xmlns:w15="http://schemas.microsoft.com/office/word/2012/wordml" xmlns:wpg="http://schemas.microsoft.com/office/word/2010/wordprocessingGroup" xmlns:wpi="http://schemas.microsoft.com/office/word/2010/wordprocessingInk" xmlns:wne="http://schemas.microsoft.com/office/word/2006/wordml" xmlns:wps="http://schemas.microsoft.com/office/word/2010/wordprocessingShape" xmlns:wpsCustomData="http://www.wps.cn/officeDocument/2013/wpsCustomData" mc:Ignorable="w14 w15 wp14">
   <w:sdt>
     <w:sdtPr>
       <w:id w:val="-1044216836"/>
       <w:docPartObj>
-        <w:docPartGallery w:val="Page Numbers (Bottom of Page)"/>
-        <w:docPartUnique/>
+        <w:docPartGallery w:val="AutoText"/>
       </w:docPartObj>
     </w:sdtPr>
     <w:sdtContent>
@@ -1481,22 +1422,26 @@
         <w:sdtPr>
           <w:id w:val="1728636285"/>
           <w:docPartObj>
-            <w:docPartGallery w:val="Page Numbers (Top of Page)"/>
-            <w:docPartUnique/>
+            <w:docPartGallery w:val="AutoText"/>
           </w:docPartObj>
         </w:sdtPr>
         <w:sdtContent>
           <w:p>
             <w:pPr>
-              <w:pStyle w:val="Footer"/>
+              <w:pStyle w:val="13"/>
             </w:pPr>
             <w:r>
-              <w:t>---------------------------------------------------------------------------------------------------------------------</w:t>
+              <w:t>----------------------------------------</w:t>
+            </w:r>
+            <w:bookmarkStart w:id="0" w:name="_GoBack"/>
+            <w:bookmarkEnd w:id="0"/>
+            <w:r>
+              <w:t>-----------------------------------------------------------------------------</w:t>
             </w:r>
           </w:p>
           <w:p>
             <w:pPr>
-              <w:pStyle w:val="Footer"/>
+              <w:pStyle w:val="13"/>
             </w:pPr>
             <w:r>
               <w:t>Doc 26005 Rev00 has been reviewed and approved by Chad Nedin, VP of Operations.</w:t>
@@ -1504,21 +1449,41 @@
           </w:p>
           <w:p>
             <w:pPr>
-              <w:pStyle w:val="Footer"/>
+              <w:pStyle w:val="13"/>
             </w:pPr>
             <w:r>
-              <w:t>Effective Date: 15-May-2026 (CCN-26001).</w:t>
+              <w:t>Effective Date: 15-</w:t>
+            </w:r>
+            <w:r>
+              <w:rPr>
+                <w:rFonts w:hint="default"/>
+                <w:lang w:val="en-US"/>
+              </w:rPr>
+              <w:t>Jan</w:t>
+            </w:r>
+            <w:r>
+              <w:t>-202</w:t>
+            </w:r>
+            <w:r>
+              <w:rPr>
+                <w:rFonts w:hint="default"/>
+                <w:lang w:val="en-US"/>
+              </w:rPr>
+              <w:t>5</w:t>
+            </w:r>
+            <w:r>
+              <w:t xml:space="preserve"> (CCN-26001).</w:t>
             </w:r>
           </w:p>
           <w:p>
             <w:pPr>
-              <w:pStyle w:val="Footer"/>
+              <w:pStyle w:val="13"/>
               <w:jc w:val="center"/>
             </w:pPr>
           </w:p>
           <w:p>
             <w:pPr>
-              <w:pStyle w:val="Footer"/>
+              <w:pStyle w:val="13"/>
               <w:jc w:val="center"/>
             </w:pPr>
             <w:r>
@@ -1549,7 +1514,6 @@
               <w:rPr>
                 <w:b/>
                 <w:bCs/>
-                <w:noProof/>
               </w:rPr>
               <w:t>2</w:t>
             </w:r>
@@ -1588,7 +1552,6 @@
               <w:rPr>
                 <w:b/>
                 <w:bCs/>
-                <w:noProof/>
               </w:rPr>
               <w:t>2</w:t>
             </w:r>
@@ -1606,28 +1569,28 @@
   </w:sdt>
   <w:p>
     <w:pPr>
-      <w:pStyle w:val="Footer"/>
+      <w:pStyle w:val="13"/>
     </w:pPr>
   </w:p>
 </w:ftr>
 </file>
 
 <file path=word/footnotes.xml><?xml version="1.0" encoding="utf-8"?>
-<w:footnotes xmlns:wpc="http://schemas.microsoft.com/office/word/2010/wordprocessingCanvas" xmlns:cx="http://schemas.microsoft.com/office/drawing/2014/chartex" xmlns:cx1="http://schemas.microsoft.com/office/drawing/2015/9/8/chartex" xmlns:cx2="http://schemas.microsoft.com/office/drawing/2015/10/21/chartex" xmlns:cx3="http://schemas.microsoft.com/office/drawing/2016/5/9/chartex" xmlns:cx4="http://schemas.microsoft.com/office/drawing/2016/5/10/chartex" xmlns:cx5="http://schemas.microsoft.com/office/drawing/2016/5/11/chartex" xmlns:cx6="http://schemas.microsoft.com/office/drawing/2016/5/12/chartex" xmlns:cx7="http://schemas.microsoft.com/office/drawing/2016/5/13/chartex" xmlns:cx8="http://schemas.microsoft.com/office/drawing/2016/5/14/chartex" xmlns:mc="http://schemas.openxmlformats.org/markup-compatibility/2006" xmlns:aink="http://schemas.microsoft.com/office/drawing/2016/ink" xmlns:am3d="http://schemas.microsoft.com/office/drawing/2017/model3d" xmlns:o="urn:schemas-microsoft-com:office:office" xmlns:oel="http://schemas.microsoft.com/office/2019/extlst" xmlns:r="http://schemas.openxmlformats.org/officeDocument/2006/relationships" xmlns:m="http://schemas.openxmlformats.org/officeDocument/2006/math" xmlns:v="urn:schemas-microsoft-com:vml" xmlns:wp14="http://schemas.microsoft.com/office/word/2010/wordprocessingDrawing" xmlns:wp="http://schemas.openxmlformats.org/drawingml/2006/wordprocessingDrawing" xmlns:w10="urn:schemas-microsoft-com:office:word" xmlns:w="http://schemas.openxmlformats.org/wordprocessingml/2006/main" xmlns:w14="http://schemas.microsoft.com/office/word/2010/wordml" xmlns:w15="http://schemas.microsoft.com/office/word/2012/wordml" xmlns:w16cex="http://schemas.microsoft.com/office/word/2018/wordml/cex" xmlns:w16cid="http://schemas.microsoft.com/office/word/2016/wordml/cid" xmlns:w16="http://schemas.microsoft.com/office/word/2018/wordml" xmlns:w16du="http://schemas.microsoft.com/office/word/2023/wordml/word16du" xmlns:w16sdtdh="http://schemas.microsoft.com/office/word/2020/wordml/sdtdatahash" xmlns:w16sdtfl="http://schemas.microsoft.com/office/word/2024/wordml/sdtformatlock" xmlns:w16se="http://schemas.microsoft.com/office/word/2015/wordml/symex" xmlns:wpg="http://schemas.microsoft.com/office/word/2010/wordprocessingGroup" xmlns:wpi="http://schemas.microsoft.com/office/word/2010/wordprocessingInk" xmlns:wne="http://schemas.microsoft.com/office/word/2006/wordml" xmlns:wps="http://schemas.microsoft.com/office/word/2010/wordprocessingShape" mc:Ignorable="w14 w15 w16se w16cid w16 w16cex w16sdtdh w16sdtfl w16du wp14">
-  <w:footnote w:type="separator" w:id="-1">
-    <w:p>
-      <w:pPr>
-        <w:spacing w:after="0" w:line="240" w:lineRule="auto"/>
+<w:footnotes xmlns:wpc="http://schemas.microsoft.com/office/word/2010/wordprocessingCanvas" xmlns:mc="http://schemas.openxmlformats.org/markup-compatibility/2006" xmlns:o="urn:schemas-microsoft-com:office:office" xmlns:r="http://schemas.openxmlformats.org/officeDocument/2006/relationships" xmlns:m="http://schemas.openxmlformats.org/officeDocument/2006/math" xmlns:v="urn:schemas-microsoft-com:vml" xmlns:wp14="http://schemas.microsoft.com/office/word/2010/wordprocessingDrawing" xmlns:wp="http://schemas.openxmlformats.org/drawingml/2006/wordprocessingDrawing" xmlns:w="http://schemas.openxmlformats.org/wordprocessingml/2006/main" xmlns:w14="http://schemas.microsoft.com/office/word/2010/wordml" xmlns:w15="http://schemas.microsoft.com/office/word/2012/wordml" xmlns:w10="urn:schemas-microsoft-com:office:word" xmlns:wpg="http://schemas.microsoft.com/office/word/2010/wordprocessingGroup" xmlns:wpi="http://schemas.microsoft.com/office/word/2010/wordprocessingInk" xmlns:wne="http://schemas.microsoft.com/office/word/2006/wordml" xmlns:wps="http://schemas.microsoft.com/office/word/2010/wordprocessingShape" xmlns:wpsCustomData="http://www.wps.cn/officeDocument/2013/wpsCustomData" mc:Ignorable="w14 w15 wp14">
+  <w:footnote w:type="separator" w:id="0">
+    <w:p>
+      <w:pPr>
+        <w:spacing w:before="0" w:after="0" w:line="276" w:lineRule="auto"/>
       </w:pPr>
       <w:r>
         <w:separator/>
       </w:r>
     </w:p>
   </w:footnote>
-  <w:footnote w:type="continuationSeparator" w:id="0">
-    <w:p>
-      <w:pPr>
-        <w:spacing w:after="0" w:line="240" w:lineRule="auto"/>
+  <w:footnote w:type="continuationSeparator" w:id="1">
+    <w:p>
+      <w:pPr>
+        <w:spacing w:before="0" w:after="0" w:line="276" w:lineRule="auto"/>
       </w:pPr>
       <w:r>
         <w:continuationSeparator/>
@@ -1637,1331 +1600,1065 @@
 </w:footnotes>
 </file>
 
+<file path=word/header1.xml><?xml version="1.0" encoding="utf-8"?>
+<w:hdr xmlns:wpc="http://schemas.microsoft.com/office/word/2010/wordprocessingCanvas" xmlns:mc="http://schemas.openxmlformats.org/markup-compatibility/2006" xmlns:o="urn:schemas-microsoft-com:office:office" xmlns:r="http://schemas.openxmlformats.org/officeDocument/2006/relationships" xmlns:m="http://schemas.openxmlformats.org/officeDocument/2006/math" xmlns:v="urn:schemas-microsoft-com:vml" xmlns:wp14="http://schemas.microsoft.com/office/word/2010/wordprocessingDrawing" xmlns:wp="http://schemas.openxmlformats.org/drawingml/2006/wordprocessingDrawing" xmlns:w10="urn:schemas-microsoft-com:office:word" xmlns:w="http://schemas.openxmlformats.org/wordprocessingml/2006/main" xmlns:w14="http://schemas.microsoft.com/office/word/2010/wordml" xmlns:w15="http://schemas.microsoft.com/office/word/2012/wordml" xmlns:wpg="http://schemas.microsoft.com/office/word/2010/wordprocessingGroup" xmlns:wpi="http://schemas.microsoft.com/office/word/2010/wordprocessingInk" xmlns:wne="http://schemas.microsoft.com/office/word/2006/wordml" xmlns:wps="http://schemas.microsoft.com/office/word/2010/wordprocessingShape" xmlns:wpsCustomData="http://www.wps.cn/officeDocument/2013/wpsCustomData" mc:Ignorable="w14 w15 wp14">
+  <w:p>
+    <w:pPr>
+      <w:pStyle w:val="14"/>
+    </w:pPr>
+  </w:p>
+</w:hdr>
+</file>
+
 <file path=word/numbering.xml><?xml version="1.0" encoding="utf-8"?>
-<w:numbering xmlns:wpc="http://schemas.microsoft.com/office/word/2010/wordprocessingCanvas" xmlns:cx="http://schemas.microsoft.com/office/drawing/2014/chartex" xmlns:cx1="http://schemas.microsoft.com/office/drawing/2015/9/8/chartex" xmlns:cx2="http://schemas.microsoft.com/office/drawing/2015/10/21/chartex" xmlns:cx3="http://schemas.microsoft.com/office/drawing/2016/5/9/chartex" xmlns:cx4="http://schemas.microsoft.com/office/drawing/2016/5/10/chartex" xmlns:cx5="http://schemas.microsoft.com/office/drawing/2016/5/11/chartex" xmlns:cx6="http://schemas.microsoft.com/office/drawing/2016/5/12/chartex" xmlns:cx7="http://schemas.microsoft.com/office/drawing/2016/5/13/chartex" xmlns:cx8="http://schemas.microsoft.com/office/drawing/2016/5/14/chartex" xmlns:mc="http://schemas.openxmlformats.org/markup-compatibility/2006" xmlns:aink="http://schemas.microsoft.com/office/drawing/2016/ink" xmlns:am3d="http://schemas.microsoft.com/office/drawing/2017/model3d" xmlns:o="urn:schemas-microsoft-com:office:office" xmlns:oel="http://schemas.microsoft.com/office/2019/extlst" xmlns:r="http://schemas.openxmlformats.org/officeDocument/2006/relationships" xmlns:m="http://schemas.openxmlformats.org/officeDocument/2006/math" xmlns:v="urn:schemas-microsoft-com:vml" xmlns:wp14="http://schemas.microsoft.com/office/word/2010/wordprocessingDrawing" xmlns:wp="http://schemas.openxmlformats.org/drawingml/2006/wordprocessingDrawing" xmlns:w10="urn:schemas-microsoft-com:office:word" xmlns:w="http://schemas.openxmlformats.org/wordprocessingml/2006/main" xmlns:w14="http://schemas.microsoft.com/office/word/2010/wordml" xmlns:w15="http://schemas.microsoft.com/office/word/2012/wordml" xmlns:w16cex="http://schemas.microsoft.com/office/word/2018/wordml/cex" xmlns:w16cid="http://schemas.microsoft.com/office/word/2016/wordml/cid" xmlns:w16="http://schemas.microsoft.com/office/word/2018/wordml" xmlns:w16du="http://schemas.microsoft.com/office/word/2023/wordml/word16du" xmlns:w16sdtdh="http://schemas.microsoft.com/office/word/2020/wordml/sdtdatahash" xmlns:w16sdtfl="http://schemas.microsoft.com/office/word/2024/wordml/sdtformatlock" xmlns:w16se="http://schemas.microsoft.com/office/word/2015/wordml/symex" xmlns:wpg="http://schemas.microsoft.com/office/word/2010/wordprocessingGroup" xmlns:wpi="http://schemas.microsoft.com/office/word/2010/wordprocessingInk" xmlns:wne="http://schemas.microsoft.com/office/word/2006/wordml" xmlns:wps="http://schemas.microsoft.com/office/word/2010/wordprocessingShape" mc:Ignorable="w14 w15 w16se w16cid w16 w16cex w16sdtdh w16sdtfl w16du wp14">
-  <w:abstractNum w:abstractNumId="0" w15:restartNumberingAfterBreak="0">
+<w:numbering xmlns:wpc="http://schemas.microsoft.com/office/word/2010/wordprocessingCanvas" xmlns:mc="http://schemas.openxmlformats.org/markup-compatibility/2006" xmlns:o="urn:schemas-microsoft-com:office:office" xmlns:r="http://schemas.openxmlformats.org/officeDocument/2006/relationships" xmlns:m="http://schemas.openxmlformats.org/officeDocument/2006/math" xmlns:v="urn:schemas-microsoft-com:vml" xmlns:wp14="http://schemas.microsoft.com/office/word/2010/wordprocessingDrawing" xmlns:wp="http://schemas.openxmlformats.org/drawingml/2006/wordprocessingDrawing" xmlns:w10="urn:schemas-microsoft-com:office:word" xmlns:w="http://schemas.openxmlformats.org/wordprocessingml/2006/main" xmlns:w14="http://schemas.microsoft.com/office/word/2010/wordml" xmlns:wpg="http://schemas.microsoft.com/office/word/2010/wordprocessingGroup" xmlns:wpi="http://schemas.microsoft.com/office/word/2010/wordprocessingInk" xmlns:wne="http://schemas.microsoft.com/office/word/2006/wordml" xmlns:wps="http://schemas.microsoft.com/office/word/2010/wordprocessingShape" xmlns:wpsCustomData="http://www.wps.cn/officeDocument/2013/wpsCustomData" mc:Ignorable="w14 wp14">
+  <w:abstractNum w:abstractNumId="0">
     <w:nsid w:val="09997520"/>
     <w:multiLevelType w:val="multilevel"/>
-    <w:tmpl w:val="18B89F9C"/>
-    <w:lvl w:ilvl="0">
+    <w:tmpl w:val="09997520"/>
+    <w:lvl w:ilvl="0" w:tentative="0">
       <w:start w:val="1"/>
       <w:numFmt w:val="bullet"/>
       <w:lvlText w:val=""/>
       <w:lvlJc w:val="left"/>
       <w:pPr>
         <w:tabs>
-          <w:tab w:val="num" w:pos="720"/>
+          <w:tab w:val="left" w:pos="720"/>
         </w:tabs>
         <w:ind w:left="720" w:hanging="360"/>
       </w:pPr>
       <w:rPr>
-        <w:rFonts w:ascii="Symbol" w:hAnsi="Symbol" w:hint="default"/>
-        <w:sz w:val="20"/>
-      </w:rPr>
-    </w:lvl>
-    <w:lvl w:ilvl="1" w:tentative="1">
+        <w:rFonts w:hint="default" w:ascii="Symbol" w:hAnsi="Symbol"/>
+        <w:sz w:val="20"/>
+      </w:rPr>
+    </w:lvl>
+    <w:lvl w:ilvl="1" w:tentative="0">
       <w:start w:val="1"/>
       <w:numFmt w:val="bullet"/>
       <w:lvlText w:val="o"/>
       <w:lvlJc w:val="left"/>
       <w:pPr>
         <w:tabs>
-          <w:tab w:val="num" w:pos="1440"/>
+          <w:tab w:val="left" w:pos="1440"/>
         </w:tabs>
         <w:ind w:left="1440" w:hanging="360"/>
       </w:pPr>
       <w:rPr>
-        <w:rFonts w:ascii="Courier New" w:hAnsi="Courier New" w:hint="default"/>
-        <w:sz w:val="20"/>
-      </w:rPr>
-    </w:lvl>
-    <w:lvl w:ilvl="2" w:tentative="1">
+        <w:rFonts w:hint="default" w:ascii="Courier New" w:hAnsi="Courier New"/>
+        <w:sz w:val="20"/>
+      </w:rPr>
+    </w:lvl>
+    <w:lvl w:ilvl="2" w:tentative="0">
       <w:start w:val="1"/>
       <w:numFmt w:val="bullet"/>
       <w:lvlText w:val=""/>
       <w:lvlJc w:val="left"/>
       <w:pPr>
         <w:tabs>
-          <w:tab w:val="num" w:pos="2160"/>
+          <w:tab w:val="left" w:pos="2160"/>
         </w:tabs>
         <w:ind w:left="2160" w:hanging="360"/>
       </w:pPr>
       <w:rPr>
-        <w:rFonts w:ascii="Wingdings" w:hAnsi="Wingdings" w:hint="default"/>
-        <w:sz w:val="20"/>
-      </w:rPr>
-    </w:lvl>
-    <w:lvl w:ilvl="3" w:tentative="1">
+        <w:rFonts w:hint="default" w:ascii="Wingdings" w:hAnsi="Wingdings"/>
+        <w:sz w:val="20"/>
+      </w:rPr>
+    </w:lvl>
+    <w:lvl w:ilvl="3" w:tentative="0">
       <w:start w:val="1"/>
       <w:numFmt w:val="bullet"/>
       <w:lvlText w:val=""/>
       <w:lvlJc w:val="left"/>
       <w:pPr>
         <w:tabs>
-          <w:tab w:val="num" w:pos="2880"/>
+          <w:tab w:val="left" w:pos="2880"/>
         </w:tabs>
         <w:ind w:left="2880" w:hanging="360"/>
       </w:pPr>
       <w:rPr>
-        <w:rFonts w:ascii="Wingdings" w:hAnsi="Wingdings" w:hint="default"/>
-        <w:sz w:val="20"/>
-      </w:rPr>
-    </w:lvl>
-    <w:lvl w:ilvl="4" w:tentative="1">
+        <w:rFonts w:hint="default" w:ascii="Wingdings" w:hAnsi="Wingdings"/>
+        <w:sz w:val="20"/>
+      </w:rPr>
+    </w:lvl>
+    <w:lvl w:ilvl="4" w:tentative="0">
       <w:start w:val="1"/>
       <w:numFmt w:val="bullet"/>
       <w:lvlText w:val=""/>
       <w:lvlJc w:val="left"/>
       <w:pPr>
         <w:tabs>
-          <w:tab w:val="num" w:pos="3600"/>
+          <w:tab w:val="left" w:pos="3600"/>
         </w:tabs>
         <w:ind w:left="3600" w:hanging="360"/>
       </w:pPr>
       <w:rPr>
-        <w:rFonts w:ascii="Wingdings" w:hAnsi="Wingdings" w:hint="default"/>
-        <w:sz w:val="20"/>
-      </w:rPr>
-    </w:lvl>
-    <w:lvl w:ilvl="5" w:tentative="1">
+        <w:rFonts w:hint="default" w:ascii="Wingdings" w:hAnsi="Wingdings"/>
+        <w:sz w:val="20"/>
+      </w:rPr>
+    </w:lvl>
+    <w:lvl w:ilvl="5" w:tentative="0">
       <w:start w:val="1"/>
       <w:numFmt w:val="bullet"/>
       <w:lvlText w:val=""/>
       <w:lvlJc w:val="left"/>
       <w:pPr>
         <w:tabs>
-          <w:tab w:val="num" w:pos="4320"/>
+          <w:tab w:val="left" w:pos="4320"/>
         </w:tabs>
         <w:ind w:left="4320" w:hanging="360"/>
       </w:pPr>
       <w:rPr>
-        <w:rFonts w:ascii="Wingdings" w:hAnsi="Wingdings" w:hint="default"/>
-        <w:sz w:val="20"/>
-      </w:rPr>
-    </w:lvl>
-    <w:lvl w:ilvl="6" w:tentative="1">
+        <w:rFonts w:hint="default" w:ascii="Wingdings" w:hAnsi="Wingdings"/>
+        <w:sz w:val="20"/>
+      </w:rPr>
+    </w:lvl>
+    <w:lvl w:ilvl="6" w:tentative="0">
       <w:start w:val="1"/>
       <w:numFmt w:val="bullet"/>
       <w:lvlText w:val=""/>
       <w:lvlJc w:val="left"/>
       <w:pPr>
         <w:tabs>
-          <w:tab w:val="num" w:pos="5040"/>
+          <w:tab w:val="left" w:pos="5040"/>
         </w:tabs>
         <w:ind w:left="5040" w:hanging="360"/>
       </w:pPr>
       <w:rPr>
-        <w:rFonts w:ascii="Wingdings" w:hAnsi="Wingdings" w:hint="default"/>
-        <w:sz w:val="20"/>
-      </w:rPr>
-    </w:lvl>
-    <w:lvl w:ilvl="7" w:tentative="1">
+        <w:rFonts w:hint="default" w:ascii="Wingdings" w:hAnsi="Wingdings"/>
+        <w:sz w:val="20"/>
+      </w:rPr>
+    </w:lvl>
+    <w:lvl w:ilvl="7" w:tentative="0">
       <w:start w:val="1"/>
       <w:numFmt w:val="bullet"/>
       <w:lvlText w:val=""/>
       <w:lvlJc w:val="left"/>
       <w:pPr>
         <w:tabs>
-          <w:tab w:val="num" w:pos="5760"/>
+          <w:tab w:val="left" w:pos="5760"/>
         </w:tabs>
         <w:ind w:left="5760" w:hanging="360"/>
       </w:pPr>
       <w:rPr>
-        <w:rFonts w:ascii="Wingdings" w:hAnsi="Wingdings" w:hint="default"/>
-        <w:sz w:val="20"/>
-      </w:rPr>
-    </w:lvl>
-    <w:lvl w:ilvl="8" w:tentative="1">
+        <w:rFonts w:hint="default" w:ascii="Wingdings" w:hAnsi="Wingdings"/>
+        <w:sz w:val="20"/>
+      </w:rPr>
+    </w:lvl>
+    <w:lvl w:ilvl="8" w:tentative="0">
       <w:start w:val="1"/>
       <w:numFmt w:val="bullet"/>
       <w:lvlText w:val=""/>
       <w:lvlJc w:val="left"/>
       <w:pPr>
         <w:tabs>
-          <w:tab w:val="num" w:pos="6480"/>
+          <w:tab w:val="left" w:pos="6480"/>
         </w:tabs>
         <w:ind w:left="6480" w:hanging="360"/>
       </w:pPr>
       <w:rPr>
-        <w:rFonts w:ascii="Wingdings" w:hAnsi="Wingdings" w:hint="default"/>
+        <w:rFonts w:hint="default" w:ascii="Wingdings" w:hAnsi="Wingdings"/>
         <w:sz w:val="20"/>
       </w:rPr>
     </w:lvl>
   </w:abstractNum>
-  <w:abstractNum w:abstractNumId="1" w15:restartNumberingAfterBreak="0">
+  <w:abstractNum w:abstractNumId="1">
     <w:nsid w:val="0C4F56F7"/>
     <w:multiLevelType w:val="multilevel"/>
-    <w:tmpl w:val="225A3D54"/>
-    <w:lvl w:ilvl="0">
+    <w:tmpl w:val="0C4F56F7"/>
+    <w:lvl w:ilvl="0" w:tentative="0">
       <w:start w:val="1"/>
       <w:numFmt w:val="bullet"/>
       <w:lvlText w:val=""/>
       <w:lvlJc w:val="left"/>
       <w:pPr>
         <w:tabs>
-          <w:tab w:val="num" w:pos="720"/>
+          <w:tab w:val="left" w:pos="720"/>
         </w:tabs>
         <w:ind w:left="720" w:hanging="360"/>
       </w:pPr>
       <w:rPr>
-        <w:rFonts w:ascii="Symbol" w:hAnsi="Symbol" w:hint="default"/>
-        <w:sz w:val="20"/>
-      </w:rPr>
-    </w:lvl>
-    <w:lvl w:ilvl="1" w:tentative="1">
+        <w:rFonts w:hint="default" w:ascii="Symbol" w:hAnsi="Symbol"/>
+        <w:sz w:val="20"/>
+      </w:rPr>
+    </w:lvl>
+    <w:lvl w:ilvl="1" w:tentative="0">
       <w:start w:val="1"/>
       <w:numFmt w:val="bullet"/>
       <w:lvlText w:val="o"/>
       <w:lvlJc w:val="left"/>
       <w:pPr>
         <w:tabs>
-          <w:tab w:val="num" w:pos="1440"/>
+          <w:tab w:val="left" w:pos="1440"/>
         </w:tabs>
         <w:ind w:left="1440" w:hanging="360"/>
       </w:pPr>
       <w:rPr>
-        <w:rFonts w:ascii="Courier New" w:hAnsi="Courier New" w:hint="default"/>
-        <w:sz w:val="20"/>
-      </w:rPr>
-    </w:lvl>
-    <w:lvl w:ilvl="2" w:tentative="1">
+        <w:rFonts w:hint="default" w:ascii="Courier New" w:hAnsi="Courier New"/>
+        <w:sz w:val="20"/>
+      </w:rPr>
+    </w:lvl>
+    <w:lvl w:ilvl="2" w:tentative="0">
       <w:start w:val="1"/>
       <w:numFmt w:val="bullet"/>
       <w:lvlText w:val=""/>
       <w:lvlJc w:val="left"/>
       <w:pPr>
         <w:tabs>
-          <w:tab w:val="num" w:pos="2160"/>
+          <w:tab w:val="left" w:pos="2160"/>
         </w:tabs>
         <w:ind w:left="2160" w:hanging="360"/>
       </w:pPr>
       <w:rPr>
-        <w:rFonts w:ascii="Wingdings" w:hAnsi="Wingdings" w:hint="default"/>
-        <w:sz w:val="20"/>
-      </w:rPr>
-    </w:lvl>
-    <w:lvl w:ilvl="3" w:tentative="1">
+        <w:rFonts w:hint="default" w:ascii="Wingdings" w:hAnsi="Wingdings"/>
+        <w:sz w:val="20"/>
+      </w:rPr>
+    </w:lvl>
+    <w:lvl w:ilvl="3" w:tentative="0">
       <w:start w:val="1"/>
       <w:numFmt w:val="bullet"/>
       <w:lvlText w:val=""/>
       <w:lvlJc w:val="left"/>
       <w:pPr>
         <w:tabs>
-          <w:tab w:val="num" w:pos="2880"/>
+          <w:tab w:val="left" w:pos="2880"/>
         </w:tabs>
         <w:ind w:left="2880" w:hanging="360"/>
       </w:pPr>
       <w:rPr>
-        <w:rFonts w:ascii="Wingdings" w:hAnsi="Wingdings" w:hint="default"/>
-        <w:sz w:val="20"/>
-      </w:rPr>
-    </w:lvl>
-    <w:lvl w:ilvl="4" w:tentative="1">
+        <w:rFonts w:hint="default" w:ascii="Wingdings" w:hAnsi="Wingdings"/>
+        <w:sz w:val="20"/>
+      </w:rPr>
+    </w:lvl>
+    <w:lvl w:ilvl="4" w:tentative="0">
       <w:start w:val="1"/>
       <w:numFmt w:val="bullet"/>
       <w:lvlText w:val=""/>
       <w:lvlJc w:val="left"/>
       <w:pPr>
         <w:tabs>
-          <w:tab w:val="num" w:pos="3600"/>
+          <w:tab w:val="left" w:pos="3600"/>
         </w:tabs>
         <w:ind w:left="3600" w:hanging="360"/>
       </w:pPr>
       <w:rPr>
-        <w:rFonts w:ascii="Wingdings" w:hAnsi="Wingdings" w:hint="default"/>
-        <w:sz w:val="20"/>
-      </w:rPr>
-    </w:lvl>
-    <w:lvl w:ilvl="5" w:tentative="1">
+        <w:rFonts w:hint="default" w:ascii="Wingdings" w:hAnsi="Wingdings"/>
+        <w:sz w:val="20"/>
+      </w:rPr>
+    </w:lvl>
+    <w:lvl w:ilvl="5" w:tentative="0">
       <w:start w:val="1"/>
       <w:numFmt w:val="bullet"/>
       <w:lvlText w:val=""/>
       <w:lvlJc w:val="left"/>
       <w:pPr>
         <w:tabs>
-          <w:tab w:val="num" w:pos="4320"/>
+          <w:tab w:val="left" w:pos="4320"/>
         </w:tabs>
         <w:ind w:left="4320" w:hanging="360"/>
       </w:pPr>
       <w:rPr>
-        <w:rFonts w:ascii="Wingdings" w:hAnsi="Wingdings" w:hint="default"/>
-        <w:sz w:val="20"/>
-      </w:rPr>
-    </w:lvl>
-    <w:lvl w:ilvl="6" w:tentative="1">
+        <w:rFonts w:hint="default" w:ascii="Wingdings" w:hAnsi="Wingdings"/>
+        <w:sz w:val="20"/>
+      </w:rPr>
+    </w:lvl>
+    <w:lvl w:ilvl="6" w:tentative="0">
       <w:start w:val="1"/>
       <w:numFmt w:val="bullet"/>
       <w:lvlText w:val=""/>
       <w:lvlJc w:val="left"/>
       <w:pPr>
         <w:tabs>
-          <w:tab w:val="num" w:pos="5040"/>
+          <w:tab w:val="left" w:pos="5040"/>
         </w:tabs>
         <w:ind w:left="5040" w:hanging="360"/>
       </w:pPr>
       <w:rPr>
-        <w:rFonts w:ascii="Wingdings" w:hAnsi="Wingdings" w:hint="default"/>
-        <w:sz w:val="20"/>
-      </w:rPr>
-    </w:lvl>
-    <w:lvl w:ilvl="7" w:tentative="1">
+        <w:rFonts w:hint="default" w:ascii="Wingdings" w:hAnsi="Wingdings"/>
+        <w:sz w:val="20"/>
+      </w:rPr>
+    </w:lvl>
+    <w:lvl w:ilvl="7" w:tentative="0">
       <w:start w:val="1"/>
       <w:numFmt w:val="bullet"/>
       <w:lvlText w:val=""/>
       <w:lvlJc w:val="left"/>
       <w:pPr>
         <w:tabs>
-          <w:tab w:val="num" w:pos="5760"/>
+          <w:tab w:val="left" w:pos="5760"/>
         </w:tabs>
         <w:ind w:left="5760" w:hanging="360"/>
       </w:pPr>
       <w:rPr>
-        <w:rFonts w:ascii="Wingdings" w:hAnsi="Wingdings" w:hint="default"/>
-        <w:sz w:val="20"/>
-      </w:rPr>
-    </w:lvl>
-    <w:lvl w:ilvl="8" w:tentative="1">
+        <w:rFonts w:hint="default" w:ascii="Wingdings" w:hAnsi="Wingdings"/>
+        <w:sz w:val="20"/>
+      </w:rPr>
+    </w:lvl>
+    <w:lvl w:ilvl="8" w:tentative="0">
       <w:start w:val="1"/>
       <w:numFmt w:val="bullet"/>
       <w:lvlText w:val=""/>
       <w:lvlJc w:val="left"/>
       <w:pPr>
         <w:tabs>
-          <w:tab w:val="num" w:pos="6480"/>
+          <w:tab w:val="left" w:pos="6480"/>
         </w:tabs>
         <w:ind w:left="6480" w:hanging="360"/>
       </w:pPr>
       <w:rPr>
-        <w:rFonts w:ascii="Wingdings" w:hAnsi="Wingdings" w:hint="default"/>
+        <w:rFonts w:hint="default" w:ascii="Wingdings" w:hAnsi="Wingdings"/>
         <w:sz w:val="20"/>
       </w:rPr>
     </w:lvl>
   </w:abstractNum>
-  <w:abstractNum w:abstractNumId="2" w15:restartNumberingAfterBreak="0">
+  <w:abstractNum w:abstractNumId="2">
     <w:nsid w:val="17A12E38"/>
     <w:multiLevelType w:val="multilevel"/>
-    <w:tmpl w:val="9D903250"/>
-    <w:lvl w:ilvl="0">
+    <w:tmpl w:val="17A12E38"/>
+    <w:lvl w:ilvl="0" w:tentative="0">
       <w:start w:val="1"/>
       <w:numFmt w:val="bullet"/>
       <w:lvlText w:val=""/>
       <w:lvlJc w:val="left"/>
       <w:pPr>
         <w:tabs>
-          <w:tab w:val="num" w:pos="720"/>
+          <w:tab w:val="left" w:pos="720"/>
         </w:tabs>
         <w:ind w:left="720" w:hanging="360"/>
       </w:pPr>
       <w:rPr>
-        <w:rFonts w:ascii="Symbol" w:hAnsi="Symbol" w:hint="default"/>
-        <w:sz w:val="20"/>
-      </w:rPr>
-    </w:lvl>
-    <w:lvl w:ilvl="1">
+        <w:rFonts w:hint="default" w:ascii="Symbol" w:hAnsi="Symbol"/>
+        <w:sz w:val="20"/>
+      </w:rPr>
+    </w:lvl>
+    <w:lvl w:ilvl="1" w:tentative="0">
       <w:start w:val="1"/>
       <w:numFmt w:val="bullet"/>
       <w:lvlText w:val="o"/>
       <w:lvlJc w:val="left"/>
       <w:pPr>
         <w:tabs>
-          <w:tab w:val="num" w:pos="1440"/>
+          <w:tab w:val="left" w:pos="1440"/>
         </w:tabs>
         <w:ind w:left="1440" w:hanging="360"/>
       </w:pPr>
       <w:rPr>
-        <w:rFonts w:ascii="Courier New" w:hAnsi="Courier New" w:hint="default"/>
-        <w:sz w:val="20"/>
-      </w:rPr>
-    </w:lvl>
-    <w:lvl w:ilvl="2" w:tentative="1">
+        <w:rFonts w:hint="default" w:ascii="Courier New" w:hAnsi="Courier New"/>
+        <w:sz w:val="20"/>
+      </w:rPr>
+    </w:lvl>
+    <w:lvl w:ilvl="2" w:tentative="0">
       <w:start w:val="1"/>
       <w:numFmt w:val="bullet"/>
       <w:lvlText w:val=""/>
       <w:lvlJc w:val="left"/>
       <w:pPr>
         <w:tabs>
-          <w:tab w:val="num" w:pos="2160"/>
+          <w:tab w:val="left" w:pos="2160"/>
         </w:tabs>
         <w:ind w:left="2160" w:hanging="360"/>
       </w:pPr>
       <w:rPr>
-        <w:rFonts w:ascii="Wingdings" w:hAnsi="Wingdings" w:hint="default"/>
-        <w:sz w:val="20"/>
-      </w:rPr>
-    </w:lvl>
-    <w:lvl w:ilvl="3" w:tentative="1">
+        <w:rFonts w:hint="default" w:ascii="Wingdings" w:hAnsi="Wingdings"/>
+        <w:sz w:val="20"/>
+      </w:rPr>
+    </w:lvl>
+    <w:lvl w:ilvl="3" w:tentative="0">
       <w:start w:val="1"/>
       <w:numFmt w:val="bullet"/>
       <w:lvlText w:val=""/>
       <w:lvlJc w:val="left"/>
       <w:pPr>
         <w:tabs>
-          <w:tab w:val="num" w:pos="2880"/>
+          <w:tab w:val="left" w:pos="2880"/>
         </w:tabs>
         <w:ind w:left="2880" w:hanging="360"/>
       </w:pPr>
       <w:rPr>
-        <w:rFonts w:ascii="Wingdings" w:hAnsi="Wingdings" w:hint="default"/>
-        <w:sz w:val="20"/>
-      </w:rPr>
-    </w:lvl>
-    <w:lvl w:ilvl="4" w:tentative="1">
+        <w:rFonts w:hint="default" w:ascii="Wingdings" w:hAnsi="Wingdings"/>
+        <w:sz w:val="20"/>
+      </w:rPr>
+    </w:lvl>
+    <w:lvl w:ilvl="4" w:tentative="0">
       <w:start w:val="1"/>
       <w:numFmt w:val="bullet"/>
       <w:lvlText w:val=""/>
       <w:lvlJc w:val="left"/>
       <w:pPr>
         <w:tabs>
-          <w:tab w:val="num" w:pos="3600"/>
+          <w:tab w:val="left" w:pos="3600"/>
         </w:tabs>
         <w:ind w:left="3600" w:hanging="360"/>
       </w:pPr>
       <w:rPr>
-        <w:rFonts w:ascii="Wingdings" w:hAnsi="Wingdings" w:hint="default"/>
-        <w:sz w:val="20"/>
-      </w:rPr>
-    </w:lvl>
-    <w:lvl w:ilvl="5" w:tentative="1">
+        <w:rFonts w:hint="default" w:ascii="Wingdings" w:hAnsi="Wingdings"/>
+        <w:sz w:val="20"/>
+      </w:rPr>
+    </w:lvl>
+    <w:lvl w:ilvl="5" w:tentative="0">
       <w:start w:val="1"/>
       <w:numFmt w:val="bullet"/>
       <w:lvlText w:val=""/>
       <w:lvlJc w:val="left"/>
       <w:pPr>
         <w:tabs>
-          <w:tab w:val="num" w:pos="4320"/>
+          <w:tab w:val="left" w:pos="4320"/>
         </w:tabs>
         <w:ind w:left="4320" w:hanging="360"/>
       </w:pPr>
       <w:rPr>
-        <w:rFonts w:ascii="Wingdings" w:hAnsi="Wingdings" w:hint="default"/>
-        <w:sz w:val="20"/>
-      </w:rPr>
-    </w:lvl>
-    <w:lvl w:ilvl="6" w:tentative="1">
+        <w:rFonts w:hint="default" w:ascii="Wingdings" w:hAnsi="Wingdings"/>
+        <w:sz w:val="20"/>
+      </w:rPr>
+    </w:lvl>
+    <w:lvl w:ilvl="6" w:tentative="0">
       <w:start w:val="1"/>
       <w:numFmt w:val="bullet"/>
       <w:lvlText w:val=""/>
       <w:lvlJc w:val="left"/>
       <w:pPr>
         <w:tabs>
-          <w:tab w:val="num" w:pos="5040"/>
+          <w:tab w:val="left" w:pos="5040"/>
         </w:tabs>
         <w:ind w:left="5040" w:hanging="360"/>
       </w:pPr>
       <w:rPr>
-        <w:rFonts w:ascii="Wingdings" w:hAnsi="Wingdings" w:hint="default"/>
-        <w:sz w:val="20"/>
-      </w:rPr>
-    </w:lvl>
-    <w:lvl w:ilvl="7" w:tentative="1">
+        <w:rFonts w:hint="default" w:ascii="Wingdings" w:hAnsi="Wingdings"/>
+        <w:sz w:val="20"/>
+      </w:rPr>
+    </w:lvl>
+    <w:lvl w:ilvl="7" w:tentative="0">
       <w:start w:val="1"/>
       <w:numFmt w:val="bullet"/>
       <w:lvlText w:val=""/>
       <w:lvlJc w:val="left"/>
       <w:pPr>
         <w:tabs>
-          <w:tab w:val="num" w:pos="5760"/>
+          <w:tab w:val="left" w:pos="5760"/>
         </w:tabs>
         <w:ind w:left="5760" w:hanging="360"/>
       </w:pPr>
       <w:rPr>
-        <w:rFonts w:ascii="Wingdings" w:hAnsi="Wingdings" w:hint="default"/>
-        <w:sz w:val="20"/>
-      </w:rPr>
-    </w:lvl>
-    <w:lvl w:ilvl="8" w:tentative="1">
+        <w:rFonts w:hint="default" w:ascii="Wingdings" w:hAnsi="Wingdings"/>
+        <w:sz w:val="20"/>
+      </w:rPr>
+    </w:lvl>
+    <w:lvl w:ilvl="8" w:tentative="0">
       <w:start w:val="1"/>
       <w:numFmt w:val="bullet"/>
       <w:lvlText w:val=""/>
       <w:lvlJc w:val="left"/>
       <w:pPr>
         <w:tabs>
-          <w:tab w:val="num" w:pos="6480"/>
+          <w:tab w:val="left" w:pos="6480"/>
         </w:tabs>
         <w:ind w:left="6480" w:hanging="360"/>
       </w:pPr>
       <w:rPr>
-        <w:rFonts w:ascii="Wingdings" w:hAnsi="Wingdings" w:hint="default"/>
+        <w:rFonts w:hint="default" w:ascii="Wingdings" w:hAnsi="Wingdings"/>
         <w:sz w:val="20"/>
       </w:rPr>
     </w:lvl>
   </w:abstractNum>
-  <w:abstractNum w:abstractNumId="3" w15:restartNumberingAfterBreak="0">
+  <w:abstractNum w:abstractNumId="3">
     <w:nsid w:val="2EEA0E11"/>
     <w:multiLevelType w:val="multilevel"/>
-    <w:tmpl w:val="A3EC46DC"/>
-    <w:lvl w:ilvl="0">
+    <w:tmpl w:val="2EEA0E11"/>
+    <w:lvl w:ilvl="0" w:tentative="0">
       <w:start w:val="1"/>
       <w:numFmt w:val="bullet"/>
       <w:lvlText w:val=""/>
       <w:lvlJc w:val="left"/>
       <w:pPr>
         <w:tabs>
-          <w:tab w:val="num" w:pos="720"/>
+          <w:tab w:val="left" w:pos="720"/>
         </w:tabs>
         <w:ind w:left="720" w:hanging="360"/>
       </w:pPr>
       <w:rPr>
-        <w:rFonts w:ascii="Symbol" w:hAnsi="Symbol" w:hint="default"/>
-        <w:sz w:val="20"/>
-      </w:rPr>
-    </w:lvl>
-    <w:lvl w:ilvl="1" w:tentative="1">
+        <w:rFonts w:hint="default" w:ascii="Symbol" w:hAnsi="Symbol"/>
+        <w:sz w:val="20"/>
+      </w:rPr>
+    </w:lvl>
+    <w:lvl w:ilvl="1" w:tentative="0">
       <w:start w:val="1"/>
       <w:numFmt w:val="bullet"/>
       <w:lvlText w:val="o"/>
       <w:lvlJc w:val="left"/>
       <w:pPr>
         <w:tabs>
-          <w:tab w:val="num" w:pos="1440"/>
+          <w:tab w:val="left" w:pos="1440"/>
         </w:tabs>
         <w:ind w:left="1440" w:hanging="360"/>
       </w:pPr>
       <w:rPr>
-        <w:rFonts w:ascii="Courier New" w:hAnsi="Courier New" w:hint="default"/>
-        <w:sz w:val="20"/>
-      </w:rPr>
-    </w:lvl>
-    <w:lvl w:ilvl="2" w:tentative="1">
+        <w:rFonts w:hint="default" w:ascii="Courier New" w:hAnsi="Courier New"/>
+        <w:sz w:val="20"/>
+      </w:rPr>
+    </w:lvl>
+    <w:lvl w:ilvl="2" w:tentative="0">
       <w:start w:val="1"/>
       <w:numFmt w:val="bullet"/>
       <w:lvlText w:val=""/>
       <w:lvlJc w:val="left"/>
       <w:pPr>
         <w:tabs>
-          <w:tab w:val="num" w:pos="2160"/>
+          <w:tab w:val="left" w:pos="2160"/>
         </w:tabs>
         <w:ind w:left="2160" w:hanging="360"/>
       </w:pPr>
       <w:rPr>
-        <w:rFonts w:ascii="Wingdings" w:hAnsi="Wingdings" w:hint="default"/>
-        <w:sz w:val="20"/>
-      </w:rPr>
-    </w:lvl>
-    <w:lvl w:ilvl="3" w:tentative="1">
+        <w:rFonts w:hint="default" w:ascii="Wingdings" w:hAnsi="Wingdings"/>
+        <w:sz w:val="20"/>
+      </w:rPr>
+    </w:lvl>
+    <w:lvl w:ilvl="3" w:tentative="0">
       <w:start w:val="1"/>
       <w:numFmt w:val="bullet"/>
       <w:lvlText w:val=""/>
       <w:lvlJc w:val="left"/>
       <w:pPr>
         <w:tabs>
-          <w:tab w:val="num" w:pos="2880"/>
+          <w:tab w:val="left" w:pos="2880"/>
         </w:tabs>
         <w:ind w:left="2880" w:hanging="360"/>
       </w:pPr>
       <w:rPr>
-        <w:rFonts w:ascii="Wingdings" w:hAnsi="Wingdings" w:hint="default"/>
-        <w:sz w:val="20"/>
-      </w:rPr>
-    </w:lvl>
-    <w:lvl w:ilvl="4" w:tentative="1">
+        <w:rFonts w:hint="default" w:ascii="Wingdings" w:hAnsi="Wingdings"/>
+        <w:sz w:val="20"/>
+      </w:rPr>
+    </w:lvl>
+    <w:lvl w:ilvl="4" w:tentative="0">
       <w:start w:val="1"/>
       <w:numFmt w:val="bullet"/>
       <w:lvlText w:val=""/>
       <w:lvlJc w:val="left"/>
       <w:pPr>
         <w:tabs>
-          <w:tab w:val="num" w:pos="3600"/>
+          <w:tab w:val="left" w:pos="3600"/>
         </w:tabs>
         <w:ind w:left="3600" w:hanging="360"/>
       </w:pPr>
       <w:rPr>
-        <w:rFonts w:ascii="Wingdings" w:hAnsi="Wingdings" w:hint="default"/>
-        <w:sz w:val="20"/>
-      </w:rPr>
-    </w:lvl>
-    <w:lvl w:ilvl="5" w:tentative="1">
+        <w:rFonts w:hint="default" w:ascii="Wingdings" w:hAnsi="Wingdings"/>
+        <w:sz w:val="20"/>
+      </w:rPr>
+    </w:lvl>
+    <w:lvl w:ilvl="5" w:tentative="0">
       <w:start w:val="1"/>
       <w:numFmt w:val="bullet"/>
       <w:lvlText w:val=""/>
       <w:lvlJc w:val="left"/>
       <w:pPr>
         <w:tabs>
-          <w:tab w:val="num" w:pos="4320"/>
+          <w:tab w:val="left" w:pos="4320"/>
         </w:tabs>
         <w:ind w:left="4320" w:hanging="360"/>
       </w:pPr>
       <w:rPr>
-        <w:rFonts w:ascii="Wingdings" w:hAnsi="Wingdings" w:hint="default"/>
-        <w:sz w:val="20"/>
-      </w:rPr>
-    </w:lvl>
-    <w:lvl w:ilvl="6" w:tentative="1">
+        <w:rFonts w:hint="default" w:ascii="Wingdings" w:hAnsi="Wingdings"/>
+        <w:sz w:val="20"/>
+      </w:rPr>
+    </w:lvl>
+    <w:lvl w:ilvl="6" w:tentative="0">
       <w:start w:val="1"/>
       <w:numFmt w:val="bullet"/>
       <w:lvlText w:val=""/>
       <w:lvlJc w:val="left"/>
       <w:pPr>
         <w:tabs>
-          <w:tab w:val="num" w:pos="5040"/>
+          <w:tab w:val="left" w:pos="5040"/>
         </w:tabs>
         <w:ind w:left="5040" w:hanging="360"/>
       </w:pPr>
       <w:rPr>
-        <w:rFonts w:ascii="Wingdings" w:hAnsi="Wingdings" w:hint="default"/>
-        <w:sz w:val="20"/>
-      </w:rPr>
-    </w:lvl>
-    <w:lvl w:ilvl="7" w:tentative="1">
+        <w:rFonts w:hint="default" w:ascii="Wingdings" w:hAnsi="Wingdings"/>
+        <w:sz w:val="20"/>
+      </w:rPr>
+    </w:lvl>
+    <w:lvl w:ilvl="7" w:tentative="0">
       <w:start w:val="1"/>
       <w:numFmt w:val="bullet"/>
       <w:lvlText w:val=""/>
       <w:lvlJc w:val="left"/>
       <w:pPr>
         <w:tabs>
-          <w:tab w:val="num" w:pos="5760"/>
+          <w:tab w:val="left" w:pos="5760"/>
         </w:tabs>
         <w:ind w:left="5760" w:hanging="360"/>
       </w:pPr>
       <w:rPr>
-        <w:rFonts w:ascii="Wingdings" w:hAnsi="Wingdings" w:hint="default"/>
-        <w:sz w:val="20"/>
-      </w:rPr>
-    </w:lvl>
-    <w:lvl w:ilvl="8" w:tentative="1">
+        <w:rFonts w:hint="default" w:ascii="Wingdings" w:hAnsi="Wingdings"/>
+        <w:sz w:val="20"/>
+      </w:rPr>
+    </w:lvl>
+    <w:lvl w:ilvl="8" w:tentative="0">
       <w:start w:val="1"/>
       <w:numFmt w:val="bullet"/>
       <w:lvlText w:val=""/>
       <w:lvlJc w:val="left"/>
       <w:pPr>
         <w:tabs>
-          <w:tab w:val="num" w:pos="6480"/>
+          <w:tab w:val="left" w:pos="6480"/>
         </w:tabs>
         <w:ind w:left="6480" w:hanging="360"/>
       </w:pPr>
       <w:rPr>
-        <w:rFonts w:ascii="Wingdings" w:hAnsi="Wingdings" w:hint="default"/>
+        <w:rFonts w:hint="default" w:ascii="Wingdings" w:hAnsi="Wingdings"/>
         <w:sz w:val="20"/>
       </w:rPr>
     </w:lvl>
   </w:abstractNum>
-  <w:abstractNum w:abstractNumId="4" w15:restartNumberingAfterBreak="0">
+  <w:abstractNum w:abstractNumId="4">
     <w:nsid w:val="4AD100B0"/>
     <w:multiLevelType w:val="multilevel"/>
-    <w:tmpl w:val="F6D6F878"/>
-    <w:lvl w:ilvl="0">
+    <w:tmpl w:val="4AD100B0"/>
+    <w:lvl w:ilvl="0" w:tentative="0">
       <w:start w:val="1"/>
       <w:numFmt w:val="bullet"/>
       <w:lvlText w:val=""/>
       <w:lvlJc w:val="left"/>
       <w:pPr>
         <w:tabs>
-          <w:tab w:val="num" w:pos="720"/>
+          <w:tab w:val="left" w:pos="720"/>
         </w:tabs>
         <w:ind w:left="720" w:hanging="360"/>
       </w:pPr>
       <w:rPr>
-        <w:rFonts w:ascii="Symbol" w:hAnsi="Symbol" w:hint="default"/>
-        <w:sz w:val="20"/>
-      </w:rPr>
-    </w:lvl>
-    <w:lvl w:ilvl="1" w:tentative="1">
+        <w:rFonts w:hint="default" w:ascii="Symbol" w:hAnsi="Symbol"/>
+        <w:sz w:val="20"/>
+      </w:rPr>
+    </w:lvl>
+    <w:lvl w:ilvl="1" w:tentative="0">
       <w:start w:val="1"/>
       <w:numFmt w:val="bullet"/>
       <w:lvlText w:val="o"/>
       <w:lvlJc w:val="left"/>
       <w:pPr>
         <w:tabs>
-          <w:tab w:val="num" w:pos="1440"/>
+          <w:tab w:val="left" w:pos="1440"/>
         </w:tabs>
         <w:ind w:left="1440" w:hanging="360"/>
       </w:pPr>
       <w:rPr>
-        <w:rFonts w:ascii="Courier New" w:hAnsi="Courier New" w:hint="default"/>
-        <w:sz w:val="20"/>
-      </w:rPr>
-    </w:lvl>
-    <w:lvl w:ilvl="2" w:tentative="1">
+        <w:rFonts w:hint="default" w:ascii="Courier New" w:hAnsi="Courier New"/>
+        <w:sz w:val="20"/>
+      </w:rPr>
+    </w:lvl>
+    <w:lvl w:ilvl="2" w:tentative="0">
       <w:start w:val="1"/>
       <w:numFmt w:val="bullet"/>
       <w:lvlText w:val=""/>
       <w:lvlJc w:val="left"/>
       <w:pPr>
         <w:tabs>
-          <w:tab w:val="num" w:pos="2160"/>
+          <w:tab w:val="left" w:pos="2160"/>
         </w:tabs>
         <w:ind w:left="2160" w:hanging="360"/>
       </w:pPr>
       <w:rPr>
-        <w:rFonts w:ascii="Wingdings" w:hAnsi="Wingdings" w:hint="default"/>
-        <w:sz w:val="20"/>
-      </w:rPr>
-    </w:lvl>
-    <w:lvl w:ilvl="3" w:tentative="1">
+        <w:rFonts w:hint="default" w:ascii="Wingdings" w:hAnsi="Wingdings"/>
+        <w:sz w:val="20"/>
+      </w:rPr>
+    </w:lvl>
+    <w:lvl w:ilvl="3" w:tentative="0">
       <w:start w:val="1"/>
       <w:numFmt w:val="bullet"/>
       <w:lvlText w:val=""/>
       <w:lvlJc w:val="left"/>
       <w:pPr>
         <w:tabs>
-          <w:tab w:val="num" w:pos="2880"/>
+          <w:tab w:val="left" w:pos="2880"/>
         </w:tabs>
         <w:ind w:left="2880" w:hanging="360"/>
       </w:pPr>
       <w:rPr>
-        <w:rFonts w:ascii="Wingdings" w:hAnsi="Wingdings" w:hint="default"/>
-        <w:sz w:val="20"/>
-      </w:rPr>
-    </w:lvl>
-    <w:lvl w:ilvl="4" w:tentative="1">
+        <w:rFonts w:hint="default" w:ascii="Wingdings" w:hAnsi="Wingdings"/>
+        <w:sz w:val="20"/>
+      </w:rPr>
+    </w:lvl>
+    <w:lvl w:ilvl="4" w:tentative="0">
       <w:start w:val="1"/>
       <w:numFmt w:val="bullet"/>
       <w:lvlText w:val=""/>
       <w:lvlJc w:val="left"/>
       <w:pPr>
         <w:tabs>
-          <w:tab w:val="num" w:pos="3600"/>
+          <w:tab w:val="left" w:pos="3600"/>
         </w:tabs>
         <w:ind w:left="3600" w:hanging="360"/>
       </w:pPr>
       <w:rPr>
-        <w:rFonts w:ascii="Wingdings" w:hAnsi="Wingdings" w:hint="default"/>
-        <w:sz w:val="20"/>
-      </w:rPr>
-    </w:lvl>
-    <w:lvl w:ilvl="5" w:tentative="1">
+        <w:rFonts w:hint="default" w:ascii="Wingdings" w:hAnsi="Wingdings"/>
+        <w:sz w:val="20"/>
+      </w:rPr>
+    </w:lvl>
+    <w:lvl w:ilvl="5" w:tentative="0">
       <w:start w:val="1"/>
       <w:numFmt w:val="bullet"/>
       <w:lvlText w:val=""/>
       <w:lvlJc w:val="left"/>
       <w:pPr>
         <w:tabs>
-          <w:tab w:val="num" w:pos="4320"/>
+          <w:tab w:val="left" w:pos="4320"/>
         </w:tabs>
         <w:ind w:left="4320" w:hanging="360"/>
       </w:pPr>
       <w:rPr>
-        <w:rFonts w:ascii="Wingdings" w:hAnsi="Wingdings" w:hint="default"/>
-        <w:sz w:val="20"/>
-      </w:rPr>
-    </w:lvl>
-    <w:lvl w:ilvl="6" w:tentative="1">
+        <w:rFonts w:hint="default" w:ascii="Wingdings" w:hAnsi="Wingdings"/>
+        <w:sz w:val="20"/>
+      </w:rPr>
+    </w:lvl>
+    <w:lvl w:ilvl="6" w:tentative="0">
       <w:start w:val="1"/>
       <w:numFmt w:val="bullet"/>
       <w:lvlText w:val=""/>
       <w:lvlJc w:val="left"/>
       <w:pPr>
         <w:tabs>
-          <w:tab w:val="num" w:pos="5040"/>
+          <w:tab w:val="left" w:pos="5040"/>
         </w:tabs>
         <w:ind w:left="5040" w:hanging="360"/>
       </w:pPr>
       <w:rPr>
-        <w:rFonts w:ascii="Wingdings" w:hAnsi="Wingdings" w:hint="default"/>
-        <w:sz w:val="20"/>
-      </w:rPr>
-    </w:lvl>
-    <w:lvl w:ilvl="7" w:tentative="1">
+        <w:rFonts w:hint="default" w:ascii="Wingdings" w:hAnsi="Wingdings"/>
+        <w:sz w:val="20"/>
+      </w:rPr>
+    </w:lvl>
+    <w:lvl w:ilvl="7" w:tentative="0">
       <w:start w:val="1"/>
       <w:numFmt w:val="bullet"/>
       <w:lvlText w:val=""/>
       <w:lvlJc w:val="left"/>
       <w:pPr>
         <w:tabs>
-          <w:tab w:val="num" w:pos="5760"/>
+          <w:tab w:val="left" w:pos="5760"/>
         </w:tabs>
         <w:ind w:left="5760" w:hanging="360"/>
       </w:pPr>
       <w:rPr>
-        <w:rFonts w:ascii="Wingdings" w:hAnsi="Wingdings" w:hint="default"/>
-        <w:sz w:val="20"/>
-      </w:rPr>
-    </w:lvl>
-    <w:lvl w:ilvl="8" w:tentative="1">
+        <w:rFonts w:hint="default" w:ascii="Wingdings" w:hAnsi="Wingdings"/>
+        <w:sz w:val="20"/>
+      </w:rPr>
+    </w:lvl>
+    <w:lvl w:ilvl="8" w:tentative="0">
       <w:start w:val="1"/>
       <w:numFmt w:val="bullet"/>
       <w:lvlText w:val=""/>
       <w:lvlJc w:val="left"/>
       <w:pPr>
         <w:tabs>
-          <w:tab w:val="num" w:pos="6480"/>
+          <w:tab w:val="left" w:pos="6480"/>
         </w:tabs>
         <w:ind w:left="6480" w:hanging="360"/>
       </w:pPr>
       <w:rPr>
-        <w:rFonts w:ascii="Wingdings" w:hAnsi="Wingdings" w:hint="default"/>
+        <w:rFonts w:hint="default" w:ascii="Wingdings" w:hAnsi="Wingdings"/>
         <w:sz w:val="20"/>
       </w:rPr>
     </w:lvl>
   </w:abstractNum>
-  <w:abstractNum w:abstractNumId="5" w15:restartNumberingAfterBreak="0">
-    <w:nsid w:val="5C31090A"/>
-    <w:multiLevelType w:val="multilevel"/>
-    <w:tmpl w:val="E6F27904"/>
-    <w:lvl w:ilvl="0">
-      <w:start w:val="1"/>
-      <w:numFmt w:val="bullet"/>
-      <w:lvlText w:val=""/>
-      <w:lvlJc w:val="left"/>
-      <w:pPr>
-        <w:tabs>
-          <w:tab w:val="num" w:pos="720"/>
-        </w:tabs>
-        <w:ind w:left="720" w:hanging="360"/>
-      </w:pPr>
-      <w:rPr>
-        <w:rFonts w:ascii="Symbol" w:hAnsi="Symbol" w:hint="default"/>
-        <w:sz w:val="20"/>
-      </w:rPr>
-    </w:lvl>
-    <w:lvl w:ilvl="1" w:tentative="1">
-      <w:start w:val="1"/>
-      <w:numFmt w:val="bullet"/>
-      <w:lvlText w:val="o"/>
-      <w:lvlJc w:val="left"/>
-      <w:pPr>
-        <w:tabs>
-          <w:tab w:val="num" w:pos="1440"/>
-        </w:tabs>
-        <w:ind w:left="1440" w:hanging="360"/>
-      </w:pPr>
-      <w:rPr>
-        <w:rFonts w:ascii="Courier New" w:hAnsi="Courier New" w:hint="default"/>
-        <w:sz w:val="20"/>
-      </w:rPr>
-    </w:lvl>
-    <w:lvl w:ilvl="2" w:tentative="1">
-      <w:start w:val="1"/>
-      <w:numFmt w:val="bullet"/>
-      <w:lvlText w:val=""/>
-      <w:lvlJc w:val="left"/>
-      <w:pPr>
-        <w:tabs>
-          <w:tab w:val="num" w:pos="2160"/>
-        </w:tabs>
-        <w:ind w:left="2160" w:hanging="360"/>
-      </w:pPr>
-      <w:rPr>
-        <w:rFonts w:ascii="Wingdings" w:hAnsi="Wingdings" w:hint="default"/>
-        <w:sz w:val="20"/>
-      </w:rPr>
-    </w:lvl>
-    <w:lvl w:ilvl="3" w:tentative="1">
-      <w:start w:val="1"/>
-      <w:numFmt w:val="bullet"/>
-      <w:lvlText w:val=""/>
-      <w:lvlJc w:val="left"/>
-      <w:pPr>
-        <w:tabs>
-          <w:tab w:val="num" w:pos="2880"/>
-        </w:tabs>
-        <w:ind w:left="2880" w:hanging="360"/>
-      </w:pPr>
-      <w:rPr>
-        <w:rFonts w:ascii="Wingdings" w:hAnsi="Wingdings" w:hint="default"/>
-        <w:sz w:val="20"/>
-      </w:rPr>
-    </w:lvl>
-    <w:lvl w:ilvl="4" w:tentative="1">
-      <w:start w:val="1"/>
-      <w:numFmt w:val="bullet"/>
-      <w:lvlText w:val=""/>
-      <w:lvlJc w:val="left"/>
-      <w:pPr>
-        <w:tabs>
-          <w:tab w:val="num" w:pos="3600"/>
-        </w:tabs>
-        <w:ind w:left="3600" w:hanging="360"/>
-      </w:pPr>
-      <w:rPr>
-        <w:rFonts w:ascii="Wingdings" w:hAnsi="Wingdings" w:hint="default"/>
-        <w:sz w:val="20"/>
-      </w:rPr>
-    </w:lvl>
-    <w:lvl w:ilvl="5" w:tentative="1">
-      <w:start w:val="1"/>
-      <w:numFmt w:val="bullet"/>
-      <w:lvlText w:val=""/>
-      <w:lvlJc w:val="left"/>
-      <w:pPr>
-        <w:tabs>
-          <w:tab w:val="num" w:pos="4320"/>
-        </w:tabs>
-        <w:ind w:left="4320" w:hanging="360"/>
-      </w:pPr>
-      <w:rPr>
-        <w:rFonts w:ascii="Wingdings" w:hAnsi="Wingdings" w:hint="default"/>
-        <w:sz w:val="20"/>
-      </w:rPr>
-    </w:lvl>
-    <w:lvl w:ilvl="6" w:tentative="1">
-      <w:start w:val="1"/>
-      <w:numFmt w:val="bullet"/>
-      <w:lvlText w:val=""/>
-      <w:lvlJc w:val="left"/>
-      <w:pPr>
-        <w:tabs>
-          <w:tab w:val="num" w:pos="5040"/>
-        </w:tabs>
-        <w:ind w:left="5040" w:hanging="360"/>
-      </w:pPr>
-      <w:rPr>
-        <w:rFonts w:ascii="Wingdings" w:hAnsi="Wingdings" w:hint="default"/>
-        <w:sz w:val="20"/>
-      </w:rPr>
-    </w:lvl>
-    <w:lvl w:ilvl="7" w:tentative="1">
-      <w:start w:val="1"/>
-      <w:numFmt w:val="bullet"/>
-      <w:lvlText w:val=""/>
-      <w:lvlJc w:val="left"/>
-      <w:pPr>
-        <w:tabs>
-          <w:tab w:val="num" w:pos="5760"/>
-        </w:tabs>
-        <w:ind w:left="5760" w:hanging="360"/>
-      </w:pPr>
-      <w:rPr>
-        <w:rFonts w:ascii="Wingdings" w:hAnsi="Wingdings" w:hint="default"/>
-        <w:sz w:val="20"/>
-      </w:rPr>
-    </w:lvl>
-    <w:lvl w:ilvl="8" w:tentative="1">
-      <w:start w:val="1"/>
-      <w:numFmt w:val="bullet"/>
-      <w:lvlText w:val=""/>
-      <w:lvlJc w:val="left"/>
-      <w:pPr>
-        <w:tabs>
-          <w:tab w:val="num" w:pos="6480"/>
-        </w:tabs>
-        <w:ind w:left="6480" w:hanging="360"/>
-      </w:pPr>
-      <w:rPr>
-        <w:rFonts w:ascii="Wingdings" w:hAnsi="Wingdings" w:hint="default"/>
-        <w:sz w:val="20"/>
-      </w:rPr>
-    </w:lvl>
-  </w:abstractNum>
-  <w:num w:numId="1" w16cid:durableId="1865248106">
+  <w:num w:numId="1">
     <w:abstractNumId w:val="3"/>
   </w:num>
-  <w:num w:numId="2" w16cid:durableId="1274361923">
+  <w:num w:numId="2">
     <w:abstractNumId w:val="4"/>
   </w:num>
-  <w:num w:numId="3" w16cid:durableId="1173690522">
+  <w:num w:numId="3">
     <w:abstractNumId w:val="2"/>
   </w:num>
-  <w:num w:numId="4" w16cid:durableId="151607688">
+  <w:num w:numId="4">
     <w:abstractNumId w:val="1"/>
   </w:num>
-  <w:num w:numId="5" w16cid:durableId="1381131372">
+  <w:num w:numId="5">
     <w:abstractNumId w:val="0"/>
-  </w:num>
-  <w:num w:numId="6" w16cid:durableId="340206129">
-    <w:abstractNumId w:val="5"/>
   </w:num>
 </w:numbering>
 </file>
 
 <file path=word/styles.xml><?xml version="1.0" encoding="utf-8"?>
-<w:styles xmlns:mc="http://schemas.openxmlformats.org/markup-compatibility/2006" xmlns:r="http://schemas.openxmlformats.org/officeDocument/2006/relationships" xmlns:w="http://schemas.openxmlformats.org/wordprocessingml/2006/main" xmlns:w14="http://schemas.microsoft.com/office/word/2010/wordml" xmlns:w15="http://schemas.microsoft.com/office/word/2012/wordml" xmlns:w16cex="http://schemas.microsoft.com/office/word/2018/wordml/cex" xmlns:w16cid="http://schemas.microsoft.com/office/word/2016/wordml/cid" xmlns:w16="http://schemas.microsoft.com/office/word/2018/wordml" xmlns:w16du="http://schemas.microsoft.com/office/word/2023/wordml/word16du" xmlns:w16sdtdh="http://schemas.microsoft.com/office/word/2020/wordml/sdtdatahash" xmlns:w16sdtfl="http://schemas.microsoft.com/office/word/2024/wordml/sdtformatlock" xmlns:w16se="http://schemas.microsoft.com/office/word/2015/wordml/symex" mc:Ignorable="w14 w15 w16se w16cid w16 w16cex w16sdtdh w16sdtfl w16du">
+<w:styles xmlns:mc="http://schemas.openxmlformats.org/markup-compatibility/2006" xmlns:o="urn:schemas-microsoft-com:office:office" xmlns:r="http://schemas.openxmlformats.org/officeDocument/2006/relationships" xmlns:m="http://schemas.openxmlformats.org/officeDocument/2006/math" xmlns:v="urn:schemas-microsoft-com:vml" xmlns:w="http://schemas.openxmlformats.org/wordprocessingml/2006/main" xmlns:w14="http://schemas.microsoft.com/office/word/2010/wordml" xmlns:w10="urn:schemas-microsoft-com:office:word" xmlns:sl="http://schemas.openxmlformats.org/schemaLibrary/2006/main" xmlns:wpsCustomData="http://www.wps.cn/officeDocument/2013/wpsCustomData" mc:Ignorable="w14">
   <w:docDefaults>
     <w:rPrDefault>
       <w:rPr>
-        <w:rFonts w:ascii="Times New Roman" w:eastAsiaTheme="minorHAnsi" w:hAnsi="Times New Roman" w:cs="Tahoma"/>
-        <w:sz w:val="24"/>
-        <w:szCs w:val="24"/>
-        <w:lang w:val="en-US" w:eastAsia="en-US" w:bidi="ar-SA"/>
+        <w:rFonts w:ascii="Times New Roman" w:hAnsi="Times New Roman" w:eastAsiaTheme="minorHAnsi" w:cs="Tahoma"/>
       </w:rPr>
     </w:rPrDefault>
-    <w:pPrDefault>
-      <w:pPr>
-        <w:spacing w:after="200" w:line="276" w:lineRule="auto"/>
-      </w:pPr>
-    </w:pPrDefault>
+    <w:pPrDefault/>
   </w:docDefaults>
-  <w:latentStyles w:defLockedState="0" w:defUIPriority="99" w:defSemiHidden="0" w:defUnhideWhenUsed="0" w:defQFormat="0" w:count="376">
-    <w:lsdException w:name="Normal" w:uiPriority="0" w:qFormat="1"/>
-    <w:lsdException w:name="heading 1" w:uiPriority="9" w:qFormat="1"/>
-    <w:lsdException w:name="heading 2" w:semiHidden="1" w:uiPriority="9" w:unhideWhenUsed="1" w:qFormat="1"/>
-    <w:lsdException w:name="heading 3" w:semiHidden="1" w:uiPriority="9" w:unhideWhenUsed="1" w:qFormat="1"/>
-    <w:lsdException w:name="heading 4" w:semiHidden="1" w:uiPriority="9" w:unhideWhenUsed="1" w:qFormat="1"/>
-    <w:lsdException w:name="heading 5" w:semiHidden="1" w:uiPriority="9" w:unhideWhenUsed="1" w:qFormat="1"/>
-    <w:lsdException w:name="heading 6" w:semiHidden="1" w:uiPriority="9" w:unhideWhenUsed="1" w:qFormat="1"/>
-    <w:lsdException w:name="heading 7" w:semiHidden="1" w:uiPriority="9" w:unhideWhenUsed="1" w:qFormat="1"/>
-    <w:lsdException w:name="heading 8" w:semiHidden="1" w:uiPriority="9" w:unhideWhenUsed="1" w:qFormat="1"/>
-    <w:lsdException w:name="heading 9" w:semiHidden="1" w:uiPriority="9" w:unhideWhenUsed="1" w:qFormat="1"/>
-    <w:lsdException w:name="index 1" w:semiHidden="1" w:unhideWhenUsed="1"/>
-    <w:lsdException w:name="index 2" w:semiHidden="1" w:unhideWhenUsed="1"/>
-    <w:lsdException w:name="index 3" w:semiHidden="1" w:unhideWhenUsed="1"/>
-    <w:lsdException w:name="index 4" w:semiHidden="1" w:unhideWhenUsed="1"/>
-    <w:lsdException w:name="index 5" w:semiHidden="1" w:unhideWhenUsed="1"/>
-    <w:lsdException w:name="index 6" w:semiHidden="1" w:unhideWhenUsed="1"/>
-    <w:lsdException w:name="index 7" w:semiHidden="1" w:unhideWhenUsed="1"/>
-    <w:lsdException w:name="index 8" w:semiHidden="1" w:unhideWhenUsed="1"/>
-    <w:lsdException w:name="index 9" w:semiHidden="1" w:unhideWhenUsed="1"/>
-    <w:lsdException w:name="toc 1" w:semiHidden="1" w:uiPriority="39" w:unhideWhenUsed="1"/>
-    <w:lsdException w:name="toc 2" w:semiHidden="1" w:uiPriority="39" w:unhideWhenUsed="1"/>
-    <w:lsdException w:name="toc 3" w:semiHidden="1" w:uiPriority="39" w:unhideWhenUsed="1"/>
-    <w:lsdException w:name="toc 4" w:semiHidden="1" w:uiPriority="39" w:unhideWhenUsed="1"/>
-    <w:lsdException w:name="toc 5" w:semiHidden="1" w:uiPriority="39" w:unhideWhenUsed="1"/>
-    <w:lsdException w:name="toc 6" w:semiHidden="1" w:uiPriority="39" w:unhideWhenUsed="1"/>
-    <w:lsdException w:name="toc 7" w:semiHidden="1" w:uiPriority="39" w:unhideWhenUsed="1"/>
-    <w:lsdException w:name="toc 8" w:semiHidden="1" w:uiPriority="39" w:unhideWhenUsed="1"/>
-    <w:lsdException w:name="toc 9" w:semiHidden="1" w:uiPriority="39" w:unhideWhenUsed="1"/>
-    <w:lsdException w:name="Normal Indent" w:semiHidden="1" w:unhideWhenUsed="1"/>
-    <w:lsdException w:name="footnote text" w:semiHidden="1" w:unhideWhenUsed="1"/>
-    <w:lsdException w:name="annotation text" w:semiHidden="1" w:unhideWhenUsed="1"/>
-    <w:lsdException w:name="header" w:semiHidden="1" w:unhideWhenUsed="1"/>
-    <w:lsdException w:name="footer" w:semiHidden="1" w:unhideWhenUsed="1"/>
-    <w:lsdException w:name="index heading" w:semiHidden="1" w:unhideWhenUsed="1"/>
-    <w:lsdException w:name="caption" w:semiHidden="1" w:uiPriority="35" w:unhideWhenUsed="1" w:qFormat="1"/>
-    <w:lsdException w:name="table of figures" w:semiHidden="1" w:unhideWhenUsed="1"/>
-    <w:lsdException w:name="envelope address" w:semiHidden="1" w:unhideWhenUsed="1"/>
-    <w:lsdException w:name="envelope return" w:semiHidden="1" w:unhideWhenUsed="1"/>
-    <w:lsdException w:name="footnote reference" w:semiHidden="1" w:unhideWhenUsed="1"/>
-    <w:lsdException w:name="annotation reference" w:semiHidden="1" w:unhideWhenUsed="1"/>
-    <w:lsdException w:name="line number" w:semiHidden="1" w:unhideWhenUsed="1"/>
-    <w:lsdException w:name="page number" w:semiHidden="1" w:unhideWhenUsed="1"/>
-    <w:lsdException w:name="endnote reference" w:semiHidden="1" w:unhideWhenUsed="1"/>
-    <w:lsdException w:name="endnote text" w:semiHidden="1" w:unhideWhenUsed="1"/>
-    <w:lsdException w:name="table of authorities" w:semiHidden="1" w:unhideWhenUsed="1"/>
-    <w:lsdException w:name="macro" w:semiHidden="1" w:unhideWhenUsed="1"/>
-    <w:lsdException w:name="toa heading" w:semiHidden="1" w:unhideWhenUsed="1"/>
-    <w:lsdException w:name="List" w:semiHidden="1" w:unhideWhenUsed="1"/>
-    <w:lsdException w:name="List Bullet" w:semiHidden="1" w:unhideWhenUsed="1"/>
-    <w:lsdException w:name="List Number" w:semiHidden="1" w:unhideWhenUsed="1"/>
-    <w:lsdException w:name="List 2" w:semiHidden="1" w:unhideWhenUsed="1"/>
-    <w:lsdException w:name="List 3" w:semiHidden="1" w:unhideWhenUsed="1"/>
-    <w:lsdException w:name="List 4" w:semiHidden="1" w:unhideWhenUsed="1"/>
-    <w:lsdException w:name="List 5" w:semiHidden="1" w:unhideWhenUsed="1"/>
-    <w:lsdException w:name="List Bullet 2" w:semiHidden="1" w:unhideWhenUsed="1"/>
-    <w:lsdException w:name="List Bullet 3" w:semiHidden="1" w:unhideWhenUsed="1"/>
-    <w:lsdException w:name="List Bullet 4" w:semiHidden="1" w:unhideWhenUsed="1"/>
-    <w:lsdException w:name="List Bullet 5" w:semiHidden="1" w:unhideWhenUsed="1"/>
-    <w:lsdException w:name="List Number 2" w:semiHidden="1" w:unhideWhenUsed="1"/>
-    <w:lsdException w:name="List Number 3" w:semiHidden="1" w:unhideWhenUsed="1"/>
-    <w:lsdException w:name="List Number 4" w:semiHidden="1" w:unhideWhenUsed="1"/>
-    <w:lsdException w:name="List Number 5" w:semiHidden="1" w:unhideWhenUsed="1"/>
-    <w:lsdException w:name="Title" w:uiPriority="10" w:qFormat="1"/>
-    <w:lsdException w:name="Closing" w:semiHidden="1" w:unhideWhenUsed="1"/>
-    <w:lsdException w:name="Signature" w:semiHidden="1" w:unhideWhenUsed="1"/>
-    <w:lsdException w:name="Default Paragraph Font" w:semiHidden="1" w:uiPriority="1" w:unhideWhenUsed="1"/>
-    <w:lsdException w:name="Body Text" w:semiHidden="1" w:unhideWhenUsed="1"/>
-    <w:lsdException w:name="Body Text Indent" w:semiHidden="1" w:unhideWhenUsed="1"/>
-    <w:lsdException w:name="List Continue" w:semiHidden="1" w:unhideWhenUsed="1"/>
-    <w:lsdException w:name="List Continue 2" w:semiHidden="1" w:unhideWhenUsed="1"/>
-    <w:lsdException w:name="List Continue 3" w:semiHidden="1" w:unhideWhenUsed="1"/>
-    <w:lsdException w:name="List Continue 4" w:semiHidden="1" w:unhideWhenUsed="1"/>
-    <w:lsdException w:name="List Continue 5" w:semiHidden="1" w:unhideWhenUsed="1"/>
-    <w:lsdException w:name="Message Header" w:semiHidden="1" w:unhideWhenUsed="1"/>
-    <w:lsdException w:name="Subtitle" w:uiPriority="11" w:qFormat="1"/>
-    <w:lsdException w:name="Salutation" w:semiHidden="1" w:unhideWhenUsed="1"/>
-    <w:lsdException w:name="Date" w:semiHidden="1" w:unhideWhenUsed="1"/>
-    <w:lsdException w:name="Body Text First Indent" w:semiHidden="1" w:unhideWhenUsed="1"/>
-    <w:lsdException w:name="Body Text First Indent 2" w:semiHidden="1" w:unhideWhenUsed="1"/>
-    <w:lsdException w:name="Note Heading" w:semiHidden="1" w:unhideWhenUsed="1"/>
-    <w:lsdException w:name="Body Text 2" w:semiHidden="1" w:unhideWhenUsed="1"/>
-    <w:lsdException w:name="Body Text 3" w:semiHidden="1" w:unhideWhenUsed="1"/>
-    <w:lsdException w:name="Body Text Indent 2" w:semiHidden="1" w:unhideWhenUsed="1"/>
-    <w:lsdException w:name="Body Text Indent 3" w:semiHidden="1" w:unhideWhenUsed="1"/>
-    <w:lsdException w:name="Block Text" w:semiHidden="1" w:unhideWhenUsed="1"/>
-    <w:lsdException w:name="Hyperlink" w:semiHidden="1" w:unhideWhenUsed="1"/>
-    <w:lsdException w:name="FollowedHyperlink" w:semiHidden="1" w:unhideWhenUsed="1"/>
-    <w:lsdException w:name="Strong" w:uiPriority="22" w:qFormat="1"/>
-    <w:lsdException w:name="Emphasis" w:uiPriority="20" w:qFormat="1"/>
-    <w:lsdException w:name="Document Map" w:semiHidden="1" w:unhideWhenUsed="1"/>
-    <w:lsdException w:name="Plain Text" w:semiHidden="1" w:unhideWhenUsed="1"/>
-    <w:lsdException w:name="E-mail Signature" w:semiHidden="1" w:unhideWhenUsed="1"/>
-    <w:lsdException w:name="HTML Top of Form" w:semiHidden="1" w:unhideWhenUsed="1"/>
-    <w:lsdException w:name="HTML Bottom of Form" w:semiHidden="1" w:unhideWhenUsed="1"/>
-    <w:lsdException w:name="Normal (Web)" w:semiHidden="1" w:unhideWhenUsed="1"/>
-    <w:lsdException w:name="HTML Acronym" w:semiHidden="1" w:unhideWhenUsed="1"/>
-    <w:lsdException w:name="HTML Address" w:semiHidden="1" w:unhideWhenUsed="1"/>
-    <w:lsdException w:name="HTML Cite" w:semiHidden="1" w:unhideWhenUsed="1"/>
-    <w:lsdException w:name="HTML Code" w:semiHidden="1" w:unhideWhenUsed="1"/>
-    <w:lsdException w:name="HTML Definition" w:semiHidden="1" w:unhideWhenUsed="1"/>
-    <w:lsdException w:name="HTML Keyboard" w:semiHidden="1" w:unhideWhenUsed="1"/>
-    <w:lsdException w:name="HTML Preformatted" w:semiHidden="1" w:unhideWhenUsed="1"/>
-    <w:lsdException w:name="HTML Sample" w:semiHidden="1" w:unhideWhenUsed="1"/>
-    <w:lsdException w:name="HTML Typewriter" w:semiHidden="1" w:unhideWhenUsed="1"/>
-    <w:lsdException w:name="HTML Variable" w:semiHidden="1" w:unhideWhenUsed="1"/>
-    <w:lsdException w:name="Normal Table" w:semiHidden="1" w:unhideWhenUsed="1"/>
-    <w:lsdException w:name="annotation subject" w:semiHidden="1" w:unhideWhenUsed="1"/>
-    <w:lsdException w:name="No List" w:semiHidden="1" w:unhideWhenUsed="1"/>
-    <w:lsdException w:name="Outline List 1" w:semiHidden="1" w:unhideWhenUsed="1"/>
-    <w:lsdException w:name="Outline List 2" w:semiHidden="1" w:unhideWhenUsed="1"/>
-    <w:lsdException w:name="Outline List 3" w:semiHidden="1" w:unhideWhenUsed="1"/>
-    <w:lsdException w:name="Table Simple 1" w:semiHidden="1" w:unhideWhenUsed="1"/>
-    <w:lsdException w:name="Table Simple 2" w:semiHidden="1" w:unhideWhenUsed="1"/>
-    <w:lsdException w:name="Table Simple 3" w:semiHidden="1" w:unhideWhenUsed="1"/>
-    <w:lsdException w:name="Table Classic 1" w:semiHidden="1" w:unhideWhenUsed="1"/>
-    <w:lsdException w:name="Table Classic 2" w:semiHidden="1" w:unhideWhenUsed="1"/>
-    <w:lsdException w:name="Table Classic 3" w:semiHidden="1" w:unhideWhenUsed="1"/>
-    <w:lsdException w:name="Table Classic 4" w:semiHidden="1" w:unhideWhenUsed="1"/>
-    <w:lsdException w:name="Table Colorful 1" w:semiHidden="1" w:unhideWhenUsed="1"/>
-    <w:lsdException w:name="Table Colorful 2" w:semiHidden="1" w:unhideWhenUsed="1"/>
-    <w:lsdException w:name="Table Colorful 3" w:semiHidden="1" w:unhideWhenUsed="1"/>
-    <w:lsdException w:name="Table Columns 1" w:semiHidden="1" w:unhideWhenUsed="1"/>
-    <w:lsdException w:name="Table Columns 2" w:semiHidden="1" w:unhideWhenUsed="1"/>
-    <w:lsdException w:name="Table Columns 3" w:semiHidden="1" w:unhideWhenUsed="1"/>
-    <w:lsdException w:name="Table Columns 4" w:semiHidden="1" w:unhideWhenUsed="1"/>
-    <w:lsdException w:name="Table Columns 5" w:semiHidden="1" w:unhideWhenUsed="1"/>
-    <w:lsdException w:name="Table Grid 1" w:semiHidden="1" w:unhideWhenUsed="1"/>
-    <w:lsdException w:name="Table Grid 2" w:semiHidden="1" w:unhideWhenUsed="1"/>
-    <w:lsdException w:name="Table Grid 3" w:semiHidden="1" w:unhideWhenUsed="1"/>
-    <w:lsdException w:name="Table Grid 4" w:semiHidden="1" w:unhideWhenUsed="1"/>
-    <w:lsdException w:name="Table Grid 5" w:semiHidden="1" w:unhideWhenUsed="1"/>
-    <w:lsdException w:name="Table Grid 6" w:semiHidden="1" w:unhideWhenUsed="1"/>
-    <w:lsdException w:name="Table Grid 7" w:semiHidden="1" w:unhideWhenUsed="1"/>
-    <w:lsdException w:name="Table Grid 8" w:semiHidden="1" w:unhideWhenUsed="1"/>
-    <w:lsdException w:name="Table List 1" w:semiHidden="1" w:unhideWhenUsed="1"/>
-    <w:lsdException w:name="Table List 2" w:semiHidden="1" w:unhideWhenUsed="1"/>
-    <w:lsdException w:name="Table List 3" w:semiHidden="1" w:unhideWhenUsed="1"/>
-    <w:lsdException w:name="Table List 4" w:semiHidden="1" w:unhideWhenUsed="1"/>
-    <w:lsdException w:name="Table List 5" w:semiHidden="1" w:unhideWhenUsed="1"/>
-    <w:lsdException w:name="Table List 6" w:semiHidden="1" w:unhideWhenUsed="1"/>
-    <w:lsdException w:name="Table List 7" w:semiHidden="1" w:unhideWhenUsed="1"/>
-    <w:lsdException w:name="Table List 8" w:semiHidden="1" w:unhideWhenUsed="1"/>
-    <w:lsdException w:name="Table 3D effects 1" w:semiHidden="1" w:unhideWhenUsed="1"/>
-    <w:lsdException w:name="Table 3D effects 2" w:semiHidden="1" w:unhideWhenUsed="1"/>
-    <w:lsdException w:name="Table 3D effects 3" w:semiHidden="1" w:unhideWhenUsed="1"/>
-    <w:lsdException w:name="Table Contemporary" w:semiHidden="1" w:unhideWhenUsed="1"/>
-    <w:lsdException w:name="Table Elegant" w:semiHidden="1" w:unhideWhenUsed="1"/>
-    <w:lsdException w:name="Table Professional" w:semiHidden="1" w:unhideWhenUsed="1"/>
-    <w:lsdException w:name="Table Subtle 1" w:semiHidden="1" w:unhideWhenUsed="1"/>
-    <w:lsdException w:name="Table Subtle 2" w:semiHidden="1" w:unhideWhenUsed="1"/>
-    <w:lsdException w:name="Table Web 1" w:semiHidden="1" w:unhideWhenUsed="1"/>
-    <w:lsdException w:name="Table Web 2" w:semiHidden="1" w:unhideWhenUsed="1"/>
-    <w:lsdException w:name="Table Web 3" w:semiHidden="1" w:unhideWhenUsed="1"/>
-    <w:lsdException w:name="Balloon Text" w:semiHidden="1" w:unhideWhenUsed="1"/>
-    <w:lsdException w:name="Table Grid" w:uiPriority="59"/>
-    <w:lsdException w:name="Table Theme" w:semiHidden="1" w:unhideWhenUsed="1"/>
-    <w:lsdException w:name="Placeholder Text" w:semiHidden="1"/>
-    <w:lsdException w:name="No Spacing" w:uiPriority="1" w:qFormat="1"/>
-    <w:lsdException w:name="Light Shading" w:uiPriority="60"/>
-    <w:lsdException w:name="Light List" w:uiPriority="61"/>
-    <w:lsdException w:name="Light Grid" w:uiPriority="62"/>
-    <w:lsdException w:name="Medium Shading 1" w:uiPriority="63"/>
-    <w:lsdException w:name="Medium Shading 2" w:uiPriority="64"/>
-    <w:lsdException w:name="Medium List 1" w:uiPriority="65"/>
-    <w:lsdException w:name="Medium List 2" w:uiPriority="66"/>
-    <w:lsdException w:name="Medium Grid 1" w:uiPriority="67"/>
-    <w:lsdException w:name="Medium Grid 2" w:uiPriority="68"/>
-    <w:lsdException w:name="Medium Grid 3" w:uiPriority="69"/>
-    <w:lsdException w:name="Dark List" w:uiPriority="70"/>
-    <w:lsdException w:name="Colorful Shading" w:uiPriority="71"/>
-    <w:lsdException w:name="Colorful List" w:uiPriority="72"/>
-    <w:lsdException w:name="Colorful Grid" w:uiPriority="73"/>
-    <w:lsdException w:name="Light Shading Accent 1" w:uiPriority="60"/>
-    <w:lsdException w:name="Light List Accent 1" w:uiPriority="61"/>
-    <w:lsdException w:name="Light Grid Accent 1" w:uiPriority="62"/>
-    <w:lsdException w:name="Medium Shading 1 Accent 1" w:uiPriority="63"/>
-    <w:lsdException w:name="Medium Shading 2 Accent 1" w:uiPriority="64"/>
-    <w:lsdException w:name="Medium List 1 Accent 1" w:uiPriority="65"/>
-    <w:lsdException w:name="Revision" w:semiHidden="1"/>
-    <w:lsdException w:name="List Paragraph" w:uiPriority="34" w:qFormat="1"/>
-    <w:lsdException w:name="Quote" w:uiPriority="29" w:qFormat="1"/>
-    <w:lsdException w:name="Intense Quote" w:uiPriority="30" w:qFormat="1"/>
-    <w:lsdException w:name="Medium List 2 Accent 1" w:uiPriority="66"/>
-    <w:lsdException w:name="Medium Grid 1 Accent 1" w:uiPriority="67"/>
-    <w:lsdException w:name="Medium Grid 2 Accent 1" w:uiPriority="68"/>
-    <w:lsdException w:name="Medium Grid 3 Accent 1" w:uiPriority="69"/>
-    <w:lsdException w:name="Dark List Accent 1" w:uiPriority="70"/>
-    <w:lsdException w:name="Colorful Shading Accent 1" w:uiPriority="71"/>
-    <w:lsdException w:name="Colorful List Accent 1" w:uiPriority="72"/>
-    <w:lsdException w:name="Colorful Grid Accent 1" w:uiPriority="73"/>
-    <w:lsdException w:name="Light Shading Accent 2" w:uiPriority="60"/>
-    <w:lsdException w:name="Light List Accent 2" w:uiPriority="61"/>
-    <w:lsdException w:name="Light Grid Accent 2" w:uiPriority="62"/>
-    <w:lsdException w:name="Medium Shading 1 Accent 2" w:uiPriority="63"/>
-    <w:lsdException w:name="Medium Shading 2 Accent 2" w:uiPriority="64"/>
-    <w:lsdException w:name="Medium List 1 Accent 2" w:uiPriority="65"/>
-    <w:lsdException w:name="Medium List 2 Accent 2" w:uiPriority="66"/>
-    <w:lsdException w:name="Medium Grid 1 Accent 2" w:uiPriority="67"/>
-    <w:lsdException w:name="Medium Grid 2 Accent 2" w:uiPriority="68"/>
-    <w:lsdException w:name="Medium Grid 3 Accent 2" w:uiPriority="69"/>
-    <w:lsdException w:name="Dark List Accent 2" w:uiPriority="70"/>
-    <w:lsdException w:name="Colorful Shading Accent 2" w:uiPriority="71"/>
-    <w:lsdException w:name="Colorful List Accent 2" w:uiPriority="72"/>
-    <w:lsdException w:name="Colorful Grid Accent 2" w:uiPriority="73"/>
-    <w:lsdException w:name="Light Shading Accent 3" w:uiPriority="60"/>
-    <w:lsdException w:name="Light List Accent 3" w:uiPriority="61"/>
-    <w:lsdException w:name="Light Grid Accent 3" w:uiPriority="62"/>
-    <w:lsdException w:name="Medium Shading 1 Accent 3" w:uiPriority="63"/>
-    <w:lsdException w:name="Medium Shading 2 Accent 3" w:uiPriority="64"/>
-    <w:lsdException w:name="Medium List 1 Accent 3" w:uiPriority="65"/>
-    <w:lsdException w:name="Medium List 2 Accent 3" w:uiPriority="66"/>
-    <w:lsdException w:name="Medium Grid 1 Accent 3" w:uiPriority="67"/>
-    <w:lsdException w:name="Medium Grid 2 Accent 3" w:uiPriority="68"/>
-    <w:lsdException w:name="Medium Grid 3 Accent 3" w:uiPriority="69"/>
-    <w:lsdException w:name="Dark List Accent 3" w:uiPriority="70"/>
-    <w:lsdException w:name="Colorful Shading Accent 3" w:uiPriority="71"/>
-    <w:lsdException w:name="Colorful List Accent 3" w:uiPriority="72"/>
-    <w:lsdException w:name="Colorful Grid Accent 3" w:uiPriority="73"/>
-    <w:lsdException w:name="Light Shading Accent 4" w:uiPriority="60"/>
-    <w:lsdException w:name="Light List Accent 4" w:uiPriority="61"/>
-    <w:lsdException w:name="Light Grid Accent 4" w:uiPriority="62"/>
-    <w:lsdException w:name="Medium Shading 1 Accent 4" w:uiPriority="63"/>
-    <w:lsdException w:name="Medium Shading 2 Accent 4" w:uiPriority="64"/>
-    <w:lsdException w:name="Medium List 1 Accent 4" w:uiPriority="65"/>
-    <w:lsdException w:name="Medium List 2 Accent 4" w:uiPriority="66"/>
-    <w:lsdException w:name="Medium Grid 1 Accent 4" w:uiPriority="67"/>
-    <w:lsdException w:name="Medium Grid 2 Accent 4" w:uiPriority="68"/>
-    <w:lsdException w:name="Medium Grid 3 Accent 4" w:uiPriority="69"/>
-    <w:lsdException w:name="Dark List Accent 4" w:uiPriority="70"/>
-    <w:lsdException w:name="Colorful Shading Accent 4" w:uiPriority="71"/>
-    <w:lsdException w:name="Colorful List Accent 4" w:uiPriority="72"/>
-    <w:lsdException w:name="Colorful Grid Accent 4" w:uiPriority="73"/>
-    <w:lsdException w:name="Light Shading Accent 5" w:uiPriority="60"/>
-    <w:lsdException w:name="Light List Accent 5" w:uiPriority="61"/>
-    <w:lsdException w:name="Light Grid Accent 5" w:uiPriority="62"/>
-    <w:lsdException w:name="Medium Shading 1 Accent 5" w:uiPriority="63"/>
-    <w:lsdException w:name="Medium Shading 2 Accent 5" w:uiPriority="64"/>
-    <w:lsdException w:name="Medium List 1 Accent 5" w:uiPriority="65"/>
-    <w:lsdException w:name="Medium List 2 Accent 5" w:uiPriority="66"/>
-    <w:lsdException w:name="Medium Grid 1 Accent 5" w:uiPriority="67"/>
-    <w:lsdException w:name="Medium Grid 2 Accent 5" w:uiPriority="68"/>
-    <w:lsdException w:name="Medium Grid 3 Accent 5" w:uiPriority="69"/>
-    <w:lsdException w:name="Dark List Accent 5" w:uiPriority="70"/>
-    <w:lsdException w:name="Colorful Shading Accent 5" w:uiPriority="71"/>
-    <w:lsdException w:name="Colorful List Accent 5" w:uiPriority="72"/>
-    <w:lsdException w:name="Colorful Grid Accent 5" w:uiPriority="73"/>
-    <w:lsdException w:name="Light Shading Accent 6" w:uiPriority="60"/>
-    <w:lsdException w:name="Light List Accent 6" w:uiPriority="61"/>
-    <w:lsdException w:name="Light Grid Accent 6" w:uiPriority="62"/>
-    <w:lsdException w:name="Medium Shading 1 Accent 6" w:uiPriority="63"/>
-    <w:lsdException w:name="Medium Shading 2 Accent 6" w:uiPriority="64"/>
-    <w:lsdException w:name="Medium List 1 Accent 6" w:uiPriority="65"/>
-    <w:lsdException w:name="Medium List 2 Accent 6" w:uiPriority="66"/>
-    <w:lsdException w:name="Medium Grid 1 Accent 6" w:uiPriority="67"/>
-    <w:lsdException w:name="Medium Grid 2 Accent 6" w:uiPriority="68"/>
-    <w:lsdException w:name="Medium Grid 3 Accent 6" w:uiPriority="69"/>
-    <w:lsdException w:name="Dark List Accent 6" w:uiPriority="70"/>
-    <w:lsdException w:name="Colorful Shading Accent 6" w:uiPriority="71"/>
-    <w:lsdException w:name="Colorful List Accent 6" w:uiPriority="72"/>
-    <w:lsdException w:name="Colorful Grid Accent 6" w:uiPriority="73"/>
-    <w:lsdException w:name="Subtle Emphasis" w:uiPriority="19" w:qFormat="1"/>
-    <w:lsdException w:name="Intense Emphasis" w:uiPriority="21" w:qFormat="1"/>
-    <w:lsdException w:name="Subtle Reference" w:uiPriority="31" w:qFormat="1"/>
-    <w:lsdException w:name="Intense Reference" w:uiPriority="32" w:qFormat="1"/>
-    <w:lsdException w:name="Book Title" w:uiPriority="33" w:qFormat="1"/>
-    <w:lsdException w:name="Bibliography" w:semiHidden="1" w:uiPriority="37" w:unhideWhenUsed="1"/>
-    <w:lsdException w:name="TOC Heading" w:semiHidden="1" w:uiPriority="39" w:unhideWhenUsed="1" w:qFormat="1"/>
-    <w:lsdException w:name="Plain Table 1" w:uiPriority="41"/>
-    <w:lsdException w:name="Plain Table 2" w:uiPriority="42"/>
-    <w:lsdException w:name="Plain Table 3" w:uiPriority="43"/>
-    <w:lsdException w:name="Plain Table 4" w:uiPriority="44"/>
-    <w:lsdException w:name="Plain Table 5" w:uiPriority="45"/>
-    <w:lsdException w:name="Grid Table Light" w:uiPriority="40"/>
-    <w:lsdException w:name="Grid Table 1 Light" w:uiPriority="46"/>
-    <w:lsdException w:name="Grid Table 2" w:uiPriority="47"/>
-    <w:lsdException w:name="Grid Table 3" w:uiPriority="48"/>
-    <w:lsdException w:name="Grid Table 4" w:uiPriority="49"/>
-    <w:lsdException w:name="Grid Table 5 Dark" w:uiPriority="50"/>
-    <w:lsdException w:name="Grid Table 6 Colorful" w:uiPriority="51"/>
-    <w:lsdException w:name="Grid Table 7 Colorful" w:uiPriority="52"/>
-    <w:lsdException w:name="Grid Table 1 Light Accent 1" w:uiPriority="46"/>
-    <w:lsdException w:name="Grid Table 2 Accent 1" w:uiPriority="47"/>
-    <w:lsdException w:name="Grid Table 3 Accent 1" w:uiPriority="48"/>
-    <w:lsdException w:name="Grid Table 4 Accent 1" w:uiPriority="49"/>
-    <w:lsdException w:name="Grid Table 5 Dark Accent 1" w:uiPriority="50"/>
-    <w:lsdException w:name="Grid Table 6 Colorful Accent 1" w:uiPriority="51"/>
-    <w:lsdException w:name="Grid Table 7 Colorful Accent 1" w:uiPriority="52"/>
-    <w:lsdException w:name="Grid Table 1 Light Accent 2" w:uiPriority="46"/>
-    <w:lsdException w:name="Grid Table 2 Accent 2" w:uiPriority="47"/>
-    <w:lsdException w:name="Grid Table 3 Accent 2" w:uiPriority="48"/>
-    <w:lsdException w:name="Grid Table 4 Accent 2" w:uiPriority="49"/>
-    <w:lsdException w:name="Grid Table 5 Dark Accent 2" w:uiPriority="50"/>
-    <w:lsdException w:name="Grid Table 6 Colorful Accent 2" w:uiPriority="51"/>
-    <w:lsdException w:name="Grid Table 7 Colorful Accent 2" w:uiPriority="52"/>
-    <w:lsdException w:name="Grid Table 1 Light Accent 3" w:uiPriority="46"/>
-    <w:lsdException w:name="Grid Table 2 Accent 3" w:uiPriority="47"/>
-    <w:lsdException w:name="Grid Table 3 Accent 3" w:uiPriority="48"/>
-    <w:lsdException w:name="Grid Table 4 Accent 3" w:uiPriority="49"/>
-    <w:lsdException w:name="Grid Table 5 Dark Accent 3" w:uiPriority="50"/>
-    <w:lsdException w:name="Grid Table 6 Colorful Accent 3" w:uiPriority="51"/>
-    <w:lsdException w:name="Grid Table 7 Colorful Accent 3" w:uiPriority="52"/>
-    <w:lsdException w:name="Grid Table 1 Light Accent 4" w:uiPriority="46"/>
-    <w:lsdException w:name="Grid Table 2 Accent 4" w:uiPriority="47"/>
-    <w:lsdException w:name="Grid Table 3 Accent 4" w:uiPriority="48"/>
-    <w:lsdException w:name="Grid Table 4 Accent 4" w:uiPriority="49"/>
-    <w:lsdException w:name="Grid Table 5 Dark Accent 4" w:uiPriority="50"/>
-    <w:lsdException w:name="Grid Table 6 Colorful Accent 4" w:uiPriority="51"/>
-    <w:lsdException w:name="Grid Table 7 Colorful Accent 4" w:uiPriority="52"/>
-    <w:lsdException w:name="Grid Table 1 Light Accent 5" w:uiPriority="46"/>
-    <w:lsdException w:name="Grid Table 2 Accent 5" w:uiPriority="47"/>
-    <w:lsdException w:name="Grid Table 3 Accent 5" w:uiPriority="48"/>
-    <w:lsdException w:name="Grid Table 4 Accent 5" w:uiPriority="49"/>
-    <w:lsdException w:name="Grid Table 5 Dark Accent 5" w:uiPriority="50"/>
-    <w:lsdException w:name="Grid Table 6 Colorful Accent 5" w:uiPriority="51"/>
-    <w:lsdException w:name="Grid Table 7 Colorful Accent 5" w:uiPriority="52"/>
-    <w:lsdException w:name="Grid Table 1 Light Accent 6" w:uiPriority="46"/>
-    <w:lsdException w:name="Grid Table 2 Accent 6" w:uiPriority="47"/>
-    <w:lsdException w:name="Grid Table 3 Accent 6" w:uiPriority="48"/>
-    <w:lsdException w:name="Grid Table 4 Accent 6" w:uiPriority="49"/>
-    <w:lsdException w:name="Grid Table 5 Dark Accent 6" w:uiPriority="50"/>
-    <w:lsdException w:name="Grid Table 6 Colorful Accent 6" w:uiPriority="51"/>
-    <w:lsdException w:name="Grid Table 7 Colorful Accent 6" w:uiPriority="52"/>
-    <w:lsdException w:name="List Table 1 Light" w:uiPriority="46"/>
-    <w:lsdException w:name="List Table 2" w:uiPriority="47"/>
-    <w:lsdException w:name="List Table 3" w:uiPriority="48"/>
-    <w:lsdException w:name="List Table 4" w:uiPriority="49"/>
-    <w:lsdException w:name="List Table 5 Dark" w:uiPriority="50"/>
-    <w:lsdException w:name="List Table 6 Colorful" w:uiPriority="51"/>
-    <w:lsdException w:name="List Table 7 Colorful" w:uiPriority="52"/>
-    <w:lsdException w:name="List Table 1 Light Accent 1" w:uiPriority="46"/>
-    <w:lsdException w:name="List Table 2 Accent 1" w:uiPriority="47"/>
-    <w:lsdException w:name="List Table 3 Accent 1" w:uiPriority="48"/>
-    <w:lsdException w:name="List Table 4 Accent 1" w:uiPriority="49"/>
-    <w:lsdException w:name="List Table 5 Dark Accent 1" w:uiPriority="50"/>
-    <w:lsdException w:name="List Table 6 Colorful Accent 1" w:uiPriority="51"/>
-    <w:lsdException w:name="List Table 7 Colorful Accent 1" w:uiPriority="52"/>
-    <w:lsdException w:name="List Table 1 Light Accent 2" w:uiPriority="46"/>
-    <w:lsdException w:name="List Table 2 Accent 2" w:uiPriority="47"/>
-    <w:lsdException w:name="List Table 3 Accent 2" w:uiPriority="48"/>
-    <w:lsdException w:name="List Table 4 Accent 2" w:uiPriority="49"/>
-    <w:lsdException w:name="List Table 5 Dark Accent 2" w:uiPriority="50"/>
-    <w:lsdException w:name="List Table 6 Colorful Accent 2" w:uiPriority="51"/>
-    <w:lsdException w:name="List Table 7 Colorful Accent 2" w:uiPriority="52"/>
-    <w:lsdException w:name="List Table 1 Light Accent 3" w:uiPriority="46"/>
-    <w:lsdException w:name="List Table 2 Accent 3" w:uiPriority="47"/>
-    <w:lsdException w:name="List Table 3 Accent 3" w:uiPriority="48"/>
-    <w:lsdException w:name="List Table 4 Accent 3" w:uiPriority="49"/>
-    <w:lsdException w:name="List Table 5 Dark Accent 3" w:uiPriority="50"/>
-    <w:lsdException w:name="List Table 6 Colorful Accent 3" w:uiPriority="51"/>
-    <w:lsdException w:name="List Table 7 Colorful Accent 3" w:uiPriority="52"/>
-    <w:lsdException w:name="List Table 1 Light Accent 4" w:uiPriority="46"/>
-    <w:lsdException w:name="List Table 2 Accent 4" w:uiPriority="47"/>
-    <w:lsdException w:name="List Table 3 Accent 4" w:uiPriority="48"/>
-    <w:lsdException w:name="List Table 4 Accent 4" w:uiPriority="49"/>
-    <w:lsdException w:name="List Table 5 Dark Accent 4" w:uiPriority="50"/>
-    <w:lsdException w:name="List Table 6 Colorful Accent 4" w:uiPriority="51"/>
-    <w:lsdException w:name="List Table 7 Colorful Accent 4" w:uiPriority="52"/>
-    <w:lsdException w:name="List Table 1 Light Accent 5" w:uiPriority="46"/>
-    <w:lsdException w:name="List Table 2 Accent 5" w:uiPriority="47"/>
-    <w:lsdException w:name="List Table 3 Accent 5" w:uiPriority="48"/>
-    <w:lsdException w:name="List Table 4 Accent 5" w:uiPriority="49"/>
-    <w:lsdException w:name="List Table 5 Dark Accent 5" w:uiPriority="50"/>
-    <w:lsdException w:name="List Table 6 Colorful Accent 5" w:uiPriority="51"/>
-    <w:lsdException w:name="List Table 7 Colorful Accent 5" w:uiPriority="52"/>
-    <w:lsdException w:name="List Table 1 Light Accent 6" w:uiPriority="46"/>
-    <w:lsdException w:name="List Table 2 Accent 6" w:uiPriority="47"/>
-    <w:lsdException w:name="List Table 3 Accent 6" w:uiPriority="48"/>
-    <w:lsdException w:name="List Table 4 Accent 6" w:uiPriority="49"/>
-    <w:lsdException w:name="List Table 5 Dark Accent 6" w:uiPriority="50"/>
-    <w:lsdException w:name="List Table 6 Colorful Accent 6" w:uiPriority="51"/>
-    <w:lsdException w:name="List Table 7 Colorful Accent 6" w:uiPriority="52"/>
-    <w:lsdException w:name="Mention" w:semiHidden="1" w:unhideWhenUsed="1"/>
-    <w:lsdException w:name="Smart Hyperlink" w:semiHidden="1" w:unhideWhenUsed="1"/>
-    <w:lsdException w:name="Hashtag" w:semiHidden="1" w:unhideWhenUsed="1"/>
-    <w:lsdException w:name="Unresolved Mention" w:semiHidden="1" w:unhideWhenUsed="1"/>
-    <w:lsdException w:name="Smart Link" w:semiHidden="1" w:unhideWhenUsed="1"/>
+  <w:latentStyles w:count="260" w:defQFormat="0" w:defUnhideWhenUsed="1" w:defSemiHidden="1" w:defUIPriority="99" w:defLockedState="0">
+    <w:lsdException w:qFormat="1" w:unhideWhenUsed="0" w:uiPriority="0" w:semiHidden="0" w:name="Normal"/>
+    <w:lsdException w:qFormat="1" w:unhideWhenUsed="0" w:uiPriority="9" w:semiHidden="0" w:name="heading 1"/>
+    <w:lsdException w:qFormat="1" w:uiPriority="9" w:name="heading 2"/>
+    <w:lsdException w:qFormat="1" w:uiPriority="9" w:name="heading 3"/>
+    <w:lsdException w:qFormat="1" w:uiPriority="9" w:name="heading 4"/>
+    <w:lsdException w:qFormat="1" w:uiPriority="9" w:name="heading 5"/>
+    <w:lsdException w:qFormat="1" w:uiPriority="9" w:name="heading 6"/>
+    <w:lsdException w:qFormat="1" w:uiPriority="9" w:name="heading 7"/>
+    <w:lsdException w:qFormat="1" w:uiPriority="9" w:name="heading 8"/>
+    <w:lsdException w:qFormat="1" w:uiPriority="9" w:name="heading 9"/>
+    <w:lsdException w:uiPriority="99" w:name="index 1"/>
+    <w:lsdException w:uiPriority="99" w:name="index 2"/>
+    <w:lsdException w:uiPriority="99" w:name="index 3"/>
+    <w:lsdException w:uiPriority="99" w:name="index 4"/>
+    <w:lsdException w:uiPriority="99" w:name="index 5"/>
+    <w:lsdException w:uiPriority="99" w:name="index 6"/>
+    <w:lsdException w:uiPriority="99" w:name="index 7"/>
+    <w:lsdException w:uiPriority="99" w:name="index 8"/>
+    <w:lsdException w:uiPriority="99" w:name="index 9"/>
+    <w:lsdException w:uiPriority="39" w:name="toc 1"/>
+    <w:lsdException w:uiPriority="39" w:name="toc 2"/>
+    <w:lsdException w:uiPriority="39" w:name="toc 3"/>
+    <w:lsdException w:uiPriority="39" w:name="toc 4"/>
+    <w:lsdException w:uiPriority="39" w:name="toc 5"/>
+    <w:lsdException w:uiPriority="39" w:name="toc 6"/>
+    <w:lsdException w:uiPriority="39" w:name="toc 7"/>
+    <w:lsdException w:uiPriority="39" w:name="toc 8"/>
+    <w:lsdException w:uiPriority="39" w:name="toc 9"/>
+    <w:lsdException w:uiPriority="99" w:name="Normal Indent"/>
+    <w:lsdException w:uiPriority="99" w:name="footnote text"/>
+    <w:lsdException w:uiPriority="99" w:name="annotation text"/>
+    <w:lsdException w:uiPriority="99" w:semiHidden="0" w:name="header"/>
+    <w:lsdException w:uiPriority="99" w:semiHidden="0" w:name="footer"/>
+    <w:lsdException w:uiPriority="99" w:name="index heading"/>
+    <w:lsdException w:qFormat="1" w:uiPriority="35" w:name="caption"/>
+    <w:lsdException w:uiPriority="99" w:name="table of figures"/>
+    <w:lsdException w:uiPriority="99" w:name="envelope address"/>
+    <w:lsdException w:uiPriority="99" w:name="envelope return"/>
+    <w:lsdException w:uiPriority="99" w:name="footnote reference"/>
+    <w:lsdException w:uiPriority="99" w:name="annotation reference"/>
+    <w:lsdException w:uiPriority="99" w:name="line number"/>
+    <w:lsdException w:uiPriority="99" w:name="page number"/>
+    <w:lsdException w:uiPriority="99" w:name="endnote reference"/>
+    <w:lsdException w:uiPriority="99" w:name="endnote text"/>
+    <w:lsdException w:uiPriority="99" w:name="table of authorities"/>
+    <w:lsdException w:uiPriority="99" w:name="macro"/>
+    <w:lsdException w:uiPriority="99" w:name="toa heading"/>
+    <w:lsdException w:uiPriority="99" w:name="List"/>
+    <w:lsdException w:uiPriority="99" w:name="List Bullet"/>
+    <w:lsdException w:uiPriority="99" w:name="List Number"/>
+    <w:lsdException w:uiPriority="99" w:name="List 2"/>
+    <w:lsdException w:uiPriority="99" w:name="List 3"/>
+    <w:lsdException w:uiPriority="99" w:name="List 4"/>
+    <w:lsdException w:uiPriority="99" w:name="List 5"/>
+    <w:lsdException w:uiPriority="99" w:name="List Bullet 2"/>
+    <w:lsdException w:uiPriority="99" w:name="List Bullet 3"/>
+    <w:lsdException w:uiPriority="99" w:name="List Bullet 4"/>
+    <w:lsdException w:uiPriority="99" w:name="List Bullet 5"/>
+    <w:lsdException w:uiPriority="99" w:name="List Number 2"/>
+    <w:lsdException w:uiPriority="99" w:name="List Number 3"/>
+    <w:lsdException w:uiPriority="99" w:name="List Number 4"/>
+    <w:lsdException w:uiPriority="99" w:name="List Number 5"/>
+    <w:lsdException w:qFormat="1" w:unhideWhenUsed="0" w:uiPriority="10" w:semiHidden="0" w:name="Title"/>
+    <w:lsdException w:uiPriority="99" w:name="Closing"/>
+    <w:lsdException w:uiPriority="99" w:name="Signature"/>
+    <w:lsdException w:uiPriority="1" w:name="Default Paragraph Font"/>
+    <w:lsdException w:uiPriority="99" w:name="Body Text"/>
+    <w:lsdException w:uiPriority="99" w:name="Body Text Indent"/>
+    <w:lsdException w:uiPriority="99" w:name="List Continue"/>
+    <w:lsdException w:uiPriority="99" w:name="List Continue 2"/>
+    <w:lsdException w:uiPriority="99" w:name="List Continue 3"/>
+    <w:lsdException w:uiPriority="99" w:name="List Continue 4"/>
+    <w:lsdException w:uiPriority="99" w:name="List Continue 5"/>
+    <w:lsdException w:uiPriority="99" w:name="Message Header"/>
+    <w:lsdException w:qFormat="1" w:unhideWhenUsed="0" w:uiPriority="11" w:semiHidden="0" w:name="Subtitle"/>
+    <w:lsdException w:uiPriority="99" w:name="Salutation"/>
+    <w:lsdException w:uiPriority="99" w:name="Date"/>
+    <w:lsdException w:uiPriority="99" w:name="Body Text First Indent"/>
+    <w:lsdException w:uiPriority="99" w:name="Body Text First Indent 2"/>
+    <w:lsdException w:uiPriority="99" w:name="Note Heading"/>
+    <w:lsdException w:uiPriority="99" w:name="Body Text 2"/>
+    <w:lsdException w:uiPriority="99" w:name="Body Text 3"/>
+    <w:lsdException w:uiPriority="99" w:name="Body Text Indent 2"/>
+    <w:lsdException w:uiPriority="99" w:name="Body Text Indent 3"/>
+    <w:lsdException w:uiPriority="99" w:name="Block Text"/>
+    <w:lsdException w:uiPriority="99" w:semiHidden="0" w:name="Hyperlink"/>
+    <w:lsdException w:uiPriority="99" w:name="FollowedHyperlink"/>
+    <w:lsdException w:qFormat="1" w:unhideWhenUsed="0" w:uiPriority="22" w:semiHidden="0" w:name="Strong"/>
+    <w:lsdException w:qFormat="1" w:unhideWhenUsed="0" w:uiPriority="20" w:semiHidden="0" w:name="Emphasis"/>
+    <w:lsdException w:uiPriority="99" w:name="Document Map"/>
+    <w:lsdException w:uiPriority="99" w:name="Plain Text"/>
+    <w:lsdException w:uiPriority="99" w:name="E-mail Signature"/>
+    <w:lsdException w:uiPriority="99" w:name="Normal (Web)"/>
+    <w:lsdException w:uiPriority="99" w:name="HTML Acronym"/>
+    <w:lsdException w:uiPriority="99" w:name="HTML Address"/>
+    <w:lsdException w:uiPriority="99" w:name="HTML Cite"/>
+    <w:lsdException w:uiPriority="99" w:name="HTML Code"/>
+    <w:lsdException w:uiPriority="99" w:name="HTML Definition"/>
+    <w:lsdException w:uiPriority="99" w:name="HTML Keyboard"/>
+    <w:lsdException w:uiPriority="99" w:name="HTML Preformatted"/>
+    <w:lsdException w:uiPriority="99" w:name="HTML Sample"/>
+    <w:lsdException w:uiPriority="99" w:name="HTML Typewriter"/>
+    <w:lsdException w:uiPriority="99" w:name="HTML Variable"/>
+    <w:lsdException w:uiPriority="99" w:name="Normal Table"/>
+    <w:lsdException w:uiPriority="99" w:name="annotation subject"/>
+    <w:lsdException w:uiPriority="99" w:name="Table Simple 1"/>
+    <w:lsdException w:uiPriority="99" w:name="Table Simple 2"/>
+    <w:lsdException w:uiPriority="99" w:name="Table Simple 3"/>
+    <w:lsdException w:uiPriority="99" w:name="Table Classic 1"/>
+    <w:lsdException w:uiPriority="99" w:name="Table Classic 2"/>
+    <w:lsdException w:uiPriority="99" w:name="Table Classic 3"/>
+    <w:lsdException w:uiPriority="99" w:name="Table Classic 4"/>
+    <w:lsdException w:uiPriority="99" w:name="Table Colorful 1"/>
+    <w:lsdException w:uiPriority="99" w:name="Table Colorful 2"/>
+    <w:lsdException w:uiPriority="99" w:name="Table Colorful 3"/>
+    <w:lsdException w:uiPriority="99" w:name="Table Columns 1"/>
+    <w:lsdException w:uiPriority="99" w:name="Table Columns 2"/>
+    <w:lsdException w:uiPriority="99" w:name="Table Columns 3"/>
+    <w:lsdException w:uiPriority="99" w:name="Table Columns 4"/>
+    <w:lsdException w:uiPriority="99" w:name="Table Columns 5"/>
+    <w:lsdException w:uiPriority="99" w:name="Table Grid 1"/>
+    <w:lsdException w:uiPriority="99" w:name="Table Grid 2"/>
+    <w:lsdException w:uiPriority="99" w:name="Table Grid 3"/>
+    <w:lsdException w:uiPriority="99" w:name="Table Grid 4"/>
+    <w:lsdException w:uiPriority="99" w:name="Table Grid 5"/>
+    <w:lsdException w:uiPriority="99" w:name="Table Grid 6"/>
+    <w:lsdException w:uiPriority="99" w:name="Table Grid 7"/>
+    <w:lsdException w:uiPriority="99" w:name="Table Grid 8"/>
+    <w:lsdException w:uiPriority="99" w:name="Table List 1"/>
+    <w:lsdException w:uiPriority="99" w:name="Table List 2"/>
+    <w:lsdException w:uiPriority="99" w:name="Table List 3"/>
+    <w:lsdException w:uiPriority="99" w:name="Table List 4"/>
+    <w:lsdException w:uiPriority="99" w:name="Table List 5"/>
+    <w:lsdException w:uiPriority="99" w:name="Table List 6"/>
+    <w:lsdException w:uiPriority="99" w:name="Table List 7"/>
+    <w:lsdException w:uiPriority="99" w:name="Table List 8"/>
+    <w:lsdException w:uiPriority="99" w:name="Table 3D effects 1"/>
+    <w:lsdException w:uiPriority="99" w:name="Table 3D effects 2"/>
+    <w:lsdException w:uiPriority="99" w:name="Table 3D effects 3"/>
+    <w:lsdException w:uiPriority="99" w:name="Table Contemporary"/>
+    <w:lsdException w:uiPriority="99" w:name="Table Elegant"/>
+    <w:lsdException w:uiPriority="99" w:name="Table Professional"/>
+    <w:lsdException w:uiPriority="99" w:name="Table Subtle 1"/>
+    <w:lsdException w:uiPriority="99" w:name="Table Subtle 2"/>
+    <w:lsdException w:uiPriority="99" w:name="Table Web 1"/>
+    <w:lsdException w:uiPriority="99" w:name="Table Web 2"/>
+    <w:lsdException w:uiPriority="99" w:name="Table Web 3"/>
+    <w:lsdException w:uiPriority="99" w:name="Balloon Text"/>
+    <w:lsdException w:unhideWhenUsed="0" w:uiPriority="59" w:semiHidden="0" w:name="Table Grid"/>
+    <w:lsdException w:uiPriority="99" w:name="Table Theme"/>
+    <w:lsdException w:unhideWhenUsed="0" w:uiPriority="60" w:semiHidden="0" w:name="Light Shading"/>
+    <w:lsdException w:unhideWhenUsed="0" w:uiPriority="61" w:semiHidden="0" w:name="Light List"/>
+    <w:lsdException w:unhideWhenUsed="0" w:uiPriority="62" w:semiHidden="0" w:name="Light Grid"/>
+    <w:lsdException w:unhideWhenUsed="0" w:uiPriority="63" w:semiHidden="0" w:name="Medium Shading 1"/>
+    <w:lsdException w:unhideWhenUsed="0" w:uiPriority="64" w:semiHidden="0" w:name="Medium Shading 2"/>
+    <w:lsdException w:unhideWhenUsed="0" w:uiPriority="65" w:semiHidden="0" w:name="Medium List 1"/>
+    <w:lsdException w:unhideWhenUsed="0" w:uiPriority="66" w:semiHidden="0" w:name="Medium List 2"/>
+    <w:lsdException w:unhideWhenUsed="0" w:uiPriority="67" w:semiHidden="0" w:name="Medium Grid 1"/>
+    <w:lsdException w:unhideWhenUsed="0" w:uiPriority="68" w:semiHidden="0" w:name="Medium Grid 2"/>
+    <w:lsdException w:unhideWhenUsed="0" w:uiPriority="69" w:semiHidden="0" w:name="Medium Grid 3"/>
+    <w:lsdException w:unhideWhenUsed="0" w:uiPriority="70" w:semiHidden="0" w:name="Dark List"/>
+    <w:lsdException w:unhideWhenUsed="0" w:uiPriority="71" w:semiHidden="0" w:name="Colorful Shading"/>
+    <w:lsdException w:unhideWhenUsed="0" w:uiPriority="72" w:semiHidden="0" w:name="Colorful List"/>
+    <w:lsdException w:unhideWhenUsed="0" w:uiPriority="73" w:semiHidden="0" w:name="Colorful Grid"/>
+    <w:lsdException w:unhideWhenUsed="0" w:uiPriority="60" w:semiHidden="0" w:name="Light Shading Accent 1"/>
+    <w:lsdException w:unhideWhenUsed="0" w:uiPriority="61" w:semiHidden="0" w:name="Light List Accent 1"/>
+    <w:lsdException w:unhideWhenUsed="0" w:uiPriority="62" w:semiHidden="0" w:name="Light Grid Accent 1"/>
+    <w:lsdException w:unhideWhenUsed="0" w:uiPriority="63" w:semiHidden="0" w:name="Medium Shading 1 Accent 1"/>
+    <w:lsdException w:unhideWhenUsed="0" w:uiPriority="64" w:semiHidden="0" w:name="Medium Shading 2 Accent 1"/>
+    <w:lsdException w:unhideWhenUsed="0" w:uiPriority="65" w:semiHidden="0" w:name="Medium List 1 Accent 1"/>
+    <w:lsdException w:qFormat="1" w:unhideWhenUsed="0" w:uiPriority="34" w:semiHidden="0" w:name="List Paragraph"/>
+    <w:lsdException w:qFormat="1" w:unhideWhenUsed="0" w:uiPriority="29" w:semiHidden="0" w:name="Quote"/>
+    <w:lsdException w:qFormat="1" w:unhideWhenUsed="0" w:uiPriority="30" w:semiHidden="0" w:name="Intense Quote"/>
+    <w:lsdException w:unhideWhenUsed="0" w:uiPriority="66" w:semiHidden="0" w:name="Medium List 2 Accent 1"/>
+    <w:lsdException w:unhideWhenUsed="0" w:uiPriority="67" w:semiHidden="0" w:name="Medium Grid 1 Accent 1"/>
+    <w:lsdException w:unhideWhenUsed="0" w:uiPriority="68" w:semiHidden="0" w:name="Medium Grid 2 Accent 1"/>
+    <w:lsdException w:unhideWhenUsed="0" w:uiPriority="69" w:semiHidden="0" w:name="Medium Grid 3 Accent 1"/>
+    <w:lsdException w:unhideWhenUsed="0" w:uiPriority="70" w:semiHidden="0" w:name="Dark List Accent 1"/>
+    <w:lsdException w:unhideWhenUsed="0" w:uiPriority="71" w:semiHidden="0" w:name="Colorful Shading Accent 1"/>
+    <w:lsdException w:unhideWhenUsed="0" w:uiPriority="72" w:semiHidden="0" w:name="Colorful List Accent 1"/>
+    <w:lsdException w:unhideWhenUsed="0" w:uiPriority="73" w:semiHidden="0" w:name="Colorful Grid Accent 1"/>
+    <w:lsdException w:unhideWhenUsed="0" w:uiPriority="60" w:semiHidden="0" w:name="Light Shading Accent 2"/>
+    <w:lsdException w:unhideWhenUsed="0" w:uiPriority="61" w:semiHidden="0" w:name="Light List Accent 2"/>
+    <w:lsdException w:unhideWhenUsed="0" w:uiPriority="62" w:semiHidden="0" w:name="Light Grid Accent 2"/>
+    <w:lsdException w:unhideWhenUsed="0" w:uiPriority="63" w:semiHidden="0" w:name="Medium Shading 1 Accent 2"/>
+    <w:lsdException w:unhideWhenUsed="0" w:uiPriority="64" w:semiHidden="0" w:name="Medium Shading 2 Accent 2"/>
+    <w:lsdException w:unhideWhenUsed="0" w:uiPriority="65" w:semiHidden="0" w:name="Medium List 1 Accent 2"/>
+    <w:lsdException w:unhideWhenUsed="0" w:uiPriority="66" w:semiHidden="0" w:name="Medium List 2 Accent 2"/>
+    <w:lsdException w:unhideWhenUsed="0" w:uiPriority="67" w:semiHidden="0" w:name="Medium Grid 1 Accent 2"/>
+    <w:lsdException w:unhideWhenUsed="0" w:uiPriority="68" w:semiHidden="0" w:name="Medium Grid 2 Accent 2"/>
+    <w:lsdException w:unhideWhenUsed="0" w:uiPriority="69" w:semiHidden="0" w:name="Medium Grid 3 Accent 2"/>
+    <w:lsdException w:unhideWhenUsed="0" w:uiPriority="70" w:semiHidden="0" w:name="Dark List Accent 2"/>
+    <w:lsdException w:unhideWhenUsed="0" w:uiPriority="71" w:semiHidden="0" w:name="Colorful Shading Accent 2"/>
+    <w:lsdException w:unhideWhenUsed="0" w:uiPriority="72" w:semiHidden="0" w:name="Colorful List Accent 2"/>
+    <w:lsdException w:unhideWhenUsed="0" w:uiPriority="73" w:semiHidden="0" w:name="Colorful Grid Accent 2"/>
+    <w:lsdException w:unhideWhenUsed="0" w:uiPriority="60" w:semiHidden="0" w:name="Light Shading Accent 3"/>
+    <w:lsdException w:unhideWhenUsed="0" w:uiPriority="61" w:semiHidden="0" w:name="Light List Accent 3"/>
+    <w:lsdException w:unhideWhenUsed="0" w:uiPriority="62" w:semiHidden="0" w:name="Light Grid Accent 3"/>
+    <w:lsdException w:unhideWhenUsed="0" w:uiPriority="63" w:semiHidden="0" w:name="Medium Shading 1 Accent 3"/>
+    <w:lsdException w:unhideWhenUsed="0" w:uiPriority="64" w:semiHidden="0" w:name="Medium Shading 2 Accent 3"/>
+    <w:lsdException w:unhideWhenUsed="0" w:uiPriority="65" w:semiHidden="0" w:name="Medium List 1 Accent 3"/>
+    <w:lsdException w:unhideWhenUsed="0" w:uiPriority="66" w:semiHidden="0" w:name="Medium List 2 Accent 3"/>
+    <w:lsdException w:unhideWhenUsed="0" w:uiPriority="67" w:semiHidden="0" w:name="Medium Grid 1 Accent 3"/>
+    <w:lsdException w:unhideWhenUsed="0" w:uiPriority="68" w:semiHidden="0" w:name="Medium Grid 2 Accent 3"/>
+    <w:lsdException w:unhideWhenUsed="0" w:uiPriority="69" w:semiHidden="0" w:name="Medium Grid 3 Accent 3"/>
+    <w:lsdException w:unhideWhenUsed="0" w:uiPriority="70" w:semiHidden="0" w:name="Dark List Accent 3"/>
+    <w:lsdException w:unhideWhenUsed="0" w:uiPriority="71" w:semiHidden="0" w:name="Colorful Shading Accent 3"/>
+    <w:lsdException w:unhideWhenUsed="0" w:uiPriority="72" w:semiHidden="0" w:name="Colorful List Accent 3"/>
+    <w:lsdException w:unhideWhenUsed="0" w:uiPriority="73" w:semiHidden="0" w:name="Colorful Grid Accent 3"/>
+    <w:lsdException w:unhideWhenUsed="0" w:uiPriority="60" w:semiHidden="0" w:name="Light Shading Accent 4"/>
+    <w:lsdException w:unhideWhenUsed="0" w:uiPriority="61" w:semiHidden="0" w:name="Light List Accent 4"/>
+    <w:lsdException w:unhideWhenUsed="0" w:uiPriority="62" w:semiHidden="0" w:name="Light Grid Accent 4"/>
+    <w:lsdException w:unhideWhenUsed="0" w:uiPriority="63" w:semiHidden="0" w:name="Medium Shading 1 Accent 4"/>
+    <w:lsdException w:unhideWhenUsed="0" w:uiPriority="64" w:semiHidden="0" w:name="Medium Shading 2 Accent 4"/>
+    <w:lsdException w:unhideWhenUsed="0" w:uiPriority="65" w:semiHidden="0" w:name="Medium List 1 Accent 4"/>
+    <w:lsdException w:unhideWhenUsed="0" w:uiPriority="66" w:semiHidden="0" w:name="Medium List 2 Accent 4"/>
+    <w:lsdException w:unhideWhenUsed="0" w:uiPriority="67" w:semiHidden="0" w:name="Medium Grid 1 Accent 4"/>
+    <w:lsdException w:unhideWhenUsed="0" w:uiPriority="68" w:semiHidden="0" w:name="Medium Grid 2 Accent 4"/>
+    <w:lsdException w:unhideWhenUsed="0" w:uiPriority="69" w:semiHidden="0" w:name="Medium Grid 3 Accent 4"/>
+    <w:lsdException w:unhideWhenUsed="0" w:uiPriority="70" w:semiHidden="0" w:name="Dark List Accent 4"/>
+    <w:lsdException w:unhideWhenUsed="0" w:uiPriority="71" w:semiHidden="0" w:name="Colorful Shading Accent 4"/>
+    <w:lsdException w:unhideWhenUsed="0" w:uiPriority="72" w:semiHidden="0" w:name="Colorful List Accent 4"/>
+    <w:lsdException w:unhideWhenUsed="0" w:uiPriority="73" w:semiHidden="0" w:name="Colorful Grid Accent 4"/>
+    <w:lsdException w:unhideWhenUsed="0" w:uiPriority="60" w:semiHidden="0" w:name="Light Shading Accent 5"/>
+    <w:lsdException w:unhideWhenUsed="0" w:uiPriority="61" w:semiHidden="0" w:name="Light List Accent 5"/>
+    <w:lsdException w:unhideWhenUsed="0" w:uiPriority="62" w:semiHidden="0" w:name="Light Grid Accent 5"/>
+    <w:lsdException w:unhideWhenUsed="0" w:uiPriority="63" w:semiHidden="0" w:name="Medium Shading 1 Accent 5"/>
+    <w:lsdException w:unhideWhenUsed="0" w:uiPriority="64" w:semiHidden="0" w:name="Medium Shading 2 Accent 5"/>
+    <w:lsdException w:unhideWhenUsed="0" w:uiPriority="65" w:semiHidden="0" w:name="Medium List 1 Accent 5"/>
+    <w:lsdException w:unhideWhenUsed="0" w:uiPriority="66" w:semiHidden="0" w:name="Medium List 2 Accent 5"/>
+    <w:lsdException w:unhideWhenUsed="0" w:uiPriority="67" w:semiHidden="0" w:name="Medium Grid 1 Accent 5"/>
+    <w:lsdException w:unhideWhenUsed="0" w:uiPriority="68" w:semiHidden="0" w:name="Medium Grid 2 Accent 5"/>
+    <w:lsdException w:unhideWhenUsed="0" w:uiPriority="69" w:semiHidden="0" w:name="Medium Grid 3 Accent 5"/>
+    <w:lsdException w:unhideWhenUsed="0" w:uiPriority="70" w:semiHidden="0" w:name="Dark List Accent 5"/>
+    <w:lsdException w:unhideWhenUsed="0" w:uiPriority="71" w:semiHidden="0" w:name="Colorful Shading Accent 5"/>
+    <w:lsdException w:unhideWhenUsed="0" w:uiPriority="72" w:semiHidden="0" w:name="Colorful List Accent 5"/>
+    <w:lsdException w:unhideWhenUsed="0" w:uiPriority="73" w:semiHidden="0" w:name="Colorful Grid Accent 5"/>
+    <w:lsdException w:unhideWhenUsed="0" w:uiPriority="60" w:semiHidden="0" w:name="Light Shading Accent 6"/>
+    <w:lsdException w:unhideWhenUsed="0" w:uiPriority="61" w:semiHidden="0" w:name="Light List Accent 6"/>
+    <w:lsdException w:unhideWhenUsed="0" w:uiPriority="62" w:semiHidden="0" w:name="Light Grid Accent 6"/>
+    <w:lsdException w:unhideWhenUsed="0" w:uiPriority="63" w:semiHidden="0" w:name="Medium Shading 1 Accent 6"/>
+    <w:lsdException w:unhideWhenUsed="0" w:uiPriority="64" w:semiHidden="0" w:name="Medium Shading 2 Accent 6"/>
+    <w:lsdException w:unhideWhenUsed="0" w:uiPriority="65" w:semiHidden="0" w:name="Medium List 1 Accent 6"/>
+    <w:lsdException w:unhideWhenUsed="0" w:uiPriority="66" w:semiHidden="0" w:name="Medium List 2 Accent 6"/>
+    <w:lsdException w:unhideWhenUsed="0" w:uiPriority="67" w:semiHidden="0" w:name="Medium Grid 1 Accent 6"/>
+    <w:lsdException w:unhideWhenUsed="0" w:uiPriority="68" w:semiHidden="0" w:name="Medium Grid 2 Accent 6"/>
+    <w:lsdException w:unhideWhenUsed="0" w:uiPriority="69" w:semiHidden="0" w:name="Medium Grid 3 Accent 6"/>
+    <w:lsdException w:unhideWhenUsed="0" w:uiPriority="70" w:semiHidden="0" w:name="Dark List Accent 6"/>
+    <w:lsdException w:unhideWhenUsed="0" w:uiPriority="71" w:semiHidden="0" w:name="Colorful Shading Accent 6"/>
+    <w:lsdException w:unhideWhenUsed="0" w:uiPriority="72" w:semiHidden="0" w:name="Colorful List Accent 6"/>
+    <w:lsdException w:unhideWhenUsed="0" w:uiPriority="73" w:semiHidden="0" w:name="Colorful Grid Accent 6"/>
   </w:latentStyles>
-  <w:style w:type="paragraph" w:default="1" w:styleId="Normal">
+  <w:style w:type="paragraph" w:default="1" w:styleId="1">
     <w:name w:val="Normal"/>
     <w:qFormat/>
-    <w:rsid w:val="00835A76"/>
-  </w:style>
-  <w:style w:type="paragraph" w:styleId="Heading1">
+    <w:uiPriority w:val="0"/>
+    <w:pPr>
+      <w:spacing w:after="200" w:line="276" w:lineRule="auto"/>
+    </w:pPr>
+    <w:rPr>
+      <w:rFonts w:ascii="Times New Roman" w:hAnsi="Times New Roman" w:cs="Tahoma" w:eastAsiaTheme="minorHAnsi"/>
+      <w:sz w:val="24"/>
+      <w:szCs w:val="24"/>
+      <w:lang w:val="en-US" w:eastAsia="en-US" w:bidi="ar-SA"/>
+    </w:rPr>
+  </w:style>
+  <w:style w:type="paragraph" w:styleId="2">
     <w:name w:val="heading 1"/>
-    <w:basedOn w:val="Normal"/>
-    <w:next w:val="Normal"/>
-    <w:link w:val="Heading1Char"/>
+    <w:basedOn w:val="1"/>
+    <w:next w:val="1"/>
+    <w:link w:val="18"/>
+    <w:qFormat/>
     <w:uiPriority w:val="9"/>
-    <w:qFormat/>
-    <w:rsid w:val="000768F7"/>
     <w:pPr>
       <w:keepNext/>
       <w:keepLines/>
@@ -2969,22 +2666,21 @@
       <w:outlineLvl w:val="0"/>
     </w:pPr>
     <w:rPr>
-      <w:rFonts w:asciiTheme="majorHAnsi" w:eastAsiaTheme="majorEastAsia" w:hAnsiTheme="majorHAnsi" w:cstheme="majorBidi"/>
-      <w:color w:val="365F91" w:themeColor="accent1" w:themeShade="BF"/>
+      <w:rFonts w:asciiTheme="majorHAnsi" w:hAnsiTheme="majorHAnsi" w:eastAsiaTheme="majorEastAsia" w:cstheme="majorBidi"/>
+      <w:color w:val="376092" w:themeColor="accent1" w:themeShade="BF"/>
       <w:sz w:val="40"/>
       <w:szCs w:val="40"/>
     </w:rPr>
   </w:style>
-  <w:style w:type="paragraph" w:styleId="Heading2">
+  <w:style w:type="paragraph" w:styleId="3">
     <w:name w:val="heading 2"/>
-    <w:basedOn w:val="Normal"/>
-    <w:next w:val="Normal"/>
-    <w:link w:val="Heading2Char"/>
-    <w:uiPriority w:val="9"/>
+    <w:basedOn w:val="1"/>
+    <w:next w:val="1"/>
+    <w:link w:val="19"/>
     <w:semiHidden/>
     <w:unhideWhenUsed/>
     <w:qFormat/>
-    <w:rsid w:val="000768F7"/>
+    <w:uiPriority w:val="9"/>
     <w:pPr>
       <w:keepNext/>
       <w:keepLines/>
@@ -2992,22 +2688,21 @@
       <w:outlineLvl w:val="1"/>
     </w:pPr>
     <w:rPr>
-      <w:rFonts w:asciiTheme="majorHAnsi" w:eastAsiaTheme="majorEastAsia" w:hAnsiTheme="majorHAnsi" w:cstheme="majorBidi"/>
-      <w:color w:val="365F91" w:themeColor="accent1" w:themeShade="BF"/>
+      <w:rFonts w:asciiTheme="majorHAnsi" w:hAnsiTheme="majorHAnsi" w:eastAsiaTheme="majorEastAsia" w:cstheme="majorBidi"/>
+      <w:color w:val="376092" w:themeColor="accent1" w:themeShade="BF"/>
       <w:sz w:val="32"/>
       <w:szCs w:val="32"/>
     </w:rPr>
   </w:style>
-  <w:style w:type="paragraph" w:styleId="Heading3">
+  <w:style w:type="paragraph" w:styleId="4">
     <w:name w:val="heading 3"/>
-    <w:basedOn w:val="Normal"/>
-    <w:next w:val="Normal"/>
-    <w:link w:val="Heading3Char"/>
-    <w:uiPriority w:val="9"/>
+    <w:basedOn w:val="1"/>
+    <w:next w:val="1"/>
+    <w:link w:val="20"/>
     <w:semiHidden/>
     <w:unhideWhenUsed/>
     <w:qFormat/>
-    <w:rsid w:val="000768F7"/>
+    <w:uiPriority w:val="9"/>
     <w:pPr>
       <w:keepNext/>
       <w:keepLines/>
@@ -3015,22 +2710,21 @@
       <w:outlineLvl w:val="2"/>
     </w:pPr>
     <w:rPr>
-      <w:rFonts w:asciiTheme="minorHAnsi" w:eastAsiaTheme="majorEastAsia" w:hAnsiTheme="minorHAnsi" w:cstheme="majorBidi"/>
-      <w:color w:val="365F91" w:themeColor="accent1" w:themeShade="BF"/>
+      <w:rFonts w:asciiTheme="minorHAnsi" w:hAnsiTheme="minorHAnsi" w:eastAsiaTheme="majorEastAsia" w:cstheme="majorBidi"/>
+      <w:color w:val="376092" w:themeColor="accent1" w:themeShade="BF"/>
       <w:sz w:val="28"/>
       <w:szCs w:val="28"/>
     </w:rPr>
   </w:style>
-  <w:style w:type="paragraph" w:styleId="Heading4">
+  <w:style w:type="paragraph" w:styleId="5">
     <w:name w:val="heading 4"/>
-    <w:basedOn w:val="Normal"/>
-    <w:next w:val="Normal"/>
-    <w:link w:val="Heading4Char"/>
-    <w:uiPriority w:val="9"/>
+    <w:basedOn w:val="1"/>
+    <w:next w:val="1"/>
+    <w:link w:val="21"/>
     <w:semiHidden/>
     <w:unhideWhenUsed/>
     <w:qFormat/>
-    <w:rsid w:val="000768F7"/>
+    <w:uiPriority w:val="9"/>
     <w:pPr>
       <w:keepNext/>
       <w:keepLines/>
@@ -3038,22 +2732,21 @@
       <w:outlineLvl w:val="3"/>
     </w:pPr>
     <w:rPr>
-      <w:rFonts w:asciiTheme="minorHAnsi" w:eastAsiaTheme="majorEastAsia" w:hAnsiTheme="minorHAnsi" w:cstheme="majorBidi"/>
+      <w:rFonts w:asciiTheme="minorHAnsi" w:hAnsiTheme="minorHAnsi" w:eastAsiaTheme="majorEastAsia" w:cstheme="majorBidi"/>
       <w:i/>
       <w:iCs/>
-      <w:color w:val="365F91" w:themeColor="accent1" w:themeShade="BF"/>
+      <w:color w:val="376092" w:themeColor="accent1" w:themeShade="BF"/>
     </w:rPr>
   </w:style>
-  <w:style w:type="paragraph" w:styleId="Heading5">
+  <w:style w:type="paragraph" w:styleId="6">
     <w:name w:val="heading 5"/>
-    <w:basedOn w:val="Normal"/>
-    <w:next w:val="Normal"/>
-    <w:link w:val="Heading5Char"/>
-    <w:uiPriority w:val="9"/>
+    <w:basedOn w:val="1"/>
+    <w:next w:val="1"/>
+    <w:link w:val="22"/>
     <w:semiHidden/>
     <w:unhideWhenUsed/>
     <w:qFormat/>
-    <w:rsid w:val="000768F7"/>
+    <w:uiPriority w:val="9"/>
     <w:pPr>
       <w:keepNext/>
       <w:keepLines/>
@@ -3061,20 +2754,19 @@
       <w:outlineLvl w:val="4"/>
     </w:pPr>
     <w:rPr>
-      <w:rFonts w:asciiTheme="minorHAnsi" w:eastAsiaTheme="majorEastAsia" w:hAnsiTheme="minorHAnsi" w:cstheme="majorBidi"/>
-      <w:color w:val="365F91" w:themeColor="accent1" w:themeShade="BF"/>
+      <w:rFonts w:asciiTheme="minorHAnsi" w:hAnsiTheme="minorHAnsi" w:eastAsiaTheme="majorEastAsia" w:cstheme="majorBidi"/>
+      <w:color w:val="376092" w:themeColor="accent1" w:themeShade="BF"/>
     </w:rPr>
   </w:style>
-  <w:style w:type="paragraph" w:styleId="Heading6">
+  <w:style w:type="paragraph" w:styleId="7">
     <w:name w:val="heading 6"/>
-    <w:basedOn w:val="Normal"/>
-    <w:next w:val="Normal"/>
-    <w:link w:val="Heading6Char"/>
-    <w:uiPriority w:val="9"/>
+    <w:basedOn w:val="1"/>
+    <w:next w:val="1"/>
+    <w:link w:val="23"/>
     <w:semiHidden/>
     <w:unhideWhenUsed/>
     <w:qFormat/>
-    <w:rsid w:val="000768F7"/>
+    <w:uiPriority w:val="9"/>
     <w:pPr>
       <w:keepNext/>
       <w:keepLines/>
@@ -3082,22 +2774,29 @@
       <w:outlineLvl w:val="5"/>
     </w:pPr>
     <w:rPr>
-      <w:rFonts w:asciiTheme="minorHAnsi" w:eastAsiaTheme="majorEastAsia" w:hAnsiTheme="minorHAnsi" w:cstheme="majorBidi"/>
+      <w:rFonts w:asciiTheme="minorHAnsi" w:hAnsiTheme="minorHAnsi" w:eastAsiaTheme="majorEastAsia" w:cstheme="majorBidi"/>
       <w:i/>
       <w:iCs/>
       <w:color w:val="595959" w:themeColor="text1" w:themeTint="A6"/>
+      <w14:textFill>
+        <w14:solidFill>
+          <w14:schemeClr w14:val="tx1">
+            <w14:lumMod w14:val="65000"/>
+            <w14:lumOff w14:val="35000"/>
+          </w14:schemeClr>
+        </w14:solidFill>
+      </w14:textFill>
     </w:rPr>
   </w:style>
-  <w:style w:type="paragraph" w:styleId="Heading7">
+  <w:style w:type="paragraph" w:styleId="8">
     <w:name w:val="heading 7"/>
-    <w:basedOn w:val="Normal"/>
-    <w:next w:val="Normal"/>
-    <w:link w:val="Heading7Char"/>
-    <w:uiPriority w:val="9"/>
+    <w:basedOn w:val="1"/>
+    <w:next w:val="1"/>
+    <w:link w:val="24"/>
     <w:semiHidden/>
     <w:unhideWhenUsed/>
     <w:qFormat/>
-    <w:rsid w:val="000768F7"/>
+    <w:uiPriority w:val="9"/>
     <w:pPr>
       <w:keepNext/>
       <w:keepLines/>
@@ -3105,20 +2804,27 @@
       <w:outlineLvl w:val="6"/>
     </w:pPr>
     <w:rPr>
-      <w:rFonts w:asciiTheme="minorHAnsi" w:eastAsiaTheme="majorEastAsia" w:hAnsiTheme="minorHAnsi" w:cstheme="majorBidi"/>
+      <w:rFonts w:asciiTheme="minorHAnsi" w:hAnsiTheme="minorHAnsi" w:eastAsiaTheme="majorEastAsia" w:cstheme="majorBidi"/>
       <w:color w:val="595959" w:themeColor="text1" w:themeTint="A6"/>
+      <w14:textFill>
+        <w14:solidFill>
+          <w14:schemeClr w14:val="tx1">
+            <w14:lumMod w14:val="65000"/>
+            <w14:lumOff w14:val="35000"/>
+          </w14:schemeClr>
+        </w14:solidFill>
+      </w14:textFill>
     </w:rPr>
   </w:style>
-  <w:style w:type="paragraph" w:styleId="Heading8">
+  <w:style w:type="paragraph" w:styleId="9">
     <w:name w:val="heading 8"/>
-    <w:basedOn w:val="Normal"/>
-    <w:next w:val="Normal"/>
-    <w:link w:val="Heading8Char"/>
-    <w:uiPriority w:val="9"/>
+    <w:basedOn w:val="1"/>
+    <w:next w:val="1"/>
+    <w:link w:val="25"/>
     <w:semiHidden/>
     <w:unhideWhenUsed/>
     <w:qFormat/>
-    <w:rsid w:val="000768F7"/>
+    <w:uiPriority w:val="9"/>
     <w:pPr>
       <w:keepNext/>
       <w:keepLines/>
@@ -3126,22 +2832,29 @@
       <w:outlineLvl w:val="7"/>
     </w:pPr>
     <w:rPr>
-      <w:rFonts w:asciiTheme="minorHAnsi" w:eastAsiaTheme="majorEastAsia" w:hAnsiTheme="minorHAnsi" w:cstheme="majorBidi"/>
+      <w:rFonts w:asciiTheme="minorHAnsi" w:hAnsiTheme="minorHAnsi" w:eastAsiaTheme="majorEastAsia" w:cstheme="majorBidi"/>
       <w:i/>
       <w:iCs/>
-      <w:color w:val="272727" w:themeColor="text1" w:themeTint="D8"/>
+      <w:color w:val="262626" w:themeColor="text1" w:themeTint="D9"/>
+      <w14:textFill>
+        <w14:solidFill>
+          <w14:schemeClr w14:val="tx1">
+            <w14:lumMod w14:val="85000"/>
+            <w14:lumOff w14:val="15000"/>
+          </w14:schemeClr>
+        </w14:solidFill>
+      </w14:textFill>
     </w:rPr>
   </w:style>
-  <w:style w:type="paragraph" w:styleId="Heading9">
+  <w:style w:type="paragraph" w:styleId="10">
     <w:name w:val="heading 9"/>
-    <w:basedOn w:val="Normal"/>
-    <w:next w:val="Normal"/>
-    <w:link w:val="Heading9Char"/>
-    <w:uiPriority w:val="9"/>
+    <w:basedOn w:val="1"/>
+    <w:next w:val="1"/>
+    <w:link w:val="26"/>
     <w:semiHidden/>
     <w:unhideWhenUsed/>
     <w:qFormat/>
-    <w:rsid w:val="000768F7"/>
+    <w:uiPriority w:val="9"/>
     <w:pPr>
       <w:keepNext/>
       <w:keepLines/>
@@ -3149,23 +2862,30 @@
       <w:outlineLvl w:val="8"/>
     </w:pPr>
     <w:rPr>
-      <w:rFonts w:asciiTheme="minorHAnsi" w:eastAsiaTheme="majorEastAsia" w:hAnsiTheme="minorHAnsi" w:cstheme="majorBidi"/>
-      <w:color w:val="272727" w:themeColor="text1" w:themeTint="D8"/>
+      <w:rFonts w:asciiTheme="minorHAnsi" w:hAnsiTheme="minorHAnsi" w:eastAsiaTheme="majorEastAsia" w:cstheme="majorBidi"/>
+      <w:color w:val="262626" w:themeColor="text1" w:themeTint="D9"/>
+      <w14:textFill>
+        <w14:solidFill>
+          <w14:schemeClr w14:val="tx1">
+            <w14:lumMod w14:val="85000"/>
+            <w14:lumOff w14:val="15000"/>
+          </w14:schemeClr>
+        </w14:solidFill>
+      </w14:textFill>
     </w:rPr>
   </w:style>
-  <w:style w:type="character" w:default="1" w:styleId="DefaultParagraphFont">
+  <w:style w:type="character" w:default="1" w:styleId="11">
     <w:name w:val="Default Paragraph Font"/>
-    <w:uiPriority w:val="1"/>
     <w:semiHidden/>
     <w:unhideWhenUsed/>
-  </w:style>
-  <w:style w:type="table" w:default="1" w:styleId="TableNormal">
+    <w:uiPriority w:val="1"/>
+  </w:style>
+  <w:style w:type="table" w:default="1" w:styleId="12">
     <w:name w:val="Normal Table"/>
-    <w:uiPriority w:val="99"/>
     <w:semiHidden/>
     <w:unhideWhenUsed/>
+    <w:uiPriority w:val="99"/>
     <w:tblPr>
-      <w:tblInd w:w="0" w:type="dxa"/>
       <w:tblCellMar>
         <w:top w:w="0" w:type="dxa"/>
         <w:left w:w="108" w:type="dxa"/>
@@ -3174,209 +2894,280 @@
       </w:tblCellMar>
     </w:tblPr>
   </w:style>
-  <w:style w:type="numbering" w:default="1" w:styleId="NoList">
-    <w:name w:val="No List"/>
+  <w:style w:type="paragraph" w:styleId="13">
+    <w:name w:val="footer"/>
+    <w:basedOn w:val="1"/>
+    <w:link w:val="38"/>
+    <w:unhideWhenUsed/>
     <w:uiPriority w:val="99"/>
-    <w:semiHidden/>
+    <w:pPr>
+      <w:tabs>
+        <w:tab w:val="center" w:pos="4680"/>
+        <w:tab w:val="right" w:pos="9360"/>
+      </w:tabs>
+      <w:spacing w:after="0" w:line="240" w:lineRule="auto"/>
+    </w:pPr>
+  </w:style>
+  <w:style w:type="paragraph" w:styleId="14">
+    <w:name w:val="header"/>
+    <w:basedOn w:val="1"/>
+    <w:link w:val="37"/>
     <w:unhideWhenUsed/>
-  </w:style>
-  <w:style w:type="character" w:customStyle="1" w:styleId="Heading1Char">
-    <w:name w:val="Heading 1 Char"/>
-    <w:basedOn w:val="DefaultParagraphFont"/>
-    <w:link w:val="Heading1"/>
-    <w:uiPriority w:val="9"/>
-    <w:rsid w:val="000768F7"/>
+    <w:uiPriority w:val="99"/>
+    <w:pPr>
+      <w:tabs>
+        <w:tab w:val="center" w:pos="4680"/>
+        <w:tab w:val="right" w:pos="9360"/>
+      </w:tabs>
+      <w:spacing w:after="0" w:line="240" w:lineRule="auto"/>
+    </w:pPr>
+  </w:style>
+  <w:style w:type="character" w:styleId="15">
+    <w:name w:val="Hyperlink"/>
+    <w:basedOn w:val="11"/>
+    <w:unhideWhenUsed/>
+    <w:uiPriority w:val="99"/>
     <w:rPr>
-      <w:rFonts w:asciiTheme="majorHAnsi" w:eastAsiaTheme="majorEastAsia" w:hAnsiTheme="majorHAnsi" w:cstheme="majorBidi"/>
-      <w:color w:val="365F91" w:themeColor="accent1" w:themeShade="BF"/>
-      <w:sz w:val="40"/>
-      <w:szCs w:val="40"/>
+      <w:color w:val="0000FF" w:themeColor="hyperlink"/>
+      <w:u w:val="single"/>
+      <w14:textFill>
+        <w14:solidFill>
+          <w14:schemeClr w14:val="hlink"/>
+        </w14:solidFill>
+      </w14:textFill>
     </w:rPr>
   </w:style>
-  <w:style w:type="character" w:customStyle="1" w:styleId="Heading2Char">
-    <w:name w:val="Heading 2 Char"/>
-    <w:basedOn w:val="DefaultParagraphFont"/>
-    <w:link w:val="Heading2"/>
-    <w:uiPriority w:val="9"/>
-    <w:semiHidden/>
-    <w:rsid w:val="000768F7"/>
+  <w:style w:type="paragraph" w:styleId="16">
+    <w:name w:val="Subtitle"/>
+    <w:basedOn w:val="1"/>
+    <w:next w:val="1"/>
+    <w:link w:val="28"/>
+    <w:qFormat/>
+    <w:uiPriority w:val="11"/>
+    <w:pPr>
+      <w:spacing w:after="160"/>
+    </w:pPr>
     <w:rPr>
-      <w:rFonts w:asciiTheme="majorHAnsi" w:eastAsiaTheme="majorEastAsia" w:hAnsiTheme="majorHAnsi" w:cstheme="majorBidi"/>
-      <w:color w:val="365F91" w:themeColor="accent1" w:themeShade="BF"/>
-      <w:sz w:val="32"/>
-      <w:szCs w:val="32"/>
-    </w:rPr>
-  </w:style>
-  <w:style w:type="character" w:customStyle="1" w:styleId="Heading3Char">
-    <w:name w:val="Heading 3 Char"/>
-    <w:basedOn w:val="DefaultParagraphFont"/>
-    <w:link w:val="Heading3"/>
-    <w:uiPriority w:val="9"/>
-    <w:semiHidden/>
-    <w:rsid w:val="000768F7"/>
-    <w:rPr>
-      <w:rFonts w:asciiTheme="minorHAnsi" w:eastAsiaTheme="majorEastAsia" w:hAnsiTheme="minorHAnsi" w:cstheme="majorBidi"/>
-      <w:color w:val="365F91" w:themeColor="accent1" w:themeShade="BF"/>
+      <w:rFonts w:asciiTheme="minorHAnsi" w:hAnsiTheme="minorHAnsi" w:eastAsiaTheme="majorEastAsia" w:cstheme="majorBidi"/>
+      <w:color w:val="595959" w:themeColor="text1" w:themeTint="A6"/>
+      <w:spacing w:val="15"/>
       <w:sz w:val="28"/>
       <w:szCs w:val="28"/>
+      <w14:textFill>
+        <w14:solidFill>
+          <w14:schemeClr w14:val="tx1">
+            <w14:lumMod w14:val="65000"/>
+            <w14:lumOff w14:val="35000"/>
+          </w14:schemeClr>
+        </w14:solidFill>
+      </w14:textFill>
     </w:rPr>
   </w:style>
-  <w:style w:type="character" w:customStyle="1" w:styleId="Heading4Char">
-    <w:name w:val="Heading 4 Char"/>
-    <w:basedOn w:val="DefaultParagraphFont"/>
-    <w:link w:val="Heading4"/>
-    <w:uiPriority w:val="9"/>
-    <w:semiHidden/>
-    <w:rsid w:val="000768F7"/>
-    <w:rPr>
-      <w:rFonts w:asciiTheme="minorHAnsi" w:eastAsiaTheme="majorEastAsia" w:hAnsiTheme="minorHAnsi" w:cstheme="majorBidi"/>
-      <w:i/>
-      <w:iCs/>
-      <w:color w:val="365F91" w:themeColor="accent1" w:themeShade="BF"/>
-    </w:rPr>
-  </w:style>
-  <w:style w:type="character" w:customStyle="1" w:styleId="Heading5Char">
-    <w:name w:val="Heading 5 Char"/>
-    <w:basedOn w:val="DefaultParagraphFont"/>
-    <w:link w:val="Heading5"/>
-    <w:uiPriority w:val="9"/>
-    <w:semiHidden/>
-    <w:rsid w:val="000768F7"/>
-    <w:rPr>
-      <w:rFonts w:asciiTheme="minorHAnsi" w:eastAsiaTheme="majorEastAsia" w:hAnsiTheme="minorHAnsi" w:cstheme="majorBidi"/>
-      <w:color w:val="365F91" w:themeColor="accent1" w:themeShade="BF"/>
-    </w:rPr>
-  </w:style>
-  <w:style w:type="character" w:customStyle="1" w:styleId="Heading6Char">
-    <w:name w:val="Heading 6 Char"/>
-    <w:basedOn w:val="DefaultParagraphFont"/>
-    <w:link w:val="Heading6"/>
-    <w:uiPriority w:val="9"/>
-    <w:semiHidden/>
-    <w:rsid w:val="000768F7"/>
-    <w:rPr>
-      <w:rFonts w:asciiTheme="minorHAnsi" w:eastAsiaTheme="majorEastAsia" w:hAnsiTheme="minorHAnsi" w:cstheme="majorBidi"/>
-      <w:i/>
-      <w:iCs/>
-      <w:color w:val="595959" w:themeColor="text1" w:themeTint="A6"/>
-    </w:rPr>
-  </w:style>
-  <w:style w:type="character" w:customStyle="1" w:styleId="Heading7Char">
-    <w:name w:val="Heading 7 Char"/>
-    <w:basedOn w:val="DefaultParagraphFont"/>
-    <w:link w:val="Heading7"/>
-    <w:uiPriority w:val="9"/>
-    <w:semiHidden/>
-    <w:rsid w:val="000768F7"/>
-    <w:rPr>
-      <w:rFonts w:asciiTheme="minorHAnsi" w:eastAsiaTheme="majorEastAsia" w:hAnsiTheme="minorHAnsi" w:cstheme="majorBidi"/>
-      <w:color w:val="595959" w:themeColor="text1" w:themeTint="A6"/>
-    </w:rPr>
-  </w:style>
-  <w:style w:type="character" w:customStyle="1" w:styleId="Heading8Char">
-    <w:name w:val="Heading 8 Char"/>
-    <w:basedOn w:val="DefaultParagraphFont"/>
-    <w:link w:val="Heading8"/>
-    <w:uiPriority w:val="9"/>
-    <w:semiHidden/>
-    <w:rsid w:val="000768F7"/>
-    <w:rPr>
-      <w:rFonts w:asciiTheme="minorHAnsi" w:eastAsiaTheme="majorEastAsia" w:hAnsiTheme="minorHAnsi" w:cstheme="majorBidi"/>
-      <w:i/>
-      <w:iCs/>
-      <w:color w:val="272727" w:themeColor="text1" w:themeTint="D8"/>
-    </w:rPr>
-  </w:style>
-  <w:style w:type="character" w:customStyle="1" w:styleId="Heading9Char">
-    <w:name w:val="Heading 9 Char"/>
-    <w:basedOn w:val="DefaultParagraphFont"/>
-    <w:link w:val="Heading9"/>
-    <w:uiPriority w:val="9"/>
-    <w:semiHidden/>
-    <w:rsid w:val="000768F7"/>
-    <w:rPr>
-      <w:rFonts w:asciiTheme="minorHAnsi" w:eastAsiaTheme="majorEastAsia" w:hAnsiTheme="minorHAnsi" w:cstheme="majorBidi"/>
-      <w:color w:val="272727" w:themeColor="text1" w:themeTint="D8"/>
-    </w:rPr>
-  </w:style>
-  <w:style w:type="paragraph" w:styleId="Title">
+  <w:style w:type="paragraph" w:styleId="17">
     <w:name w:val="Title"/>
-    <w:basedOn w:val="Normal"/>
-    <w:next w:val="Normal"/>
-    <w:link w:val="TitleChar"/>
+    <w:basedOn w:val="1"/>
+    <w:next w:val="1"/>
+    <w:link w:val="27"/>
+    <w:qFormat/>
     <w:uiPriority w:val="10"/>
-    <w:qFormat/>
-    <w:rsid w:val="000768F7"/>
     <w:pPr>
       <w:spacing w:after="80" w:line="240" w:lineRule="auto"/>
       <w:contextualSpacing/>
     </w:pPr>
     <w:rPr>
-      <w:rFonts w:asciiTheme="majorHAnsi" w:eastAsiaTheme="majorEastAsia" w:hAnsiTheme="majorHAnsi" w:cstheme="majorBidi"/>
+      <w:rFonts w:asciiTheme="majorHAnsi" w:hAnsiTheme="majorHAnsi" w:eastAsiaTheme="majorEastAsia" w:cstheme="majorBidi"/>
       <w:spacing w:val="-10"/>
       <w:kern w:val="28"/>
       <w:sz w:val="56"/>
       <w:szCs w:val="56"/>
     </w:rPr>
   </w:style>
-  <w:style w:type="character" w:customStyle="1" w:styleId="TitleChar">
+  <w:style w:type="character" w:customStyle="1" w:styleId="18">
+    <w:name w:val="Heading 1 Char"/>
+    <w:basedOn w:val="11"/>
+    <w:link w:val="2"/>
+    <w:qFormat/>
+    <w:uiPriority w:val="9"/>
+    <w:rPr>
+      <w:rFonts w:asciiTheme="majorHAnsi" w:hAnsiTheme="majorHAnsi" w:eastAsiaTheme="majorEastAsia" w:cstheme="majorBidi"/>
+      <w:color w:val="376092" w:themeColor="accent1" w:themeShade="BF"/>
+      <w:sz w:val="40"/>
+      <w:szCs w:val="40"/>
+    </w:rPr>
+  </w:style>
+  <w:style w:type="character" w:customStyle="1" w:styleId="19">
+    <w:name w:val="Heading 2 Char"/>
+    <w:basedOn w:val="11"/>
+    <w:link w:val="3"/>
+    <w:semiHidden/>
+    <w:uiPriority w:val="9"/>
+    <w:rPr>
+      <w:rFonts w:asciiTheme="majorHAnsi" w:hAnsiTheme="majorHAnsi" w:eastAsiaTheme="majorEastAsia" w:cstheme="majorBidi"/>
+      <w:color w:val="376092" w:themeColor="accent1" w:themeShade="BF"/>
+      <w:sz w:val="32"/>
+      <w:szCs w:val="32"/>
+    </w:rPr>
+  </w:style>
+  <w:style w:type="character" w:customStyle="1" w:styleId="20">
+    <w:name w:val="Heading 3 Char"/>
+    <w:basedOn w:val="11"/>
+    <w:link w:val="4"/>
+    <w:semiHidden/>
+    <w:uiPriority w:val="9"/>
+    <w:rPr>
+      <w:rFonts w:asciiTheme="minorHAnsi" w:hAnsiTheme="minorHAnsi" w:eastAsiaTheme="majorEastAsia" w:cstheme="majorBidi"/>
+      <w:color w:val="376092" w:themeColor="accent1" w:themeShade="BF"/>
+      <w:sz w:val="28"/>
+      <w:szCs w:val="28"/>
+    </w:rPr>
+  </w:style>
+  <w:style w:type="character" w:customStyle="1" w:styleId="21">
+    <w:name w:val="Heading 4 Char"/>
+    <w:basedOn w:val="11"/>
+    <w:link w:val="5"/>
+    <w:semiHidden/>
+    <w:uiPriority w:val="9"/>
+    <w:rPr>
+      <w:rFonts w:asciiTheme="minorHAnsi" w:hAnsiTheme="minorHAnsi" w:eastAsiaTheme="majorEastAsia" w:cstheme="majorBidi"/>
+      <w:i/>
+      <w:iCs/>
+      <w:color w:val="376092" w:themeColor="accent1" w:themeShade="BF"/>
+    </w:rPr>
+  </w:style>
+  <w:style w:type="character" w:customStyle="1" w:styleId="22">
+    <w:name w:val="Heading 5 Char"/>
+    <w:basedOn w:val="11"/>
+    <w:link w:val="6"/>
+    <w:semiHidden/>
+    <w:uiPriority w:val="9"/>
+    <w:rPr>
+      <w:rFonts w:asciiTheme="minorHAnsi" w:hAnsiTheme="minorHAnsi" w:eastAsiaTheme="majorEastAsia" w:cstheme="majorBidi"/>
+      <w:color w:val="376092" w:themeColor="accent1" w:themeShade="BF"/>
+    </w:rPr>
+  </w:style>
+  <w:style w:type="character" w:customStyle="1" w:styleId="23">
+    <w:name w:val="Heading 6 Char"/>
+    <w:basedOn w:val="11"/>
+    <w:link w:val="7"/>
+    <w:semiHidden/>
+    <w:uiPriority w:val="9"/>
+    <w:rPr>
+      <w:rFonts w:asciiTheme="minorHAnsi" w:hAnsiTheme="minorHAnsi" w:eastAsiaTheme="majorEastAsia" w:cstheme="majorBidi"/>
+      <w:i/>
+      <w:iCs/>
+      <w:color w:val="595959" w:themeColor="text1" w:themeTint="A6"/>
+      <w14:textFill>
+        <w14:solidFill>
+          <w14:schemeClr w14:val="tx1">
+            <w14:lumMod w14:val="65000"/>
+            <w14:lumOff w14:val="35000"/>
+          </w14:schemeClr>
+        </w14:solidFill>
+      </w14:textFill>
+    </w:rPr>
+  </w:style>
+  <w:style w:type="character" w:customStyle="1" w:styleId="24">
+    <w:name w:val="Heading 7 Char"/>
+    <w:basedOn w:val="11"/>
+    <w:link w:val="8"/>
+    <w:semiHidden/>
+    <w:uiPriority w:val="9"/>
+    <w:rPr>
+      <w:rFonts w:asciiTheme="minorHAnsi" w:hAnsiTheme="minorHAnsi" w:eastAsiaTheme="majorEastAsia" w:cstheme="majorBidi"/>
+      <w:color w:val="595959" w:themeColor="text1" w:themeTint="A6"/>
+      <w14:textFill>
+        <w14:solidFill>
+          <w14:schemeClr w14:val="tx1">
+            <w14:lumMod w14:val="65000"/>
+            <w14:lumOff w14:val="35000"/>
+          </w14:schemeClr>
+        </w14:solidFill>
+      </w14:textFill>
+    </w:rPr>
+  </w:style>
+  <w:style w:type="character" w:customStyle="1" w:styleId="25">
+    <w:name w:val="Heading 8 Char"/>
+    <w:basedOn w:val="11"/>
+    <w:link w:val="9"/>
+    <w:semiHidden/>
+    <w:uiPriority w:val="9"/>
+    <w:rPr>
+      <w:rFonts w:asciiTheme="minorHAnsi" w:hAnsiTheme="minorHAnsi" w:eastAsiaTheme="majorEastAsia" w:cstheme="majorBidi"/>
+      <w:i/>
+      <w:iCs/>
+      <w:color w:val="262626" w:themeColor="text1" w:themeTint="D9"/>
+      <w14:textFill>
+        <w14:solidFill>
+          <w14:schemeClr w14:val="tx1">
+            <w14:lumMod w14:val="85000"/>
+            <w14:lumOff w14:val="15000"/>
+          </w14:schemeClr>
+        </w14:solidFill>
+      </w14:textFill>
+    </w:rPr>
+  </w:style>
+  <w:style w:type="character" w:customStyle="1" w:styleId="26">
+    <w:name w:val="Heading 9 Char"/>
+    <w:basedOn w:val="11"/>
+    <w:link w:val="10"/>
+    <w:semiHidden/>
+    <w:qFormat/>
+    <w:uiPriority w:val="9"/>
+    <w:rPr>
+      <w:rFonts w:asciiTheme="minorHAnsi" w:hAnsiTheme="minorHAnsi" w:eastAsiaTheme="majorEastAsia" w:cstheme="majorBidi"/>
+      <w:color w:val="262626" w:themeColor="text1" w:themeTint="D9"/>
+      <w14:textFill>
+        <w14:solidFill>
+          <w14:schemeClr w14:val="tx1">
+            <w14:lumMod w14:val="85000"/>
+            <w14:lumOff w14:val="15000"/>
+          </w14:schemeClr>
+        </w14:solidFill>
+      </w14:textFill>
+    </w:rPr>
+  </w:style>
+  <w:style w:type="character" w:customStyle="1" w:styleId="27">
     <w:name w:val="Title Char"/>
-    <w:basedOn w:val="DefaultParagraphFont"/>
-    <w:link w:val="Title"/>
+    <w:basedOn w:val="11"/>
+    <w:link w:val="17"/>
+    <w:qFormat/>
     <w:uiPriority w:val="10"/>
-    <w:rsid w:val="000768F7"/>
     <w:rPr>
-      <w:rFonts w:asciiTheme="majorHAnsi" w:eastAsiaTheme="majorEastAsia" w:hAnsiTheme="majorHAnsi" w:cstheme="majorBidi"/>
+      <w:rFonts w:asciiTheme="majorHAnsi" w:hAnsiTheme="majorHAnsi" w:eastAsiaTheme="majorEastAsia" w:cstheme="majorBidi"/>
       <w:spacing w:val="-10"/>
       <w:kern w:val="28"/>
       <w:sz w:val="56"/>
       <w:szCs w:val="56"/>
     </w:rPr>
   </w:style>
-  <w:style w:type="paragraph" w:styleId="Subtitle">
-    <w:name w:val="Subtitle"/>
-    <w:basedOn w:val="Normal"/>
-    <w:next w:val="Normal"/>
-    <w:link w:val="SubtitleChar"/>
+  <w:style w:type="character" w:customStyle="1" w:styleId="28">
+    <w:name w:val="Subtitle Char"/>
+    <w:basedOn w:val="11"/>
+    <w:link w:val="16"/>
     <w:uiPriority w:val="11"/>
-    <w:qFormat/>
-    <w:rsid w:val="000768F7"/>
-    <w:pPr>
-      <w:numPr>
-        <w:ilvl w:val="1"/>
-      </w:numPr>
-      <w:spacing w:after="160"/>
-    </w:pPr>
     <w:rPr>
-      <w:rFonts w:asciiTheme="minorHAnsi" w:eastAsiaTheme="majorEastAsia" w:hAnsiTheme="minorHAnsi" w:cstheme="majorBidi"/>
+      <w:rFonts w:asciiTheme="minorHAnsi" w:hAnsiTheme="minorHAnsi" w:eastAsiaTheme="majorEastAsia" w:cstheme="majorBidi"/>
       <w:color w:val="595959" w:themeColor="text1" w:themeTint="A6"/>
       <w:spacing w:val="15"/>
       <w:sz w:val="28"/>
       <w:szCs w:val="28"/>
+      <w14:textFill>
+        <w14:solidFill>
+          <w14:schemeClr w14:val="tx1">
+            <w14:lumMod w14:val="65000"/>
+            <w14:lumOff w14:val="35000"/>
+          </w14:schemeClr>
+        </w14:solidFill>
+      </w14:textFill>
     </w:rPr>
   </w:style>
-  <w:style w:type="character" w:customStyle="1" w:styleId="SubtitleChar">
-    <w:name w:val="Subtitle Char"/>
-    <w:basedOn w:val="DefaultParagraphFont"/>
-    <w:link w:val="Subtitle"/>
-    <w:uiPriority w:val="11"/>
-    <w:rsid w:val="000768F7"/>
-    <w:rPr>
-      <w:rFonts w:asciiTheme="minorHAnsi" w:eastAsiaTheme="majorEastAsia" w:hAnsiTheme="minorHAnsi" w:cstheme="majorBidi"/>
-      <w:color w:val="595959" w:themeColor="text1" w:themeTint="A6"/>
-      <w:spacing w:val="15"/>
-      <w:sz w:val="28"/>
-      <w:szCs w:val="28"/>
-    </w:rPr>
-  </w:style>
-  <w:style w:type="paragraph" w:styleId="Quote">
+  <w:style w:type="paragraph" w:styleId="29">
     <w:name w:val="Quote"/>
-    <w:basedOn w:val="Normal"/>
-    <w:next w:val="Normal"/>
-    <w:link w:val="QuoteChar"/>
+    <w:basedOn w:val="1"/>
+    <w:next w:val="1"/>
+    <w:link w:val="30"/>
+    <w:qFormat/>
     <w:uiPriority w:val="29"/>
-    <w:qFormat/>
-    <w:rsid w:val="000768F7"/>
     <w:pPr>
       <w:spacing w:before="160" w:after="160"/>
       <w:jc w:val="center"/>
@@ -3385,55 +3176,67 @@
       <w:i/>
       <w:iCs/>
       <w:color w:val="404040" w:themeColor="text1" w:themeTint="BF"/>
+      <w14:textFill>
+        <w14:solidFill>
+          <w14:schemeClr w14:val="tx1">
+            <w14:lumMod w14:val="75000"/>
+            <w14:lumOff w14:val="25000"/>
+          </w14:schemeClr>
+        </w14:solidFill>
+      </w14:textFill>
     </w:rPr>
   </w:style>
-  <w:style w:type="character" w:customStyle="1" w:styleId="QuoteChar">
+  <w:style w:type="character" w:customStyle="1" w:styleId="30">
     <w:name w:val="Quote Char"/>
-    <w:basedOn w:val="DefaultParagraphFont"/>
-    <w:link w:val="Quote"/>
+    <w:basedOn w:val="11"/>
+    <w:link w:val="29"/>
     <w:uiPriority w:val="29"/>
-    <w:rsid w:val="000768F7"/>
     <w:rPr>
       <w:i/>
       <w:iCs/>
       <w:color w:val="404040" w:themeColor="text1" w:themeTint="BF"/>
+      <w14:textFill>
+        <w14:solidFill>
+          <w14:schemeClr w14:val="tx1">
+            <w14:lumMod w14:val="75000"/>
+            <w14:lumOff w14:val="25000"/>
+          </w14:schemeClr>
+        </w14:solidFill>
+      </w14:textFill>
     </w:rPr>
   </w:style>
-  <w:style w:type="paragraph" w:styleId="ListParagraph">
+  <w:style w:type="paragraph" w:styleId="31">
     <w:name w:val="List Paragraph"/>
-    <w:basedOn w:val="Normal"/>
+    <w:basedOn w:val="1"/>
+    <w:qFormat/>
     <w:uiPriority w:val="34"/>
-    <w:qFormat/>
-    <w:rsid w:val="000768F7"/>
     <w:pPr>
       <w:ind w:left="720"/>
       <w:contextualSpacing/>
     </w:pPr>
   </w:style>
-  <w:style w:type="character" w:styleId="IntenseEmphasis">
+  <w:style w:type="character" w:customStyle="1" w:styleId="32">
     <w:name w:val="Intense Emphasis"/>
-    <w:basedOn w:val="DefaultParagraphFont"/>
+    <w:basedOn w:val="11"/>
+    <w:qFormat/>
     <w:uiPriority w:val="21"/>
-    <w:qFormat/>
-    <w:rsid w:val="000768F7"/>
     <w:rPr>
       <w:i/>
       <w:iCs/>
-      <w:color w:val="365F91" w:themeColor="accent1" w:themeShade="BF"/>
+      <w:color w:val="376092" w:themeColor="accent1" w:themeShade="BF"/>
     </w:rPr>
   </w:style>
-  <w:style w:type="paragraph" w:styleId="IntenseQuote">
+  <w:style w:type="paragraph" w:styleId="33">
     <w:name w:val="Intense Quote"/>
-    <w:basedOn w:val="Normal"/>
-    <w:next w:val="Normal"/>
-    <w:link w:val="IntenseQuoteChar"/>
+    <w:basedOn w:val="1"/>
+    <w:next w:val="1"/>
+    <w:link w:val="34"/>
+    <w:qFormat/>
     <w:uiPriority w:val="30"/>
-    <w:qFormat/>
-    <w:rsid w:val="000768F7"/>
     <w:pPr>
       <w:pBdr>
-        <w:top w:val="single" w:sz="4" w:space="10" w:color="365F91" w:themeColor="accent1" w:themeShade="BF"/>
-        <w:bottom w:val="single" w:sz="4" w:space="10" w:color="365F91" w:themeColor="accent1" w:themeShade="BF"/>
+        <w:top w:val="single" w:color="366091" w:themeColor="accent1" w:themeShade="BF" w:sz="4" w:space="10"/>
+        <w:bottom w:val="single" w:color="366091" w:themeColor="accent1" w:themeShade="BF" w:sz="4" w:space="10"/>
       </w:pBdr>
       <w:spacing w:before="360" w:after="360"/>
       <w:ind w:left="864" w:right="864"/>
@@ -3442,101 +3245,56 @@
     <w:rPr>
       <w:i/>
       <w:iCs/>
-      <w:color w:val="365F91" w:themeColor="accent1" w:themeShade="BF"/>
+      <w:color w:val="376092" w:themeColor="accent1" w:themeShade="BF"/>
     </w:rPr>
   </w:style>
-  <w:style w:type="character" w:customStyle="1" w:styleId="IntenseQuoteChar">
+  <w:style w:type="character" w:customStyle="1" w:styleId="34">
     <w:name w:val="Intense Quote Char"/>
-    <w:basedOn w:val="DefaultParagraphFont"/>
-    <w:link w:val="IntenseQuote"/>
+    <w:basedOn w:val="11"/>
+    <w:link w:val="33"/>
+    <w:qFormat/>
     <w:uiPriority w:val="30"/>
-    <w:rsid w:val="000768F7"/>
     <w:rPr>
       <w:i/>
       <w:iCs/>
-      <w:color w:val="365F91" w:themeColor="accent1" w:themeShade="BF"/>
+      <w:color w:val="376092" w:themeColor="accent1" w:themeShade="BF"/>
     </w:rPr>
   </w:style>
-  <w:style w:type="character" w:styleId="IntenseReference">
+  <w:style w:type="character" w:customStyle="1" w:styleId="35">
     <w:name w:val="Intense Reference"/>
-    <w:basedOn w:val="DefaultParagraphFont"/>
+    <w:basedOn w:val="11"/>
+    <w:qFormat/>
     <w:uiPriority w:val="32"/>
-    <w:qFormat/>
-    <w:rsid w:val="000768F7"/>
     <w:rPr>
       <w:b/>
       <w:bCs/>
       <w:smallCaps/>
-      <w:color w:val="365F91" w:themeColor="accent1" w:themeShade="BF"/>
+      <w:color w:val="376092" w:themeColor="accent1" w:themeShade="BF"/>
       <w:spacing w:val="5"/>
     </w:rPr>
   </w:style>
-  <w:style w:type="character" w:styleId="Hyperlink">
-    <w:name w:val="Hyperlink"/>
-    <w:basedOn w:val="DefaultParagraphFont"/>
-    <w:uiPriority w:val="99"/>
-    <w:unhideWhenUsed/>
-    <w:rsid w:val="000768F7"/>
-    <w:rPr>
-      <w:color w:val="0000FF" w:themeColor="hyperlink"/>
-      <w:u w:val="single"/>
-    </w:rPr>
-  </w:style>
-  <w:style w:type="character" w:styleId="UnresolvedMention">
+  <w:style w:type="character" w:customStyle="1" w:styleId="36">
     <w:name w:val="Unresolved Mention"/>
-    <w:basedOn w:val="DefaultParagraphFont"/>
-    <w:uiPriority w:val="99"/>
+    <w:basedOn w:val="11"/>
     <w:semiHidden/>
     <w:unhideWhenUsed/>
-    <w:rsid w:val="000768F7"/>
+    <w:uiPriority w:val="99"/>
     <w:rPr>
       <w:color w:val="605E5C"/>
       <w:shd w:val="clear" w:color="auto" w:fill="E1DFDD"/>
     </w:rPr>
   </w:style>
-  <w:style w:type="paragraph" w:styleId="Header">
-    <w:name w:val="header"/>
-    <w:basedOn w:val="Normal"/>
-    <w:link w:val="HeaderChar"/>
+  <w:style w:type="character" w:customStyle="1" w:styleId="37">
+    <w:name w:val="Header Char"/>
+    <w:basedOn w:val="11"/>
+    <w:link w:val="14"/>
     <w:uiPriority w:val="99"/>
-    <w:unhideWhenUsed/>
-    <w:rsid w:val="00B40EE2"/>
-    <w:pPr>
-      <w:tabs>
-        <w:tab w:val="center" w:pos="4680"/>
-        <w:tab w:val="right" w:pos="9360"/>
-      </w:tabs>
-      <w:spacing w:after="0" w:line="240" w:lineRule="auto"/>
-    </w:pPr>
-  </w:style>
-  <w:style w:type="character" w:customStyle="1" w:styleId="HeaderChar">
-    <w:name w:val="Header Char"/>
-    <w:basedOn w:val="DefaultParagraphFont"/>
-    <w:link w:val="Header"/>
+  </w:style>
+  <w:style w:type="character" w:customStyle="1" w:styleId="38">
+    <w:name w:val="Footer Char"/>
+    <w:basedOn w:val="11"/>
+    <w:link w:val="13"/>
     <w:uiPriority w:val="99"/>
-    <w:rsid w:val="00B40EE2"/>
-  </w:style>
-  <w:style w:type="paragraph" w:styleId="Footer">
-    <w:name w:val="footer"/>
-    <w:basedOn w:val="Normal"/>
-    <w:link w:val="FooterChar"/>
-    <w:uiPriority w:val="99"/>
-    <w:unhideWhenUsed/>
-    <w:rsid w:val="00B40EE2"/>
-    <w:pPr>
-      <w:tabs>
-        <w:tab w:val="center" w:pos="4680"/>
-        <w:tab w:val="right" w:pos="9360"/>
-      </w:tabs>
-      <w:spacing w:after="0" w:line="240" w:lineRule="auto"/>
-    </w:pPr>
-  </w:style>
-  <w:style w:type="character" w:customStyle="1" w:styleId="FooterChar">
-    <w:name w:val="Footer Char"/>
-    <w:basedOn w:val="DefaultParagraphFont"/>
-    <w:link w:val="Footer"/>
-    <w:uiPriority w:val="99"/>
-    <w:rsid w:val="00B40EE2"/>
   </w:style>
 </w:styles>
 </file>
@@ -3820,6 +3578,5 @@
     </a:fmtScheme>
   </a:themeElements>
   <a:objectDefaults/>
-  <a:extraClrSchemeLst/>
 </a:theme>
 </file>
</xml_diff>